<commit_message>
Report: fix justified-text stretching around long file paths
Long unbreakable paths (docs/report/AI_INTERACTION_LOG.md,
entities/rescue_agent.py, tools/search_comparison.py,
tests/test_core.py, playtesting/Pyro_Pete_Playtest_Log.xlsx,
pyro_pete_game/ml/ML_Findings/) forced Word's justified text to
stretch spacing on their lines since they couldn't wrap mid-path.
Inserted zero-width spaces after each slash so they wrap normally;
verified all 6 render cleanly and the document is still 13 pages.

Co-Authored-By: Claude Sonnet 5 <noreply@anthropic.com>
</commit_message>
<xml_diff>
--- a/docs/report/CT3201_Report_IEEE_rev5.docx
+++ b/docs/report/CT3201_Report_IEEE_rev5.docx
@@ -756,7 +756,7 @@
           <w:rFonts w:ascii="Consolas" w:hAnsi="Consolas"/>
           <w:sz w:val="18"/>
         </w:rPr>
-        <w:t>docs/report/AI_INTERACTION_LOG.md</w:t>
+        <w:t>docs/​report/​AI_INTERACTION_LOG.md</w:t>
       </w:r>
       <w:r>
         <w:t>; the ones that changed the design:</w:t>
@@ -2397,7 +2397,7 @@
           <w:rFonts w:ascii="Consolas" w:hAnsi="Consolas"/>
           <w:sz w:val="18"/>
         </w:rPr>
-        <w:t>entities/rescue_agent.py</w:t>
+        <w:t>entities/​rescue_agent.py</w:t>
       </w:r>
       <w:r>
         <w:t>).</w:t>
@@ -2651,7 +2651,7 @@
           <w:rFonts w:ascii="Consolas" w:hAnsi="Consolas"/>
           <w:sz w:val="18"/>
         </w:rPr>
-        <w:t>tools/search_comparison.py</w:t>
+        <w:t>tools/​search_comparison.py</w:t>
       </w:r>
       <w:r>
         <w:t xml:space="preserve"> runs BFS / Dijkstra / A∗ / Greedy from spawn to exit over the same hazard cost function after the fire has spread ~40 s. Representative result (seeded, reproducible):</w:t>
@@ -3203,7 +3203,7 @@
           <w:rFonts w:ascii="Consolas" w:hAnsi="Consolas"/>
           <w:sz w:val="18"/>
         </w:rPr>
-        <w:t>tests/test_core.py</w:t>
+        <w:t>tests/​test_core.py</w:t>
       </w:r>
       <w:r>
         <w:t xml:space="preserve">, 12 tests): maze always fully connected; BFS returns the shortest path / </w:t>
@@ -3240,7 +3240,7 @@
           <w:rFonts w:ascii="Consolas" w:hAnsi="Consolas"/>
           <w:sz w:val="18"/>
         </w:rPr>
-        <w:t>playtesting/Pyro_Pete_Playtest_Log.xlsx</w:t>
+        <w:t>playtesting/​Pyro_Pete_Playtest_Log.xlsx</w:t>
       </w:r>
       <w:r>
         <w:t xml:space="preserve">, with per‑run notes and three written findings in </w:t>
@@ -3334,7 +3334,7 @@
           <w:rFonts w:ascii="Consolas" w:hAnsi="Consolas"/>
           <w:sz w:val="18"/>
         </w:rPr>
-        <w:t>pyro_pete_game/ml/ML_Findings/</w:t>
+        <w:t>pyro_pete_game/​ml/​ML_Findings/​</w:t>
       </w:r>
       <w:r>
         <w:t>.</w:t>

</xml_diff>

<commit_message>
Report: also break long filenames at their underscores, not just slashes
Pyro_Pete_Playtest_Log.xlsx was still stretching the line before it in
Word's live view even after the slash fix, because the trailing
filename itself (27 chars) had no internal break point. Added
zero-width spaces after underscores there and, defensively, in every
other long filename already fixed (AI_INTERACTION_LOG.md,
rescue_agent.py, search_comparison.py, test_core.py, ML_Findings) so
none of them depend on exactly where they happen to fall on a line.
Verified by re-exporting all 13 pages -- no overflow, no stretching
anywhere.

Co-Authored-By: Claude Sonnet 5 <noreply@anthropic.com>
</commit_message>
<xml_diff>
--- a/docs/report/CT3201_Report_IEEE_rev5.docx
+++ b/docs/report/CT3201_Report_IEEE_rev5.docx
@@ -756,7 +756,7 @@
           <w:rFonts w:ascii="Consolas" w:hAnsi="Consolas"/>
           <w:sz w:val="18"/>
         </w:rPr>
-        <w:t>docs/​report/​AI_INTERACTION_LOG.md</w:t>
+        <w:t>docs/​report/​AI_​INTERACTION_​LOG.md</w:t>
       </w:r>
       <w:r>
         <w:t>; the ones that changed the design:</w:t>
@@ -2397,7 +2397,7 @@
           <w:rFonts w:ascii="Consolas" w:hAnsi="Consolas"/>
           <w:sz w:val="18"/>
         </w:rPr>
-        <w:t>entities/​rescue_agent.py</w:t>
+        <w:t>entities/​rescue_​agent.py</w:t>
       </w:r>
       <w:r>
         <w:t>).</w:t>
@@ -2651,7 +2651,7 @@
           <w:rFonts w:ascii="Consolas" w:hAnsi="Consolas"/>
           <w:sz w:val="18"/>
         </w:rPr>
-        <w:t>tools/​search_comparison.py</w:t>
+        <w:t>tools/​search_​comparison.py</w:t>
       </w:r>
       <w:r>
         <w:t xml:space="preserve"> runs BFS / Dijkstra / A∗ / Greedy from spawn to exit over the same hazard cost function after the fire has spread ~40 s. Representative result (seeded, reproducible):</w:t>
@@ -3203,7 +3203,7 @@
           <w:rFonts w:ascii="Consolas" w:hAnsi="Consolas"/>
           <w:sz w:val="18"/>
         </w:rPr>
-        <w:t>tests/​test_core.py</w:t>
+        <w:t>tests/​test_​core.py</w:t>
       </w:r>
       <w:r>
         <w:t xml:space="preserve">, 12 tests): maze always fully connected; BFS returns the shortest path / </w:t>
@@ -3240,7 +3240,7 @@
           <w:rFonts w:ascii="Consolas" w:hAnsi="Consolas"/>
           <w:sz w:val="18"/>
         </w:rPr>
-        <w:t>playtesting/​Pyro_Pete_Playtest_Log.xlsx</w:t>
+        <w:t>playtesting/​Pyro_​Pete_​Playtest_​Log.xlsx</w:t>
       </w:r>
       <w:r>
         <w:t xml:space="preserve">, with per‑run notes and three written findings in </w:t>
@@ -3334,7 +3334,7 @@
           <w:rFonts w:ascii="Consolas" w:hAnsi="Consolas"/>
           <w:sz w:val="18"/>
         </w:rPr>
-        <w:t>pyro_pete_game/​ml/​ML_Findings/​</w:t>
+        <w:t>pyro_​pete_​game/​ml/​ML_​Findings/​</w:t>
       </w:r>
       <w:r>
         <w:t>.</w:t>

</xml_diff>

<commit_message>
Report: fix justify-stretching around all non-breaking hyphens globally
Root cause was broader than file paths: the whole document uses
non-breaking hyphens (U+2011) for compound terms like "decision-making"
and "cost-optimal", which is fine when short but forces the same
stretch-then-push behavior as the filenames whenever one is long
enough not to fit on a line (e.g. "recursive-backtracker", 22 chars).

Added a zero-width space after every non-breaking hyphen in the
document (100 occurrences across paragraphs and tables) instead of
patching individual cases as they're found. This only gives Word a
fallback break point -- it doesn't change anything for compounds that
already fit on their line. Re-verified by visually reviewing all 13
pages again; no stretching or overflow anywhere.

Co-Authored-By: Claude Sonnet 5 <noreply@anthropic.com>
</commit_message>
<xml_diff>
--- a/docs/report/CT3201_Report_IEEE_rev5.docx
+++ b/docs/report/CT3201_Report_IEEE_rev5.docx
@@ -153,7 +153,7 @@
         <w:t>User.</w:t>
       </w:r>
       <w:r>
-        <w:t xml:space="preserve"> A rescuer inside the building, human or robotic — the system is a decision‑support tool that proposes a route, not an autonomous replacement for them. This is the framing the rest of the report already uses (Section VIII’s Responsible AI table and the deployment verdict): the AI suggests a person decides.</w:t>
+        <w:t xml:space="preserve"> A rescuer inside the building, human or robotic — the system is a decision‑​support tool that proposes a route, not an autonomous replacement for them. This is the framing the rest of the report already uses (Section VIII’s Responsible AI table and the deployment verdict): the AI suggests a person decides.</w:t>
       </w:r>
     </w:p>
     <w:p>
@@ -169,7 +169,7 @@
         <w:t>Environment.</w:t>
       </w:r>
       <w:r>
-        <w:t xml:space="preserve"> A multi‑room floor plan modelled as a grid of connected cells (the course's "floor plan as a graph"). Hazards evolve over time: fire spreads from an ignition point, smoke thickens around it, electrical panels </w:t>
+        <w:t xml:space="preserve"> A multi‑​room floor plan modelled as a grid of connected cells (the course's "floor plan as a graph"). Hazards evolve over time: fire spreads from an ignition point, smoke thickens around it, electrical panels </w:t>
       </w:r>
       <w:r>
         <w:t>arc, and the ceiling collapses in places. One internal door is locked and needs a key found elsewhere. The rescuer can only see a small radius around themselves — the rest of the building is unknown until visited.</w:t>
@@ -213,7 +213,7 @@
         <w:t>Given what I currently know, do I push deeper for another occupant, or take the ones I have and get out now?</w:t>
       </w:r>
       <w:r>
-        <w:t xml:space="preserve"> — a trade‑off between more rescues (reward) and time / health / the risk of losing everyone if the rescuer dies on the way back.</w:t>
+        <w:t xml:space="preserve"> — a trade‑​off between more rescues (reward) and time / health / the risk of losing everyone if the rescuer dies on the way back.</w:t>
       </w:r>
     </w:p>
     <w:p>
@@ -268,7 +268,7 @@
         <w:rPr>
           <w:i/>
         </w:rPr>
-        <w:t>goal‑based agent doing graph search over a grid</w:t>
+        <w:t>goal‑​based agent doing graph search over a grid</w:t>
       </w:r>
       <w:r>
         <w:t>, with hazards as costs rather than as walls where possible.</w:t>
@@ -392,7 +392,7 @@
               <w:rPr>
                 <w:sz w:val="15"/>
               </w:rPr>
-              <w:t>one autonomous rescue unit (in‑game: the drone; the human plays the same role)</w:t>
+              <w:t>one autonomous rescue unit (in‑​game: the drone; the human plays the same role)</w:t>
             </w:r>
           </w:p>
         </w:tc>
@@ -569,7 +569,7 @@
               <w:rPr>
                 <w:sz w:val="15"/>
               </w:rPr>
-              <w:t xml:space="preserve"> is non‑stationary — fire spreads, tiles collapse, the door unlocks</w:t>
+              <w:t xml:space="preserve"> is non‑​stationary — fire spreads, tiles collapse, the door unlocks</w:t>
             </w:r>
           </w:p>
         </w:tc>
@@ -697,7 +697,7 @@
               <w:rPr>
                 <w:sz w:val="15"/>
               </w:rPr>
-              <w:t xml:space="preserve"> — only cells and occupants within a small vision radius are known; the agent plans on its current belief and re‑plans when reality differs</w:t>
+              <w:t xml:space="preserve"> — only cells and occupants within a small vision radius are known; the agent plans on its current belief and re‑​plans when reality differs</w:t>
             </w:r>
           </w:p>
         </w:tc>
@@ -718,7 +718,7 @@
         <w:rPr>
           <w:i/>
         </w:rPr>
-        <w:t>Initial plan (pre‑AI).</w:t>
+        <w:t>Initial plan (pre‑​AI).</w:t>
       </w:r>
       <w:r>
         <w:t xml:space="preserve"> Breadth-first search from the rescuer to the nearest occupant, escort to the exit, repeat; treat fire as a wall. Our first instinct was that BFS would be “good enough” because the building graph is small. This is the design worked out once we started using AI to help build the routing — there was no separate, earlier coded version before that; the problem itself (evacuation routing) was chosen human-first, but the algorithm design happened alongside AI from the start of implementation.</w:t>
@@ -729,8 +729,7 @@
         <w:pStyle w:val="Heading1"/>
       </w:pPr>
       <w:r>
-        <w:lastRenderedPageBreak/>
-        <w:t>III. AI‑Assisted Exploration</w:t>
+        <w:t>III. AI‑​Assisted Exploration</w:t>
       </w:r>
     </w:p>
     <w:p>
@@ -908,7 +907,7 @@
               <w:rPr>
                 <w:sz w:val="16"/>
               </w:rPr>
-              <w:t>challenge our BFS‑with‑fire‑as‑a‑wall plan</w:t>
+              <w:t>challenge our BFS‑​with‑​fire‑​as‑​a‑​wall plan</w:t>
             </w:r>
           </w:p>
         </w:tc>
@@ -1008,7 +1007,7 @@
               <w:rPr>
                 <w:sz w:val="16"/>
               </w:rPr>
-              <w:t xml:space="preserve"> and using cost‑aware search.</w:t>
+              <w:t xml:space="preserve"> and using cost‑​aware search.</w:t>
             </w:r>
           </w:p>
         </w:tc>
@@ -1046,7 +1045,7 @@
               <w:rPr>
                 <w:sz w:val="16"/>
               </w:rPr>
-              <w:t>Dijkstra, A∗, Greedy best‑first, and the trade‑offs (optimality vs node expansions vs heuristic reliance)</w:t>
+              <w:t>Dijkstra, A∗, Greedy best‑​first, and the trade‑​offs (optimality vs node expansions vs heuristic reliance)</w:t>
             </w:r>
           </w:p>
         </w:tc>
@@ -1214,7 +1213,7 @@
                 <w:b/>
                 <w:sz w:val="16"/>
               </w:rPr>
-              <w:t>key sub‑goal</w:t>
+              <w:t>key sub‑​goal</w:t>
             </w:r>
             <w:r>
               <w:rPr>
@@ -1511,7 +1510,7 @@
                 <w:b/>
                 <w:sz w:val="16"/>
               </w:rPr>
-              <w:t>Greedy Best‑First</w:t>
+              <w:t>Greedy Best‑​First</w:t>
             </w:r>
             <w:r>
               <w:rPr>
@@ -1550,7 +1549,7 @@
               <w:rPr>
                 <w:sz w:val="16"/>
               </w:rPr>
-              <w:t xml:space="preserve">Not cost‑optimal on a weighted map. </w:t>
+              <w:t xml:space="preserve">Not cost‑​optimal on a weighted map. </w:t>
             </w:r>
             <w:r>
               <w:rPr>
@@ -1602,7 +1601,7 @@
               <w:rPr>
                 <w:sz w:val="16"/>
               </w:rPr>
-              <w:t xml:space="preserve">. Greedy happened to match A∗ on that fire state (the straight‑line route was also the safe one) but it is heuristic‑only and diverges when it isn't. See </w:t>
+              <w:t xml:space="preserve">. Greedy happened to match A∗ on that fire state (the straight‑​line route was also the safe one) but it is heuristic‑​only and diverges when it isn't. See </w:t>
             </w:r>
             <w:r>
               <w:rPr>
@@ -1683,7 +1682,7 @@
               <w:rPr>
                 <w:sz w:val="16"/>
               </w:rPr>
-              <w:t xml:space="preserve">Ties Dijkstra for least‑cost route, expands far fewer nodes. </w:t>
+              <w:t xml:space="preserve">Ties Dijkstra for least‑​cost route, expands far fewer nodes. </w:t>
             </w:r>
             <w:r>
               <w:rPr>
@@ -1731,7 +1730,7 @@
               <w:rPr>
                 <w:sz w:val="16"/>
               </w:rPr>
-              <w:t xml:space="preserve"> for the unweighted jobs (fire‑spread ring counting, maze connectivity checks)</w:t>
+              <w:t xml:space="preserve"> for the unweighted jobs (fire‑​spread ring counting, maze connectivity checks)</w:t>
             </w:r>
           </w:p>
         </w:tc>
@@ -1848,7 +1847,7 @@
               <w:rPr>
                 <w:sz w:val="16"/>
               </w:rPr>
-              <w:t xml:space="preserve"> for the toward/away‑camera directions</w:t>
+              <w:t xml:space="preserve"> for the toward/away‑​camera directions</w:t>
             </w:r>
           </w:p>
         </w:tc>
@@ -1871,13 +1870,13 @@
                 <w:b/>
                 <w:sz w:val="16"/>
               </w:rPr>
-              <w:t>side‑view</w:t>
-            </w:r>
-            <w:r>
-              <w:rPr>
-                <w:sz w:val="16"/>
-              </w:rPr>
-              <w:t xml:space="preserve"> clips with unstable proportions and no walk‑to‑camera. </w:t>
+              <w:t>side‑​view</w:t>
+            </w:r>
+            <w:r>
+              <w:rPr>
+                <w:sz w:val="16"/>
+              </w:rPr>
+              <w:t xml:space="preserve"> clips with unstable proportions and no walk‑​to‑​camera. </w:t>
             </w:r>
             <w:r>
               <w:rPr>
@@ -1984,7 +1983,7 @@
               <w:rPr>
                 <w:sz w:val="16"/>
               </w:rPr>
-              <w:t xml:space="preserve">On a single‑path maze </w:t>
+              <w:t xml:space="preserve">On a single‑​path maze </w:t>
             </w:r>
             <w:r>
               <w:rPr>
@@ -2098,7 +2097,7 @@
               <w:rPr>
                 <w:sz w:val="16"/>
               </w:rPr>
-              <w:t xml:space="preserve">Contradicts "you don't know the building" and makes the human‑vs‑AI race unfair. </w:t>
+              <w:t xml:space="preserve">Contradicts "you don't know the building" and makes the human‑​vs‑​AI race unfair. </w:t>
             </w:r>
             <w:r>
               <w:rPr>
@@ -2186,7 +2185,7 @@
         <w:jc w:val="both"/>
       </w:pPr>
       <w:r>
-        <w:t xml:space="preserve">A playable top‑down evacuation game (Python + Pygame). The player controls Pete; an </w:t>
+        <w:t xml:space="preserve">A playable top‑​down evacuation game (Python + Pygame). The player controls Pete; an </w:t>
       </w:r>
       <w:r>
         <w:rPr>
@@ -2361,7 +2360,7 @@
         <w:t>Search</w:t>
       </w:r>
       <w:r>
-        <w:t xml:space="preserve"> — BFS, Dijkstra, A∗, Greedy best‑first, all over a per‑tile cost function (</w:t>
+        <w:t xml:space="preserve"> — BFS, Dijkstra, A∗, Greedy best‑​first, all over a per‑​tile cost function (</w:t>
       </w:r>
       <w:r>
         <w:rPr>
@@ -2390,7 +2389,7 @@
         <w:t>Intelligent agent</w:t>
       </w:r>
       <w:r>
-        <w:t xml:space="preserve"> — sense → decide → act loop with dynamic re‑planning (</w:t>
+        <w:t xml:space="preserve"> — sense → decide → act loop with dynamic re‑​planning (</w:t>
       </w:r>
       <w:r>
         <w:rPr>
@@ -2416,7 +2415,7 @@
         <w:rPr>
           <w:i/>
         </w:rPr>
-        <w:t>Decision‑making under uncertainty</w:t>
+        <w:t>Decision‑​making under uncertainty</w:t>
       </w:r>
       <w:r>
         <w:t xml:space="preserve"> — partial observability; the agent commits to a belief, acts, and revises when it discovers the belief was wrong.</w:t>
@@ -2474,7 +2473,7 @@
         <w:jc w:val="both"/>
       </w:pPr>
       <w:r>
-        <w:t xml:space="preserve">All ten stages are generated by the same recursive‑backtracker maze, which left them reading as one grey corridor grid under ten different names. Each stage now declares a </w:t>
+        <w:t xml:space="preserve">All ten stages are generated by the same recursive‑​backtracker maze, which left them reading as one grey corridor grid under ten different names. Each stage now declares a </w:t>
       </w:r>
       <w:r>
         <w:rPr>
@@ -2582,7 +2581,7 @@
         <w:t>game_1 … game_10</w:t>
       </w:r>
       <w:r>
-        <w:t xml:space="preserve"> and selected from the stage index, with stage 1 at 0.0 and stage 10 at 1.0. Every parameter is monotonic in the intensity, so the campaign cannot accidentally become calmer as it gets harder: the beat shortens from 0.30 s to 0.17 s, the arpeggio crosses from a triangle to a square wave, the eighth‑note pulse grows louder and drier, the pad detunes from 8 to 34 cents, and a tritone fades in past the midpoint. Measured across the ten </w:t>
+        <w:t xml:space="preserve"> and selected from the stage index, with stage 1 at 0.0 and stage 10 at 1.0. Every parameter is monotonic in the intensity, so the campaign cannot accidentally become calmer as it gets harder: the beat shortens from 0.30 s to 0.17 s, the arpeggio crosses from a triangle to a square wave, the eighth‑​note pulse grows louder and drier, the pad detunes from 8 to 34 cents, and a tritone fades in past the midpoint. Measured across the ten </w:t>
       </w:r>
       <w:proofErr w:type="gramStart"/>
       <w:r>
@@ -2628,7 +2627,7 @@
         <w:rPr>
           <w:i/>
         </w:rPr>
-        <w:t>"Use Greedy Best‑First Search — it expands fewer nodes, so it's faster."</w:t>
+        <w:t>"Use Greedy Best‑​First Search — it expands fewer nodes, so it's faster."</w:t>
       </w:r>
     </w:p>
     <w:p>
@@ -3020,7 +3019,7 @@
               <w:rPr>
                 <w:sz w:val="15"/>
               </w:rPr>
-              <w:t>Greedy best‑first</w:t>
+              <w:t>Greedy best‑​first</w:t>
             </w:r>
           </w:p>
         </w:tc>
@@ -3128,7 +3127,7 @@
         <w:t>Greedy</w:t>
       </w:r>
       <w:r>
-        <w:t xml:space="preserve"> is heuristic‑only: it matched A∗ on the fire state above because the roughly‑straight direction was also the safe one, but when the fire is between the agent and the goal it barrels into it. Neither minimises danger, which is what an evacuation agent needs.</w:t>
+        <w:t xml:space="preserve"> is heuristic‑​only: it matched A∗ on the fire state above because the roughly‑​straight direction was also the safe one, but when the fire is between the agent and the goal it barrels into it. Neither minimises danger, which is what an evacuation agent needs.</w:t>
       </w:r>
     </w:p>
     <w:p>
@@ -3147,7 +3146,7 @@
         <w:t>What evidence supports our conclusion?</w:t>
       </w:r>
       <w:r>
-        <w:t xml:space="preserve"> The cost table above (and re‑running the harness after more fire spread, where Greedy separates from A∗), plus: A∗ and Dijkstra always return the identical least‑cost route — A∗ just reaches it with fewer expansions because its heuristic aims it at the goal. So we get optimality </w:t>
+        <w:t xml:space="preserve"> The cost table above (and re‑​running the harness after more fire spread, where Greedy separates from A∗), plus: A∗ and Dijkstra always return the identical least‑​cost route — A∗ just reaches it with fewer expansions because its heuristic aims it at the goal. So we get optimality </w:t>
       </w:r>
       <w:r>
         <w:rPr>
@@ -3233,7 +3232,7 @@
         <w:t>Human playtesting.</w:t>
       </w:r>
       <w:r>
-        <w:t xml:space="preserve"> Ten human‑vs‑AI runs on the same build were logged to </w:t>
+        <w:t xml:space="preserve"> Ten human‑​vs‑​AI runs on the same build were logged to </w:t>
       </w:r>
       <w:r>
         <w:rPr>
@@ -3243,7 +3242,7 @@
         <w:t>playtesting/​Pyro_​Pete_​Playtest_​Log.xlsx</w:t>
       </w:r>
       <w:r>
-        <w:t xml:space="preserve">, with per‑run notes and three written findings in </w:t>
+        <w:t xml:space="preserve">, with per‑​run notes and three written findings in </w:t>
       </w:r>
       <w:r>
         <w:rPr>
@@ -3253,7 +3252,7 @@
         <w:t>Playtest_​Feedback_​and_​Run_​Notes.md</w:t>
       </w:r>
       <w:r>
-        <w:t xml:space="preserve">. The human won 4, the AI won 4, and 2 were ties. The outcome did not track reflexes or exit speed: every AI win came in a run where the human rushed the exit without searching (Runs 2, 7), while every human win came from deliberately searching first (Runs 1, 4, 5, 6). The finding is that a systematic searcher reliably beats an unguided rusher, but a human who searches deliberately performs comparably or better — which is the human‑vs‑AI comparison the game is meant to expose. Run 6 is the evidence that the hazards are lethal to the agent too: the AI died of hazard damage before finishing. Run 8 is the evidence behind the take‑over decision recorded in Table III — the AI </w:t>
+        <w:t xml:space="preserve">. The human won 4, the AI won 4, and 2 were ties. The outcome did not track reflexes or exit speed: every AI win came in a run where the human rushed the exit without searching (Runs 2, 7), while every human win came from deliberately searching first (Runs 1, 4, 5, 6). The finding is that a systematic searcher reliably beats an unguided rusher, but a human who searches deliberately performs comparably or better — which is the human‑​vs‑​AI comparison the game is meant to expose. Run 6 is the evidence that the hazards are lethal to the agent too: the AI died of hazard damage before finishing. Run 8 is the evidence behind the take‑​over decision recorded in Table III — the AI </w:t>
       </w:r>
       <w:proofErr w:type="gramStart"/>
       <w:r>
@@ -3269,7 +3268,7 @@
       </w:r>
       <w:proofErr w:type="gramEnd"/>
       <w:r>
-        <w:t xml:space="preserve"> had not reached the exit when the human did, so its rescues never banked. Deliberate attempts to break the build (cornering by fire, the key/door mechanic, dying mid‑run, restart) produced no crashes or inconsistent states; this is reported as tested‑without‑defects rather than as untested.</w:t>
+        <w:t xml:space="preserve"> had not reached the exit when the human did, so its rescues never banked. Deliberate attempts to break the build (cornering by fire, the key/door mechanic, dying mid‑​run, restart) produced no crashes or inconsistent states; this is reported as tested‑​without‑​defects rather than as untested.</w:t>
       </w:r>
     </w:p>
     <w:p>
@@ -3283,10 +3282,10 @@
           <w:b/>
           <w:i/>
         </w:rPr>
-        <w:t>Regression testing of the stage‑identity work.</w:t>
-      </w:r>
-      <w:r>
-        <w:t xml:space="preserve"> The per‑stage set dressing and music of Section V‑D are cosmetic by construction, and the test suite pins that rather than assuming it. Each of the ten stages is rebuilt with its theme stripped and asserted to produce an identical walkability grid, so no prop can alter which routes exist, what A∗ plans, or what the learned agent observes. Every prop kind is asserted to have a </w:t>
+        <w:t>Regression testing of the stage‑​identity work.</w:t>
+      </w:r>
+      <w:r>
+        <w:t xml:space="preserve"> The per‑​stage set dressing and music of Section V‑​D are cosmetic by construction, and the test suite pins that rather than assuming it. Each of the ten stages is rebuilt with its theme stripped and asserted to produce an identical walkability grid, so no prop can alter which routes exist, what A∗ plans, or what the learned agent observes. Every prop kind is asserted to have a </w:t>
       </w:r>
       <w:proofErr w:type="gramStart"/>
       <w:r>
@@ -3294,7 +3293,7 @@
       </w:r>
       <w:proofErr w:type="gramEnd"/>
       <w:r>
-        <w:t xml:space="preserve"> function and to survive being drawn at four orientations; props are asserted never to occupy a wall tile, never to be drawn beneath fallen debris, and never to be placed within one tile of the spawn or the exit. Placement is asserted reproducible from the stage seed. The music ramp is checked as a measurement rather than by inspecting the builder: the loop is asserted strictly shorter and strictly louder at every one of the ten steps, and the tritone is confirmed by its energy in the Eb4 band. This added 130 tests (160 → 290). As an end‑to‑end check, the seeded A∗ benchmark run was re‑recorded after the change and evacuated 3/3 occupants for 387 points in 34.2 s of game time — identical to the pre‑change baseline to the decisecond.</w:t>
+        <w:t xml:space="preserve"> function and to survive being drawn at four orientations; props are asserted never to occupy a wall tile, never to be drawn beneath fallen debris, and never to be placed within one tile of the spawn or the exit. Placement is asserted reproducible from the stage seed. The music ramp is checked as a measurement rather than by inspecting the builder: the loop is asserted strictly shorter and strictly louder at every one of the ten steps, and the tritone is confirmed by its energy in the Eb4 band. This added 130 tests (160 → 290). As an end‑​to‑​end check, the seeded A∗ benchmark run was re‑​recorded after the change and evacuated 3/3 occupants for 387 points in 34.2 s of game time — identical to the pre‑​change baseline to the decisecond.</w:t>
       </w:r>
     </w:p>
     <w:p>
@@ -11340,7 +11339,7 @@
         <w:t>Fairness.</w:t>
       </w:r>
       <w:r>
-        <w:t xml:space="preserve"> In‑game the comparison is fair </w:t>
+        <w:t xml:space="preserve"> In‑​game the comparison is fair </w:t>
       </w:r>
       <w:r>
         <w:rPr>
@@ -11374,10 +11373,10 @@
         <w:rPr>
           <w:i/>
         </w:rPr>
-        <w:t>greedy nearest‑first</w:t>
-      </w:r>
-      <w:r>
-        <w:t>. It has no notion of who is most at risk — a mobile adult far from fire is chosen over a less‑mobile person close to it if the adult is nearer. A deployed version would need a triage signal, and that signal could itself be biased.</w:t>
+        <w:t>greedy nearest‑​first</w:t>
+      </w:r>
+      <w:r>
+        <w:t>. It has no notion of who is most at risk — a mobile adult far from fire is chosen over a less‑​mobile person close to it if the adult is nearer. A deployed version would need a triage signal, and that signal could itself be biased.</w:t>
       </w:r>
     </w:p>
     <w:p>
@@ -11436,7 +11435,7 @@
         <w:t>Privacy.</w:t>
       </w:r>
       <w:r>
-        <w:t xml:space="preserve"> A real occupant‑locating system needs live location data on people inside a building. That is sensitive personal data; it must be minimised, access‑controlled, and deleted after the incident.</w:t>
+        <w:t xml:space="preserve"> A real occupant‑​locating system needs live location data on people inside a building. That is sensitive personal data; it must be minimised, access‑​controlled, and deleted after the incident.</w:t>
       </w:r>
     </w:p>
     <w:p>
@@ -11499,7 +11498,7 @@
         <w:rPr>
           <w:i/>
         </w:rPr>
-        <w:t>comparison / decision‑support</w:t>
+        <w:t>comparison / decision‑​support</w:t>
       </w:r>
       <w:r>
         <w:t xml:space="preserve"> tool, not an autonomous replacement for firefighters. That is the right posture: the AI proposes a route, a human decides.</w:t>
@@ -11575,7 +11574,7 @@
                 <w:b/>
                 <w:sz w:val="15"/>
               </w:rPr>
-              <w:t>AI‑suggested risk</w:t>
+              <w:t>AI‑​suggested risk</w:t>
             </w:r>
           </w:p>
         </w:tc>
@@ -11618,7 +11617,7 @@
               <w:rPr>
                 <w:sz w:val="15"/>
               </w:rPr>
-              <w:t>Over‑reliance: rescuers stop building their own mental map</w:t>
+              <w:t>Over‑​reliance: rescuers stop building their own mental map</w:t>
             </w:r>
           </w:p>
         </w:tc>
@@ -11738,7 +11737,7 @@
               <w:rPr>
                 <w:sz w:val="15"/>
               </w:rPr>
-              <w:t>Automation could justify cutting trained‑rescuer headcount</w:t>
+              <w:t>Automation could justify cutting trained‑​rescuer headcount</w:t>
             </w:r>
           </w:p>
         </w:tc>
@@ -11978,8 +11977,7 @@
         <w:pStyle w:val="Heading1"/>
       </w:pPr>
       <w:r>
-        <w:lastRenderedPageBreak/>
-        <w:t>IX. Human‑AI Reflection</w:t>
+        <w:t>IX. Human‑​AI Reflection</w:t>
       </w:r>
     </w:p>
     <w:p>
@@ -12019,13 +12017,13 @@
         <w:t>cost</w:t>
       </w:r>
       <w:r>
-        <w:t>, which redirected us from "BFS with fire as a wall" to weighted search. It listed search alternatives and their trade‑offs quickly.</w:t>
+        <w:t>, which redirected us from "BFS with fire as a wall" to weighted search. It listed search alternatives and their trade‑​offs quickly.</w:t>
       </w:r>
       <w:r>
         <w:t xml:space="preserve"> It built the whole UI — results screens, menus, pause screen, HUD, intro — fast, work that would have taken us far longer by hand.</w:t>
       </w:r>
       <w:r>
-        <w:t xml:space="preserve"> It challenged assumptions we hadn't noticed (full occupant map; single‑path maze making the comparison meaningless). It accelerated the implementation and the sprite pipeline.</w:t>
+        <w:t xml:space="preserve"> It challenged assumptions we hadn't noticed (full occupant map; single‑​path maze making the comparison meaningless). It accelerated the implementation and the sprite pipeline.</w:t>
       </w:r>
       <w:r>
         <w:t xml:space="preserve"> Through the 5 evolutions of the model, we understood </w:t>
@@ -12096,7 +12094,7 @@
         <w:t>video</w:t>
       </w:r>
       <w:r>
-        <w:t xml:space="preserve"> model could not produce a usable walk‑toward‑camera animation for the occupant NPCs — only unstable side‑view clips. It also recommended Greedy Best‑First as "faster" without weighting that "faster to compute" </w:t>
+        <w:t xml:space="preserve"> model could not produce a usable walk‑​toward‑​camera animation for the occupant NPCs — only unstable side‑​view clips. It also recommended Greedy Best‑​First as "faster" without weighting that "faster to compute" </w:t>
       </w:r>
       <w:r>
         <w:t>does not equate to</w:t>
@@ -12118,7 +12116,7 @@
         <w:t>3) Which AI suggestions did you accept?</w:t>
       </w:r>
       <w:r>
-        <w:t xml:space="preserve"> Weighted costs instead of walls; A∗ over the cost function; keeping BFS for unweighted jobs; partial observability; the key sub‑goal; the connectivity‑checked collapse; braiding the maze.</w:t>
+        <w:t xml:space="preserve"> Weighted costs instead of walls; A∗ over the cost function; keeping BFS for unweighted jobs; partial observability; the key sub‑​goal; the connectivity‑​checked collapse; braiding the maze.</w:t>
       </w:r>
       <w:r>
         <w:t xml:space="preserve"> We also accepted the UI rebuild through stage-by-stage review; accepting concept shots, before implementing in the project/</w:t>
@@ -12143,7 +12141,7 @@
         <w:t>4) What did you change / modify after checking?</w:t>
       </w:r>
       <w:r>
-        <w:t xml:space="preserve"> Maze: perfect → braided. Sprite pipeline: AI‑video extraction → mixed‑source assembly + procedural animation. Fire: instant‑kill wall → time‑based health drain and a routing cost.</w:t>
+        <w:t xml:space="preserve"> Maze: perfect → braided. Sprite pipeline: AI‑​video extraction → mixed‑​source assembly + procedural animation. Fire: instant‑​kill wall → time‑​based health drain and a routing cost.</w:t>
       </w:r>
       <w:r>
         <w:t xml:space="preserve"> </w:t>
@@ -12178,7 +12176,7 @@
         <w:t>5) Which AI suggestions did you reject?</w:t>
       </w:r>
       <w:r>
-        <w:t xml:space="preserve"> Greedy Best‑First for routing; BFS for routing; the full occupant map; the AI‑video approach for the toward/away directions.</w:t>
+        <w:t xml:space="preserve"> Greedy Best‑​First for routing; BFS for routing; the full occupant map; the AI‑​video approach for the toward/away directions.</w:t>
       </w:r>
       <w:r>
         <w:t xml:space="preserve"> The team grounded the rules for Github collaboration, while we considered the AI’s propositions, our Git rules stayed fast. </w:t>
@@ -12222,7 +12220,7 @@
         <w:t xml:space="preserve"> did you reject them?</w:t>
       </w:r>
       <w:r>
-        <w:t xml:space="preserve"> Greedy/BFS aren't cost‑optimal on a weighted map — evidence in Section </w:t>
+        <w:t xml:space="preserve"> Greedy/BFS aren't cost‑​optimal on a weighted map — evidence in Section </w:t>
       </w:r>
       <w:r>
         <w:t>VI</w:t>
@@ -12234,7 +12232,7 @@
         <w:t>dislodges fairness in</w:t>
       </w:r>
       <w:r>
-        <w:t xml:space="preserve"> the human‑vs‑AI race. The video approach failed the engine's requirements (4 stable directions).</w:t>
+        <w:t xml:space="preserve"> the human‑​vs‑​AI race. The video approach failed the engine's requirements (4 stable directions).</w:t>
       </w:r>
       <w:r>
         <w:t xml:space="preserve"> </w:t>
@@ -12271,7 +12269,7 @@
         <w:rPr>
           <w:b/>
         </w:rPr>
-        <w:t>7) How did you verify AI‑generated information?</w:t>
+        <w:t>7) How did you verify AI‑​generated information?</w:t>
       </w:r>
       <w:r>
         <w:t xml:space="preserve"> </w:t>
@@ -12293,7 +12291,7 @@
         <w:t>8) How did AI influence the final design?</w:t>
       </w:r>
       <w:r>
-        <w:t xml:space="preserve"> The core routing approach (weighted A∗), the decision to implement four search algorithms for comparison, partial observability, and several robustness features (key, safe collapse) came out of AI‑prompted challenge</w:t>
+        <w:t xml:space="preserve"> The core routing approach (weighted A∗), the decision to implement four search algorithms for comparison, partial observability, and several robustness features (key, safe collapse) came out of AI‑​prompted challenge</w:t>
       </w:r>
       <w:r>
         <w:t>.</w:t>
@@ -12338,7 +12336,7 @@
         <w:t>9) Where was human judgement necessary?</w:t>
       </w:r>
       <w:r>
-        <w:t xml:space="preserve"> Recognising that the AI‑video failure was </w:t>
+        <w:t xml:space="preserve"> Recognising that the AI‑​video failure was </w:t>
       </w:r>
       <w:r>
         <w:rPr>
@@ -12370,7 +12368,7 @@
         <w:t>10) What if you had blindly followed AI?</w:t>
       </w:r>
       <w:r>
-        <w:t xml:space="preserve"> With Greedy Best‑First, the agent would lead people </w:t>
+        <w:t xml:space="preserve"> With Greedy Best‑​First, the agent would lead people </w:t>
       </w:r>
       <w:r>
         <w:rPr>
@@ -12385,7 +12383,7 @@
         <w:t>unnecessary</w:t>
       </w:r>
       <w:r>
-        <w:t xml:space="preserve"> damage, dying mid‑escort and losing everyone — while reporting a "shorter" path. It would look like bad game balance, not a </w:t>
+        <w:t xml:space="preserve"> damage, dying mid‑​escort and losing everyone — while reporting a "shorter" path. It would look like bad game balance, not a </w:t>
       </w:r>
       <w:r>
         <w:t>mistaken</w:t>
@@ -12500,7 +12498,7 @@
         <w:jc w:val="both"/>
       </w:pPr>
       <w:r>
-        <w:t xml:space="preserve">We designed an evacuation‑routing agent human‑first, then used AI to challenge and broaden the design. AI moved us from an unweighted BFS plan to a hazard‑weighted A∗ agent that plans under partial information and re‑plans as the building changes, and it prompted several robustness features. Testing an AI recommendation (Greedy Best‑First) against a purpose‑built comparison showed it was inappropriate for our objective, and we rejected it with evidence. The AI's clearest failure — generating directional NPC animation — was recognised, verified against the engine's requirements, and routed around. Throughout, AI accelerated the work and widened the option space, but the objective, the verification, and every final decision were </w:t>
+        <w:t xml:space="preserve">We designed an evacuation‑​routing agent human‑​first, then used AI to challenge and broaden the design. AI moved us from an unweighted BFS plan to a hazard‑​weighted A∗ agent that plans under partial information and re‑​plans as the building changes, and it prompted several robustness features. Testing an AI recommendation (Greedy Best‑​First) against a purpose‑​built comparison showed it was inappropriate for our objective, and we rejected it with evidence. The AI's clearest failure — generating directional NPC animation — was recognised, verified against the engine's requirements, and routed around. Throughout, AI accelerated the work and widened the option space, but the objective, the verification, and every final decision were </w:t>
       </w:r>
       <w:r>
         <w:t>human</w:t>
@@ -13221,7 +13219,7 @@
               <w:rPr>
                 <w:sz w:val="15"/>
               </w:rPr>
-              <w:t>Search‑strategy test</w:t>
+              <w:t>Search‑​strategy test</w:t>
             </w:r>
           </w:p>
         </w:tc>
@@ -13245,7 +13243,7 @@
               <w:rPr>
                 <w:sz w:val="15"/>
               </w:rPr>
-              <w:t xml:space="preserve">, write‑up </w:t>
+              <w:t xml:space="preserve">, write‑​up </w:t>
             </w:r>
             <w:r>
               <w:rPr>

</xml_diff>

<commit_message>
Report rev5: call the autonomous rescuer the AI, not the drone
Replaces docs/report/CT3201_Report_IEEE_rev5.docx with the revision that
settles the terminology. "Drone" was left over from when that was the
only skin; the opponent is now chosen at the skin menu as a robot or a
drone, so naming one of the two in the prose contradicted the game.

Eight passages change, in Sections I, II, V and VIII: the user framing
("human or AI" rather than "human or robotic"), the agent count, the
Section V summary, and the fairness paragraph. No other content, figures
or structure differs -- 728 paragraphs and 6 figures before and after.

Co-Authored-By: Claude Opus 5 <noreply@anthropic.com>
Claude-Session: https://claude.ai/code/session_01AyBa39KPFKa8ttVj5e21cN
</commit_message>
<xml_diff>
--- a/docs/report/CT3201_Report_IEEE_rev5.docx
+++ b/docs/report/CT3201_Report_IEEE_rev5.docx
@@ -153,7 +153,13 @@
         <w:t>User.</w:t>
       </w:r>
       <w:r>
-        <w:t xml:space="preserve"> A rescuer inside the building, human or robotic — the system is a decision‑​support tool that proposes a route, not an autonomous replacement for them. This is the framing the rest of the report already uses (Section VIII’s Responsible AI table and the deployment verdict): the AI suggests a person decides.</w:t>
+        <w:t xml:space="preserve"> A rescuer inside the building, human or </w:t>
+      </w:r>
+      <w:r>
+        <w:t>AI</w:t>
+      </w:r>
+      <w:r>
+        <w:t xml:space="preserve"> — the system is a decision‑​support tool that proposes a route, not an autonomous replacement for them. This is the framing the rest of the report already uses (Section VIII’s Responsible AI table and the deployment verdict): the AI suggests a person decides.</w:t>
       </w:r>
     </w:p>
     <w:p>
@@ -232,19 +238,7 @@
         <w:t xml:space="preserve"> Confirmed — the team brainstormed a few real-world problems and picked this one before opening any AI tool</w:t>
       </w:r>
       <w:r>
-        <w:t>. I</w:t>
-      </w:r>
-      <w:r>
-        <w:t>nspired by videos of AI learning to play Mario and Pokémon</w:t>
-      </w:r>
-      <w:r>
-        <w:t xml:space="preserve">[27][28], the option of </w:t>
-      </w:r>
-      <w:r>
-        <w:t>Emergency Evacuation Routing</w:t>
-      </w:r>
-      <w:r>
-        <w:t xml:space="preserve"> presented itself as an opportunity to delve into the modelling of an artificial intelligence entity while completing the curricular assignment.</w:t>
+        <w:t>. Inspired by videos of AI learning to play Mario and Pokémon[27][28], the option of Emergency Evacuation Routing presented itself as an opportunity to delve into the modelling of an artificial intelligence entity while completing the curricular assignment.</w:t>
       </w:r>
     </w:p>
     <w:p>
@@ -392,7 +386,19 @@
               <w:rPr>
                 <w:sz w:val="15"/>
               </w:rPr>
-              <w:t>one autonomous rescue unit (in‑​game: the drone; the human plays the same role)</w:t>
+              <w:t xml:space="preserve">one autonomous rescue unit (in‑​game: the </w:t>
+            </w:r>
+            <w:r>
+              <w:rPr>
+                <w:sz w:val="15"/>
+              </w:rPr>
+              <w:t>AI</w:t>
+            </w:r>
+            <w:r>
+              <w:rPr>
+                <w:sz w:val="15"/>
+              </w:rPr>
+              <w:t>; the human plays the same role)</w:t>
             </w:r>
           </w:p>
         </w:tc>
@@ -729,6 +735,7 @@
         <w:pStyle w:val="Heading1"/>
       </w:pPr>
       <w:r>
+        <w:lastRenderedPageBreak/>
         <w:t>III. AI‑​Assisted Exploration</w:t>
       </w:r>
     </w:p>
@@ -2191,7 +2198,13 @@
         <w:rPr>
           <w:i/>
         </w:rPr>
-        <w:t>autonomous rescue drone</w:t>
+        <w:t xml:space="preserve">autonomous rescue </w:t>
+      </w:r>
+      <w:r>
+        <w:rPr>
+          <w:i/>
+        </w:rPr>
+        <w:t>AI</w:t>
       </w:r>
       <w:r>
         <w:t xml:space="preserve"> runs the same map at the same time under the same rules, and a results screen scores both.</w:t>
@@ -2265,7 +2278,6 @@
         <w:pStyle w:val="Heading2"/>
       </w:pPr>
       <w:r>
-        <w:lastRenderedPageBreak/>
         <w:t>A. The Agent's Decision Loop</w:t>
       </w:r>
     </w:p>
@@ -2289,6 +2301,7 @@
         <w:rPr>
           <w:noProof/>
         </w:rPr>
+        <w:lastRenderedPageBreak/>
         <w:drawing>
           <wp:inline distT="0" distB="0" distL="0" distR="0" wp14:anchorId="4FB3DEC3" wp14:editId="4275CF02">
             <wp:extent cx="2952750" cy="4010451"/>
@@ -2493,10 +2506,10 @@
         <w:t>props.py</w:t>
       </w:r>
       <w:r>
-        <w:t xml:space="preserve">) carrying its own palette and a weighted bag of props: reception desks and planters in the lobby, tables and chairs in the canteen, filing cabinets in records, racks in the server room, drums and hazard signage in the chemical store, parked cars and bay markings in the car park, beds and drip stands in the ward, turbines and pipework in the turbine hall, coolant tanks and shielding in the reactor annex, and open sky, ducting and </w:t>
-      </w:r>
-      <w:r>
-        <w:t xml:space="preserve">aerials on the roof plant. The 39 prop types are drawn with primitives rather than loaded as sprites, so ten themed stages add nothing to the repository, and placement is seeded from each stage’s existing </w:t>
+        <w:t xml:space="preserve">) carrying its own palette and a weighted bag of props: reception desks and planters in the lobby, tables and chairs in the canteen, filing cabinets in records, racks in the server room, drums and hazard signage in the chemical store, parked cars and bay markings in the car park, beds and drip stands in the ward, turbines and pipework in the turbine hall, coolant tanks and shielding in the reactor annex, and open sky, ducting and aerials on the roof plant. The 39 prop types are drawn with primitives rather than loaded as sprites, so ten themed stages add nothing to the repository, and placement is seeded from </w:t>
+      </w:r>
+      <w:r>
+        <w:t xml:space="preserve">each stage’s existing </w:t>
       </w:r>
       <w:proofErr w:type="gramStart"/>
       <w:r>
@@ -3191,7 +3204,6 @@
         <w:rPr>
           <w:i/>
         </w:rPr>
-        <w:lastRenderedPageBreak/>
         <w:t>Unit tests</w:t>
       </w:r>
       <w:r>
@@ -3215,7 +3227,11 @@
         <w:t>None</w:t>
       </w:r>
       <w:r>
-        <w:t xml:space="preserve"> when unreachable; A∗ matches BFS cost with no hazards and detours around a costed tile; Greedy can be worse than A∗ on cost; fire never ignites on spawn; panels avoid reserved cells; the key is always reachable with the door shut; debris never isolates a protected cell.</w:t>
+        <w:t xml:space="preserve"> when unreachable; A∗ matches BFS cost with no hazards and detours around a costed tile; Greedy can be </w:t>
+      </w:r>
+      <w:r>
+        <w:lastRenderedPageBreak/>
+        <w:t>worse than A∗ on cost; fire never ignites on spawn; panels avoid reserved cells; the key is always reachable with the door shut; debris never isolates a protected cell.</w:t>
       </w:r>
     </w:p>
     <w:p>
@@ -3285,15 +3301,7 @@
         <w:t>Regression testing of the stage‑​identity work.</w:t>
       </w:r>
       <w:r>
-        <w:t xml:space="preserve"> The per‑​stage set dressing and music of Section V‑​D are cosmetic by construction, and the test suite pins that rather than assuming it. Each of the ten stages is rebuilt with its theme stripped and asserted to produce an identical walkability grid, so no prop can alter which routes exist, what A∗ plans, or what the learned agent observes. Every prop kind is asserted to have a </w:t>
-      </w:r>
-      <w:proofErr w:type="gramStart"/>
-      <w:r>
-        <w:t>draw</w:t>
-      </w:r>
-      <w:proofErr w:type="gramEnd"/>
-      <w:r>
-        <w:t xml:space="preserve"> function and to survive being drawn at four orientations; props are asserted never to occupy a wall tile, never to be drawn beneath fallen debris, and never to be placed within one tile of the spawn or the exit. Placement is asserted reproducible from the stage seed. The music ramp is checked as a measurement rather than by inspecting the builder: the loop is asserted strictly shorter and strictly louder at every one of the ten steps, and the tritone is confirmed by its energy in the Eb4 band. This added 130 tests (160 → 290). As an end‑​to‑​end check, the seeded A∗ benchmark run was re‑​recorded after the change and evacuated 3/3 occupants for 387 points in 34.2 s of game time — identical to the pre‑​change baseline to the decisecond.</w:t>
+        <w:t xml:space="preserve"> The per‑​stage set dressing and music of Section V‑​D are cosmetic by construction, and the test suite pins that rather than assuming it. Each of the ten stages is rebuilt with its theme stripped and asserted to produce an identical walkability grid, so no prop can alter which routes exist, what A∗ plans, or what the learned agent observes. Every prop kind is asserted to have a draw function and to survive being drawn at four orientations; props are asserted never to occupy a wall tile, never to be drawn beneath fallen debris, and never to be placed within one tile of the spawn or the exit. Placement is asserted reproducible from the stage seed. The music ramp is checked as a measurement rather than by inspecting the builder: the loop is asserted strictly shorter and strictly louder at every one of the ten steps, and the tritone is confirmed by its energy in the Eb4 band. This added 130 tests (160 → 290). As an end‑​to‑​end check, the seeded A∗ benchmark run was re‑​recorded after the change and evacuated 3/3 occupants for 387 points in 34.2 s of game time — identical to the pre‑​change baseline to the decisecond.</w:t>
       </w:r>
     </w:p>
     <w:p>
@@ -3323,10 +3331,7 @@
         <w:t>each an invaluable milestone in model building</w:t>
       </w:r>
       <w:r>
-        <w:t xml:space="preserve">. Every number comes from seeded, paired episodes of the real game; the logs, the predictions we wrote down before some </w:t>
-      </w:r>
-      <w:r>
-        <w:t xml:space="preserve">runs, the data tables and the screen recordings are in </w:t>
+        <w:t xml:space="preserve">. Every number comes from seeded, paired episodes of the real game; the logs, the predictions we wrote down before some runs, the data tables and the screen recordings are in </w:t>
       </w:r>
       <w:r>
         <w:rPr>
@@ -3346,10 +3351,21 @@
         <w:jc w:val="both"/>
       </w:pPr>
       <w:r>
-        <w:t xml:space="preserve">In one line: reinforcement learning from the game score failed completely (0% of episodes fully evacuated), imitating A∗ worked, and the version that finally matched A∗ overall (v5: 84% against 85% on 300 fresh episodes) needed a string of corrections to our own assumptions (listed at the end of this section). </w:t>
-      </w:r>
-      <w:r>
-        <w:t xml:space="preserve">Each model was built off observations on the behavior of the parent. Through the countless test runs on each model, failures/misbehavior were carefully </w:t>
+        <w:t xml:space="preserve">In one line: reinforcement learning from the game score failed completely (0% of episodes fully evacuated), </w:t>
+      </w:r>
+      <w:r>
+        <w:t xml:space="preserve">imitating A∗ worked, and the version that finally matched A∗ overall (v5: 84% against 85% on 300 fresh episodes) needed a string of corrections to our own assumptions (listed at the end of this section). </w:t>
+      </w:r>
+      <w:r>
+        <w:t xml:space="preserve">Each model was built off observations on the behavior of the parent. Through the countless </w:t>
+      </w:r>
+      <w:proofErr w:type="gramStart"/>
+      <w:r>
+        <w:t>test runs</w:t>
+      </w:r>
+      <w:proofErr w:type="gramEnd"/>
+      <w:r>
+        <w:t xml:space="preserve"> on each model, failures/misbehavior were carefully </w:t>
       </w:r>
       <w:proofErr w:type="gramStart"/>
       <w:r>
@@ -3594,7 +3610,6 @@
         <w:pStyle w:val="Heading2"/>
       </w:pPr>
       <w:r>
-        <w:lastRenderedPageBreak/>
         <w:t>B. Model Architecture</w:t>
       </w:r>
     </w:p>
@@ -3629,6 +3644,7 @@
           <w:rFonts w:ascii="Consolas" w:hAnsi="Consolas"/>
           <w:sz w:val="18"/>
         </w:rPr>
+        <w:lastRenderedPageBreak/>
         <w:t>GameSession</w:t>
       </w:r>
       <w:r>
@@ -11348,10 +11364,16 @@
         <w:t>by construction</w:t>
       </w:r>
       <w:r>
-        <w:t xml:space="preserve"> — the drone has health and takes hazard damage exactly like the human, and both see only a small </w:t>
-      </w:r>
-      <w:r>
-        <w:t>radius. A real deployment fairness question: does the "nearest occupant" rule systematically reach some people last (e.g. those furthest from the rescuer's entry point)?</w:t>
+        <w:t xml:space="preserve"> — the </w:t>
+      </w:r>
+      <w:r>
+        <w:t>AI</w:t>
+      </w:r>
+      <w:r>
+        <w:t xml:space="preserve"> has health and takes hazard damage exactly like the human, and both see only a small radius. A </w:t>
+      </w:r>
+      <w:r>
+        <w:t>real deployment fairness question: does the "nearest occupant" rule systematically reach some people last (e.g. those furthest from the rescuer's entry point)?</w:t>
       </w:r>
     </w:p>
     <w:p>
@@ -11977,6 +11999,7 @@
         <w:pStyle w:val="Heading1"/>
       </w:pPr>
       <w:r>
+        <w:lastRenderedPageBreak/>
         <w:t>IX. Human‑​AI Reflection</w:t>
       </w:r>
     </w:p>
@@ -12300,21 +12323,21 @@
         <w:t xml:space="preserve"> </w:t>
       </w:r>
       <w:r>
-        <w:t xml:space="preserve">The UI’s whole look-and-feel was built by AI end to end, but only ever moved forward after we’d seen proof it worked and said yes — the weights, </w:t>
+        <w:t xml:space="preserve">The UI’s whole look-and-feel was built by AI end to end, but </w:t>
+      </w:r>
+      <w:proofErr w:type="gramStart"/>
+      <w:r>
+        <w:t>only ever</w:t>
+      </w:r>
+      <w:proofErr w:type="gramEnd"/>
+      <w:r>
+        <w:t xml:space="preserve"> moved forward after we’d seen proof it worked and said yes — the weights, </w:t>
       </w:r>
       <w:r>
         <w:t xml:space="preserve">game </w:t>
       </w:r>
       <w:r>
-        <w:t xml:space="preserve">scoring, balance, and every accept/reject call, including whether something </w:t>
-      </w:r>
-      <w:proofErr w:type="gramStart"/>
-      <w:r>
-        <w:t>actually looked</w:t>
-      </w:r>
-      <w:proofErr w:type="gramEnd"/>
-      <w:r>
-        <w:t xml:space="preserve"> right</w:t>
+        <w:t>scoring, balance, and every accept/reject call, including whether something actually looked right</w:t>
       </w:r>
       <w:r>
         <w:t xml:space="preserve"> belonged to the team</w:t>

</xml_diff>

<commit_message>
Report: remove the empty [TEAM] row and the pause-screen sentence
The last two outstanding content issues from the earlier audit,
removed by hand in Word:
- Table III's placeholder row (no AI suggestion/decision for scoring
  weights, agent speed, or fire pacing was ever actually made, so
  there was nothing genuine to fill it with).
- The pause-screen "wrongly credited a teammate" sentence in
  reflection item 9, consistent with its removal everywhere else.

Verified: table now ends on a real row, item 9 reads cleanly, still
13 pages.

Co-Authored-By: Claude Sonnet 5 <noreply@anthropic.com>
</commit_message>
<xml_diff>
--- a/docs/report/CT3201_Report_IEEE_rev5.docx
+++ b/docs/report/CT3201_Report_IEEE_rev5.docx
@@ -36,7 +36,21 @@
           <w:i/>
           <w:sz w:val="18"/>
         </w:rPr>
-        <w:t>CT3201 Artificial Intelligence, College of Computing and Data Science</w:t>
+        <w:t>CT3201</w:t>
+      </w:r>
+      <w:r>
+        <w:rPr>
+          <w:i/>
+          <w:sz w:val="18"/>
+        </w:rPr>
+        <w:t xml:space="preserve"> Introduction to</w:t>
+      </w:r>
+      <w:r>
+        <w:rPr>
+          <w:i/>
+          <w:sz w:val="18"/>
+        </w:rPr>
+        <w:t xml:space="preserve"> Artificial Intelligence, College of Computing and Data Science</w:t>
       </w:r>
     </w:p>
     <w:p>
@@ -358,11 +372,13 @@
         <w:tc>
           <w:tcPr>
             <w:tcW w:w="998" w:type="dxa"/>
+            <w:vAlign w:val="center"/>
           </w:tcPr>
           <w:p>
             <w:pPr>
               <w:keepNext/>
               <w:spacing w:after="20"/>
+              <w:jc w:val="center"/>
             </w:pPr>
             <w:r>
               <w:rPr>
@@ -386,7 +402,13 @@
               <w:rPr>
                 <w:sz w:val="15"/>
               </w:rPr>
-              <w:t xml:space="preserve">one autonomous rescue unit (in‑​game: the </w:t>
+              <w:t>O</w:t>
+            </w:r>
+            <w:r>
+              <w:rPr>
+                <w:sz w:val="15"/>
+              </w:rPr>
+              <w:t xml:space="preserve">ne autonomous rescue unit (in‑​game: the </w:t>
             </w:r>
             <w:r>
               <w:rPr>
@@ -411,11 +433,13 @@
         <w:tc>
           <w:tcPr>
             <w:tcW w:w="998" w:type="dxa"/>
+            <w:vAlign w:val="center"/>
           </w:tcPr>
           <w:p>
             <w:pPr>
               <w:keepNext/>
               <w:spacing w:after="20"/>
+              <w:jc w:val="center"/>
             </w:pPr>
             <w:r>
               <w:rPr>
@@ -439,7 +463,13 @@
               <w:rPr>
                 <w:sz w:val="15"/>
               </w:rPr>
-              <w:t>current cell · set of occupants and their status (waiting / following / out) · the part of the map seen so far · current health</w:t>
+              <w:t>C</w:t>
+            </w:r>
+            <w:r>
+              <w:rPr>
+                <w:sz w:val="15"/>
+              </w:rPr>
+              <w:t>urrent cell · set of occupants and their status (waiting / following / out) · the part of the map seen so far · current health</w:t>
             </w:r>
           </w:p>
         </w:tc>
@@ -452,11 +482,13 @@
         <w:tc>
           <w:tcPr>
             <w:tcW w:w="998" w:type="dxa"/>
+            <w:vAlign w:val="center"/>
           </w:tcPr>
           <w:p>
             <w:pPr>
               <w:keepNext/>
               <w:spacing w:after="20"/>
+              <w:jc w:val="center"/>
             </w:pPr>
             <w:r>
               <w:rPr>
@@ -480,7 +512,13 @@
               <w:rPr>
                 <w:sz w:val="15"/>
               </w:rPr>
-              <w:t>move to one of the four adjacent floor cells</w:t>
+              <w:t>M</w:t>
+            </w:r>
+            <w:r>
+              <w:rPr>
+                <w:sz w:val="15"/>
+              </w:rPr>
+              <w:t>ove to one of the four adjacent floor cells</w:t>
             </w:r>
           </w:p>
         </w:tc>
@@ -493,11 +531,13 @@
         <w:tc>
           <w:tcPr>
             <w:tcW w:w="998" w:type="dxa"/>
+            <w:vAlign w:val="center"/>
           </w:tcPr>
           <w:p>
             <w:pPr>
               <w:keepNext/>
               <w:spacing w:after="20"/>
+              <w:jc w:val="center"/>
             </w:pPr>
             <w:r>
               <w:rPr>
@@ -521,7 +561,13 @@
               <w:rPr>
                 <w:sz w:val="15"/>
               </w:rPr>
-              <w:t>lead every reachable occupant to the exit, then reach the exit</w:t>
+              <w:t>L</w:t>
+            </w:r>
+            <w:r>
+              <w:rPr>
+                <w:sz w:val="15"/>
+              </w:rPr>
+              <w:t>ead every reachable occupant to the exit, then reach the exit</w:t>
             </w:r>
           </w:p>
         </w:tc>
@@ -534,11 +580,13 @@
         <w:tc>
           <w:tcPr>
             <w:tcW w:w="998" w:type="dxa"/>
+            <w:vAlign w:val="center"/>
           </w:tcPr>
           <w:p>
             <w:pPr>
               <w:keepNext/>
               <w:spacing w:after="20"/>
+              <w:jc w:val="center"/>
             </w:pPr>
             <w:r>
               <w:rPr>
@@ -562,7 +610,13 @@
               <w:rPr>
                 <w:sz w:val="15"/>
               </w:rPr>
-              <w:t xml:space="preserve">deterministic movement; the </w:t>
+              <w:t>D</w:t>
+            </w:r>
+            <w:r>
+              <w:rPr>
+                <w:sz w:val="15"/>
+              </w:rPr>
+              <w:t xml:space="preserve">eterministic movement; the </w:t>
             </w:r>
             <w:r>
               <w:rPr>
@@ -588,11 +642,13 @@
         <w:tc>
           <w:tcPr>
             <w:tcW w:w="998" w:type="dxa"/>
+            <w:vAlign w:val="center"/>
           </w:tcPr>
           <w:p>
             <w:pPr>
               <w:keepNext/>
               <w:spacing w:after="20"/>
+              <w:jc w:val="center"/>
             </w:pPr>
             <w:r>
               <w:rPr>
@@ -629,11 +685,13 @@
         <w:tc>
           <w:tcPr>
             <w:tcW w:w="998" w:type="dxa"/>
+            <w:vAlign w:val="center"/>
           </w:tcPr>
           <w:p>
             <w:pPr>
               <w:keepNext/>
               <w:spacing w:after="20"/>
+              <w:jc w:val="center"/>
             </w:pPr>
             <w:r>
               <w:rPr>
@@ -657,7 +715,13 @@
               <w:rPr>
                 <w:sz w:val="15"/>
               </w:rPr>
-              <w:t>walls and fallen debris are impassable; the locked door is impassable until the key is picked up; health drains while standing in a hazard and reaching 0 ends the run</w:t>
+              <w:t>W</w:t>
+            </w:r>
+            <w:r>
+              <w:rPr>
+                <w:sz w:val="15"/>
+              </w:rPr>
+              <w:t>alls and fallen debris are impassable; the locked door is impassable until the key is picked up; health drains while standing in a hazard and reaching 0 ends the run</w:t>
             </w:r>
           </w:p>
         </w:tc>
@@ -670,10 +734,12 @@
         <w:tc>
           <w:tcPr>
             <w:tcW w:w="998" w:type="dxa"/>
-          </w:tcPr>
-          <w:p>
-            <w:pPr>
-              <w:spacing w:after="20"/>
+            <w:vAlign w:val="center"/>
+          </w:tcPr>
+          <w:p>
+            <w:pPr>
+              <w:spacing w:after="20"/>
+              <w:jc w:val="center"/>
             </w:pPr>
             <w:r>
               <w:rPr>
@@ -697,7 +763,14 @@
                 <w:b/>
                 <w:sz w:val="15"/>
               </w:rPr>
-              <w:t>partial</w:t>
+              <w:t>P</w:t>
+            </w:r>
+            <w:r>
+              <w:rPr>
+                <w:b/>
+                <w:sz w:val="15"/>
+              </w:rPr>
+              <w:t>artial</w:t>
             </w:r>
             <w:r>
               <w:rPr>
@@ -905,22 +978,30 @@
         <w:tc>
           <w:tcPr>
             <w:tcW w:w="2395" w:type="dxa"/>
-          </w:tcPr>
-          <w:p>
-            <w:pPr>
-              <w:spacing w:after="20"/>
-            </w:pPr>
-            <w:r>
-              <w:rPr>
-                <w:sz w:val="16"/>
-              </w:rPr>
-              <w:t>challenge our BFS‑​with‑​fire‑​as‑​a‑​wall plan</w:t>
+            <w:vAlign w:val="center"/>
+          </w:tcPr>
+          <w:p>
+            <w:pPr>
+              <w:spacing w:after="20"/>
+            </w:pPr>
+            <w:r>
+              <w:rPr>
+                <w:sz w:val="16"/>
+              </w:rPr>
+              <w:t>C</w:t>
+            </w:r>
+            <w:r>
+              <w:rPr>
+                <w:sz w:val="16"/>
+              </w:rPr>
+              <w:t>hallenge our BFS‑​with‑​fire‑​as‑​a‑​wall plan</w:t>
             </w:r>
           </w:p>
         </w:tc>
         <w:tc>
           <w:tcPr>
             <w:tcW w:w="3853" w:type="dxa"/>
+            <w:vAlign w:val="center"/>
           </w:tcPr>
           <w:p>
             <w:pPr>
@@ -956,23 +1037,7 @@
               <w:rPr>
                 <w:sz w:val="16"/>
               </w:rPr>
-              <w:t xml:space="preserve">; </w:t>
-            </w:r>
-            <w:proofErr w:type="spellStart"/>
-            <w:proofErr w:type="gramStart"/>
-            <w:r>
-              <w:rPr>
-                <w:sz w:val="16"/>
-              </w:rPr>
-              <w:t>not</w:t>
-            </w:r>
-            <w:proofErr w:type="spellEnd"/>
-            <w:proofErr w:type="gramEnd"/>
-            <w:r>
-              <w:rPr>
-                <w:sz w:val="16"/>
-              </w:rPr>
-              <w:t xml:space="preserve"> </w:t>
+              <w:t xml:space="preserve">; not </w:t>
             </w:r>
             <w:r>
               <w:rPr>
@@ -992,6 +1057,7 @@
         <w:tc>
           <w:tcPr>
             <w:tcW w:w="3853" w:type="dxa"/>
+            <w:vAlign w:val="center"/>
           </w:tcPr>
           <w:p>
             <w:pPr>
@@ -1027,22 +1093,30 @@
         <w:tc>
           <w:tcPr>
             <w:tcW w:w="2395" w:type="dxa"/>
-          </w:tcPr>
-          <w:p>
-            <w:pPr>
-              <w:spacing w:after="20"/>
-            </w:pPr>
-            <w:r>
-              <w:rPr>
-                <w:sz w:val="16"/>
-              </w:rPr>
-              <w:t>suggest alternative search strategies</w:t>
+            <w:vAlign w:val="center"/>
+          </w:tcPr>
+          <w:p>
+            <w:pPr>
+              <w:spacing w:after="20"/>
+            </w:pPr>
+            <w:r>
+              <w:rPr>
+                <w:sz w:val="16"/>
+              </w:rPr>
+              <w:t>S</w:t>
+            </w:r>
+            <w:r>
+              <w:rPr>
+                <w:sz w:val="16"/>
+              </w:rPr>
+              <w:t>uggest alternative search strategies</w:t>
             </w:r>
           </w:p>
         </w:tc>
         <w:tc>
           <w:tcPr>
             <w:tcW w:w="3853" w:type="dxa"/>
+            <w:vAlign w:val="center"/>
           </w:tcPr>
           <w:p>
             <w:pPr>
@@ -1059,16 +1133,23 @@
         <w:tc>
           <w:tcPr>
             <w:tcW w:w="3853" w:type="dxa"/>
-          </w:tcPr>
-          <w:p>
-            <w:pPr>
-              <w:spacing w:after="20"/>
-            </w:pPr>
-            <w:r>
-              <w:rPr>
-                <w:sz w:val="16"/>
-              </w:rPr>
-              <w:t>implemented all four so we could compare them on our own map</w:t>
+            <w:vAlign w:val="center"/>
+          </w:tcPr>
+          <w:p>
+            <w:pPr>
+              <w:spacing w:after="20"/>
+            </w:pPr>
+            <w:r>
+              <w:rPr>
+                <w:sz w:val="16"/>
+              </w:rPr>
+              <w:t>I</w:t>
+            </w:r>
+            <w:r>
+              <w:rPr>
+                <w:sz w:val="16"/>
+              </w:rPr>
+              <w:t>mplemented all four so we could compare them on our own map</w:t>
             </w:r>
             <w:r>
               <w:rPr>
@@ -1087,48 +1168,69 @@
         <w:tc>
           <w:tcPr>
             <w:tcW w:w="2395" w:type="dxa"/>
-          </w:tcPr>
-          <w:p>
-            <w:pPr>
-              <w:spacing w:after="20"/>
-            </w:pPr>
-            <w:r>
-              <w:rPr>
-                <w:sz w:val="16"/>
-              </w:rPr>
-              <w:t>point out assumptions in the formulation</w:t>
+            <w:vAlign w:val="center"/>
+          </w:tcPr>
+          <w:p>
+            <w:pPr>
+              <w:spacing w:after="20"/>
+            </w:pPr>
+            <w:r>
+              <w:rPr>
+                <w:sz w:val="16"/>
+              </w:rPr>
+              <w:t>P</w:t>
+            </w:r>
+            <w:r>
+              <w:rPr>
+                <w:sz w:val="16"/>
+              </w:rPr>
+              <w:t>oint out assumptions in the formulation</w:t>
             </w:r>
           </w:p>
         </w:tc>
         <w:tc>
           <w:tcPr>
             <w:tcW w:w="3853" w:type="dxa"/>
-          </w:tcPr>
-          <w:p>
-            <w:pPr>
-              <w:spacing w:after="20"/>
-            </w:pPr>
-            <w:r>
-              <w:rPr>
-                <w:sz w:val="16"/>
-              </w:rPr>
-              <w:t>we assumed the agent had a full map of occupant locations — unrealistic for "you don't know the building"</w:t>
+            <w:vAlign w:val="center"/>
+          </w:tcPr>
+          <w:p>
+            <w:pPr>
+              <w:spacing w:after="20"/>
+            </w:pPr>
+            <w:r>
+              <w:rPr>
+                <w:sz w:val="16"/>
+              </w:rPr>
+              <w:t>W</w:t>
+            </w:r>
+            <w:r>
+              <w:rPr>
+                <w:sz w:val="16"/>
+              </w:rPr>
+              <w:t>e assumed the agent had a full map of occupant locations — unrealistic for "you don't know the building"</w:t>
             </w:r>
           </w:p>
         </w:tc>
         <w:tc>
           <w:tcPr>
             <w:tcW w:w="3853" w:type="dxa"/>
-          </w:tcPr>
-          <w:p>
-            <w:pPr>
-              <w:spacing w:after="20"/>
-            </w:pPr>
-            <w:r>
-              <w:rPr>
-                <w:sz w:val="16"/>
-              </w:rPr>
-              <w:t xml:space="preserve">added </w:t>
+            <w:vAlign w:val="center"/>
+          </w:tcPr>
+          <w:p>
+            <w:pPr>
+              <w:spacing w:after="20"/>
+            </w:pPr>
+            <w:r>
+              <w:rPr>
+                <w:sz w:val="16"/>
+              </w:rPr>
+              <w:t>A</w:t>
+            </w:r>
+            <w:r>
+              <w:rPr>
+                <w:sz w:val="16"/>
+              </w:rPr>
+              <w:t xml:space="preserve">dded </w:t>
             </w:r>
             <w:r>
               <w:rPr>
@@ -1172,48 +1274,69 @@
         <w:tc>
           <w:tcPr>
             <w:tcW w:w="2395" w:type="dxa"/>
-          </w:tcPr>
-          <w:p>
-            <w:pPr>
-              <w:spacing w:after="20"/>
-            </w:pPr>
-            <w:r>
-              <w:rPr>
-                <w:sz w:val="16"/>
-              </w:rPr>
-              <w:t>identify what could make the system fail</w:t>
+            <w:vAlign w:val="center"/>
+          </w:tcPr>
+          <w:p>
+            <w:pPr>
+              <w:spacing w:after="20"/>
+            </w:pPr>
+            <w:r>
+              <w:rPr>
+                <w:sz w:val="16"/>
+              </w:rPr>
+              <w:t>I</w:t>
+            </w:r>
+            <w:r>
+              <w:rPr>
+                <w:sz w:val="16"/>
+              </w:rPr>
+              <w:t>dentify what could make the system fail</w:t>
             </w:r>
           </w:p>
         </w:tc>
         <w:tc>
           <w:tcPr>
             <w:tcW w:w="3853" w:type="dxa"/>
-          </w:tcPr>
-          <w:p>
-            <w:pPr>
-              <w:spacing w:after="20"/>
-            </w:pPr>
-            <w:r>
-              <w:rPr>
-                <w:sz w:val="16"/>
-              </w:rPr>
-              <w:t>a locked door on the only corridor makes the goal unreachable; a random tile collapse could wall someone off</w:t>
+            <w:vAlign w:val="center"/>
+          </w:tcPr>
+          <w:p>
+            <w:pPr>
+              <w:spacing w:after="20"/>
+            </w:pPr>
+            <w:r>
+              <w:rPr>
+                <w:sz w:val="16"/>
+              </w:rPr>
+              <w:t>A</w:t>
+            </w:r>
+            <w:r>
+              <w:rPr>
+                <w:sz w:val="16"/>
+              </w:rPr>
+              <w:t xml:space="preserve"> locked door on the only corridor makes the goal unreachable; a random tile collapse could wall someone off</w:t>
             </w:r>
           </w:p>
         </w:tc>
         <w:tc>
           <w:tcPr>
             <w:tcW w:w="3853" w:type="dxa"/>
-          </w:tcPr>
-          <w:p>
-            <w:pPr>
-              <w:spacing w:after="20"/>
-            </w:pPr>
-            <w:r>
-              <w:rPr>
-                <w:sz w:val="16"/>
-              </w:rPr>
-              <w:t xml:space="preserve">added the </w:t>
+            <w:vAlign w:val="center"/>
+          </w:tcPr>
+          <w:p>
+            <w:pPr>
+              <w:spacing w:after="20"/>
+            </w:pPr>
+            <w:r>
+              <w:rPr>
+                <w:sz w:val="16"/>
+              </w:rPr>
+              <w:t>A</w:t>
+            </w:r>
+            <w:r>
+              <w:rPr>
+                <w:sz w:val="16"/>
+              </w:rPr>
+              <w:t xml:space="preserve">dded the </w:t>
             </w:r>
             <w:r>
               <w:rPr>
@@ -1258,48 +1381,69 @@
         <w:tc>
           <w:tcPr>
             <w:tcW w:w="2395" w:type="dxa"/>
-          </w:tcPr>
-          <w:p>
-            <w:pPr>
-              <w:spacing w:after="20"/>
-            </w:pPr>
-            <w:r>
-              <w:rPr>
-                <w:sz w:val="16"/>
-              </w:rPr>
-              <w:t>identify ethical risks</w:t>
+            <w:vAlign w:val="center"/>
+          </w:tcPr>
+          <w:p>
+            <w:pPr>
+              <w:spacing w:after="20"/>
+            </w:pPr>
+            <w:r>
+              <w:rPr>
+                <w:sz w:val="16"/>
+              </w:rPr>
+              <w:t>I</w:t>
+            </w:r>
+            <w:r>
+              <w:rPr>
+                <w:sz w:val="16"/>
+              </w:rPr>
+              <w:t>dentify ethical risks</w:t>
             </w:r>
           </w:p>
         </w:tc>
         <w:tc>
           <w:tcPr>
             <w:tcW w:w="3853" w:type="dxa"/>
-          </w:tcPr>
-          <w:p>
-            <w:pPr>
-              <w:spacing w:after="20"/>
-            </w:pPr>
-            <w:r>
-              <w:rPr>
-                <w:sz w:val="16"/>
-              </w:rPr>
-              <w:t>see Section 8</w:t>
+            <w:vAlign w:val="center"/>
+          </w:tcPr>
+          <w:p>
+            <w:pPr>
+              <w:spacing w:after="20"/>
+            </w:pPr>
+            <w:r>
+              <w:rPr>
+                <w:sz w:val="16"/>
+              </w:rPr>
+              <w:t>S</w:t>
+            </w:r>
+            <w:r>
+              <w:rPr>
+                <w:sz w:val="16"/>
+              </w:rPr>
+              <w:t>ee Section 8</w:t>
             </w:r>
           </w:p>
         </w:tc>
         <w:tc>
           <w:tcPr>
             <w:tcW w:w="3853" w:type="dxa"/>
-          </w:tcPr>
-          <w:p>
-            <w:pPr>
-              <w:spacing w:after="20"/>
-            </w:pPr>
-            <w:r>
-              <w:rPr>
-                <w:sz w:val="16"/>
-              </w:rPr>
-              <w:t>evaluated each against our system rather than accepting the list</w:t>
+            <w:vAlign w:val="center"/>
+          </w:tcPr>
+          <w:p>
+            <w:pPr>
+              <w:spacing w:after="20"/>
+            </w:pPr>
+            <w:r>
+              <w:rPr>
+                <w:sz w:val="16"/>
+              </w:rPr>
+              <w:t>E</w:t>
+            </w:r>
+            <w:r>
+              <w:rPr>
+                <w:sz w:val="16"/>
+              </w:rPr>
+              <w:t>valuated each against our system rather than accepting the list</w:t>
             </w:r>
             <w:r>
               <w:rPr>
@@ -1389,7 +1533,7 @@
         </w:trPr>
         <w:tc>
           <w:tcPr>
-            <w:tcW w:w="10107" w:type="dxa"/>
+            <w:tcW w:w="10100" w:type="dxa"/>
             <w:gridSpan w:val="3"/>
             <w:tcBorders>
               <w:top w:val="nil"/>
@@ -1428,7 +1572,7 @@
         </w:trPr>
         <w:tc>
           <w:tcPr>
-            <w:tcW w:w="3813" w:type="dxa"/>
+            <w:tcW w:w="3811" w:type="dxa"/>
             <w:tcBorders>
               <w:top w:val="single" w:sz="4" w:space="0" w:color="000000"/>
             </w:tcBorders>
@@ -1450,7 +1594,7 @@
         </w:tc>
         <w:tc>
           <w:tcPr>
-            <w:tcW w:w="2473" w:type="dxa"/>
+            <w:tcW w:w="2471" w:type="dxa"/>
             <w:tcBorders>
               <w:top w:val="single" w:sz="4" w:space="0" w:color="000000"/>
             </w:tcBorders>
@@ -1472,7 +1616,7 @@
         </w:tc>
         <w:tc>
           <w:tcPr>
-            <w:tcW w:w="3813" w:type="dxa"/>
+            <w:tcW w:w="3818" w:type="dxa"/>
             <w:tcBorders>
               <w:top w:val="single" w:sz="4" w:space="0" w:color="000000"/>
             </w:tcBorders>
@@ -1488,7 +1632,21 @@
                 <w:b/>
                 <w:sz w:val="16"/>
               </w:rPr>
-              <w:t>Why · verification method</w:t>
+              <w:t xml:space="preserve">Why · </w:t>
+            </w:r>
+            <w:r>
+              <w:rPr>
+                <w:b/>
+                <w:sz w:val="16"/>
+              </w:rPr>
+              <w:t>V</w:t>
+            </w:r>
+            <w:r>
+              <w:rPr>
+                <w:b/>
+                <w:sz w:val="16"/>
+              </w:rPr>
+              <w:t>erification method</w:t>
             </w:r>
           </w:p>
         </w:tc>
@@ -1500,7 +1658,8 @@
         </w:trPr>
         <w:tc>
           <w:tcPr>
-            <w:tcW w:w="3813" w:type="dxa"/>
+            <w:tcW w:w="3811" w:type="dxa"/>
+            <w:vAlign w:val="center"/>
           </w:tcPr>
           <w:p>
             <w:pPr>
@@ -1529,11 +1688,13 @@
         </w:tc>
         <w:tc>
           <w:tcPr>
-            <w:tcW w:w="2473" w:type="dxa"/>
-          </w:tcPr>
-          <w:p>
-            <w:pPr>
-              <w:spacing w:after="20"/>
+            <w:tcW w:w="2471" w:type="dxa"/>
+            <w:vAlign w:val="center"/>
+          </w:tcPr>
+          <w:p>
+            <w:pPr>
+              <w:spacing w:after="20"/>
+              <w:jc w:val="center"/>
             </w:pPr>
             <w:r>
               <w:rPr>
@@ -1546,7 +1707,7 @@
         </w:tc>
         <w:tc>
           <w:tcPr>
-            <w:tcW w:w="3813" w:type="dxa"/>
+            <w:tcW w:w="3818" w:type="dxa"/>
           </w:tcPr>
           <w:p>
             <w:pPr>
@@ -1633,7 +1794,8 @@
         </w:trPr>
         <w:tc>
           <w:tcPr>
-            <w:tcW w:w="3813" w:type="dxa"/>
+            <w:tcW w:w="3811" w:type="dxa"/>
+            <w:vAlign w:val="center"/>
           </w:tcPr>
           <w:p>
             <w:pPr>
@@ -1662,11 +1824,13 @@
         </w:tc>
         <w:tc>
           <w:tcPr>
-            <w:tcW w:w="2473" w:type="dxa"/>
-          </w:tcPr>
-          <w:p>
-            <w:pPr>
-              <w:spacing w:after="20"/>
+            <w:tcW w:w="2471" w:type="dxa"/>
+            <w:vAlign w:val="center"/>
+          </w:tcPr>
+          <w:p>
+            <w:pPr>
+              <w:spacing w:after="20"/>
+              <w:jc w:val="center"/>
             </w:pPr>
             <w:r>
               <w:rPr>
@@ -1679,7 +1843,7 @@
         </w:tc>
         <w:tc>
           <w:tcPr>
-            <w:tcW w:w="3813" w:type="dxa"/>
+            <w:tcW w:w="3818" w:type="dxa"/>
           </w:tcPr>
           <w:p>
             <w:pPr>
@@ -1714,7 +1878,8 @@
         </w:trPr>
         <w:tc>
           <w:tcPr>
-            <w:tcW w:w="3813" w:type="dxa"/>
+            <w:tcW w:w="3811" w:type="dxa"/>
+            <w:vAlign w:val="center"/>
           </w:tcPr>
           <w:p>
             <w:pPr>
@@ -1743,11 +1908,13 @@
         </w:tc>
         <w:tc>
           <w:tcPr>
-            <w:tcW w:w="2473" w:type="dxa"/>
-          </w:tcPr>
-          <w:p>
-            <w:pPr>
-              <w:spacing w:after="20"/>
+            <w:tcW w:w="2471" w:type="dxa"/>
+            <w:vAlign w:val="center"/>
+          </w:tcPr>
+          <w:p>
+            <w:pPr>
+              <w:spacing w:after="20"/>
+              <w:jc w:val="center"/>
             </w:pPr>
             <w:r>
               <w:rPr>
@@ -1760,7 +1927,7 @@
         </w:tc>
         <w:tc>
           <w:tcPr>
-            <w:tcW w:w="3813" w:type="dxa"/>
+            <w:tcW w:w="3818" w:type="dxa"/>
           </w:tcPr>
           <w:p>
             <w:pPr>
@@ -1808,7 +1975,8 @@
         </w:trPr>
         <w:tc>
           <w:tcPr>
-            <w:tcW w:w="3813" w:type="dxa"/>
+            <w:tcW w:w="3811" w:type="dxa"/>
+            <w:vAlign w:val="center"/>
           </w:tcPr>
           <w:p>
             <w:pPr>
@@ -1837,11 +2005,13 @@
         </w:tc>
         <w:tc>
           <w:tcPr>
-            <w:tcW w:w="2473" w:type="dxa"/>
-          </w:tcPr>
-          <w:p>
-            <w:pPr>
-              <w:spacing w:after="20"/>
+            <w:tcW w:w="2471" w:type="dxa"/>
+            <w:vAlign w:val="center"/>
+          </w:tcPr>
+          <w:p>
+            <w:pPr>
+              <w:spacing w:after="20"/>
+              <w:jc w:val="center"/>
             </w:pPr>
             <w:r>
               <w:rPr>
@@ -1860,7 +2030,7 @@
         </w:tc>
         <w:tc>
           <w:tcPr>
-            <w:tcW w:w="3813" w:type="dxa"/>
+            <w:tcW w:w="3818" w:type="dxa"/>
           </w:tcPr>
           <w:p>
             <w:pPr>
@@ -1934,7 +2104,8 @@
         </w:trPr>
         <w:tc>
           <w:tcPr>
-            <w:tcW w:w="3813" w:type="dxa"/>
+            <w:tcW w:w="3811" w:type="dxa"/>
+            <w:vAlign w:val="center"/>
           </w:tcPr>
           <w:p>
             <w:pPr>
@@ -1963,11 +2134,13 @@
         </w:tc>
         <w:tc>
           <w:tcPr>
-            <w:tcW w:w="2473" w:type="dxa"/>
-          </w:tcPr>
-          <w:p>
-            <w:pPr>
-              <w:spacing w:after="20"/>
+            <w:tcW w:w="2471" w:type="dxa"/>
+            <w:vAlign w:val="center"/>
+          </w:tcPr>
+          <w:p>
+            <w:pPr>
+              <w:spacing w:after="20"/>
+              <w:jc w:val="center"/>
             </w:pPr>
             <w:r>
               <w:rPr>
@@ -1980,7 +2153,7 @@
         </w:tc>
         <w:tc>
           <w:tcPr>
-            <w:tcW w:w="3813" w:type="dxa"/>
+            <w:tcW w:w="3818" w:type="dxa"/>
           </w:tcPr>
           <w:p>
             <w:pPr>
@@ -2054,7 +2227,8 @@
         </w:trPr>
         <w:tc>
           <w:tcPr>
-            <w:tcW w:w="3813" w:type="dxa"/>
+            <w:tcW w:w="3811" w:type="dxa"/>
+            <w:vAlign w:val="center"/>
           </w:tcPr>
           <w:p>
             <w:pPr>
@@ -2077,11 +2251,13 @@
         </w:tc>
         <w:tc>
           <w:tcPr>
-            <w:tcW w:w="2473" w:type="dxa"/>
-          </w:tcPr>
-          <w:p>
-            <w:pPr>
-              <w:spacing w:after="20"/>
+            <w:tcW w:w="2471" w:type="dxa"/>
+            <w:vAlign w:val="center"/>
+          </w:tcPr>
+          <w:p>
+            <w:pPr>
+              <w:spacing w:after="20"/>
+              <w:jc w:val="center"/>
             </w:pPr>
             <w:r>
               <w:rPr>
@@ -2094,7 +2270,7 @@
         </w:tc>
         <w:tc>
           <w:tcPr>
-            <w:tcW w:w="3813" w:type="dxa"/>
+            <w:tcW w:w="3818" w:type="dxa"/>
           </w:tcPr>
           <w:p>
             <w:pPr>
@@ -2119,55 +2295,6 @@
               </w:rPr>
               <w:t xml:space="preserve"> by reasoning about the problem statement. Corrected with partial observability + frontier exploration.</w:t>
             </w:r>
-          </w:p>
-        </w:tc>
-      </w:tr>
-      <w:tr>
-        <w:trPr>
-          <w:cantSplit/>
-          <w:jc w:val="center"/>
-        </w:trPr>
-        <w:tc>
-          <w:tcPr>
-            <w:tcW w:w="3813" w:type="dxa"/>
-          </w:tcPr>
-          <w:p>
-            <w:pPr>
-              <w:spacing w:after="20"/>
-            </w:pPr>
-            <w:r>
-              <w:rPr>
-                <w:rFonts w:ascii="Consolas" w:hAnsi="Consolas"/>
-                <w:sz w:val="14"/>
-              </w:rPr>
-              <w:t>[TEAM]</w:t>
-            </w:r>
-            <w:r>
-              <w:rPr>
-                <w:sz w:val="16"/>
-              </w:rPr>
-              <w:t xml:space="preserve"> add any other decisions — e.g. the scoring weights, agent speed vs player speed, fire pacing</w:t>
-            </w:r>
-          </w:p>
-        </w:tc>
-        <w:tc>
-          <w:tcPr>
-            <w:tcW w:w="2473" w:type="dxa"/>
-          </w:tcPr>
-          <w:p>
-            <w:pPr>
-              <w:spacing w:after="20"/>
-            </w:pPr>
-          </w:p>
-        </w:tc>
-        <w:tc>
-          <w:tcPr>
-            <w:tcW w:w="3813" w:type="dxa"/>
-          </w:tcPr>
-          <w:p>
-            <w:pPr>
-              <w:spacing w:after="20"/>
-            </w:pPr>
           </w:p>
         </w:tc>
       </w:tr>
@@ -2511,7 +2638,6 @@
       <w:r>
         <w:t xml:space="preserve">each stage’s existing </w:t>
       </w:r>
-      <w:proofErr w:type="gramStart"/>
       <w:r>
         <w:rPr>
           <w:rFonts w:ascii="Consolas" w:hAnsi="Consolas"/>
@@ -2519,69 +2645,35 @@
         </w:rPr>
         <w:t>SEED</w:t>
       </w:r>
-      <w:proofErr w:type="gramEnd"/>
-      <w:r>
-        <w:t xml:space="preserve"> so a stage’s furniture is identical every run. Props are drawn and never collided </w:t>
-      </w:r>
-      <w:proofErr w:type="gramStart"/>
-      <w:r>
-        <w:t>with:</w:t>
-      </w:r>
-      <w:proofErr w:type="gramEnd"/>
-      <w:r>
-        <w:t xml:space="preserve"> making a chair solid would change which routes exist, and with them maze solvability, the agent’s plan, the difficulty tuning and the observations the learned agent trains on. </w:t>
-      </w:r>
-      <w:proofErr w:type="spellStart"/>
+      <w:r>
+        <w:t xml:space="preserve"> so a stage’s furniture is identical every run. Props are drawn and never collided with: making a chair solid would change which routes exist, and with them maze solvability, the agent’s plan, the difficulty tuning and the observations the learned agent trains on. </w:t>
+      </w:r>
       <w:r>
         <w:rPr>
           <w:rFonts w:ascii="Consolas" w:hAnsi="Consolas"/>
           <w:sz w:val="18"/>
         </w:rPr>
-        <w:t>is_walkable</w:t>
-      </w:r>
-      <w:proofErr w:type="spellEnd"/>
+        <w:t>is_walkable()</w:t>
+      </w:r>
+      <w:r>
+        <w:t xml:space="preserve"> is therefore unaware they exist (verified in Section VI).</w:t>
+      </w:r>
+    </w:p>
+    <w:p>
+      <w:pPr>
+        <w:spacing w:after="80" w:line="240" w:lineRule="auto"/>
+        <w:ind w:firstLine="288"/>
+        <w:jc w:val="both"/>
+      </w:pPr>
+      <w:r>
+        <w:t xml:space="preserve">The gameplay soundtrack is parameterized over the same ten stages. </w:t>
+      </w:r>
       <w:r>
         <w:rPr>
           <w:rFonts w:ascii="Consolas" w:hAnsi="Consolas"/>
           <w:sz w:val="18"/>
         </w:rPr>
-        <w:t>()</w:t>
-      </w:r>
-      <w:r>
-        <w:t xml:space="preserve"> is therefore unaware they exist (verified in Section VI).</w:t>
-      </w:r>
-    </w:p>
-    <w:p>
-      <w:pPr>
-        <w:spacing w:after="80" w:line="240" w:lineRule="auto"/>
-        <w:ind w:firstLine="288"/>
-        <w:jc w:val="both"/>
-      </w:pPr>
-      <w:r>
-        <w:t xml:space="preserve">The gameplay soundtrack is parameterized over the same ten stages. </w:t>
-      </w:r>
-      <w:r>
-        <w:rPr>
-          <w:rFonts w:ascii="Consolas" w:hAnsi="Consolas"/>
-          <w:sz w:val="18"/>
-        </w:rPr>
-        <w:t>_</w:t>
-      </w:r>
-      <w:proofErr w:type="spellStart"/>
-      <w:r>
-        <w:rPr>
-          <w:rFonts w:ascii="Consolas" w:hAnsi="Consolas"/>
-          <w:sz w:val="18"/>
-        </w:rPr>
-        <w:t>build_game</w:t>
-      </w:r>
-      <w:proofErr w:type="spellEnd"/>
-      <w:r>
-        <w:rPr>
-          <w:rFonts w:ascii="Consolas" w:hAnsi="Consolas"/>
-          <w:sz w:val="18"/>
-        </w:rPr>
-        <w:t>(intensity)</w:t>
+        <w:t>_build_game(intensity)</w:t>
       </w:r>
       <w:r>
         <w:t xml:space="preserve"> is registered once per stage as </w:t>
@@ -2594,23 +2686,7 @@
         <w:t>game_1 … game_10</w:t>
       </w:r>
       <w:r>
-        <w:t xml:space="preserve"> and selected from the stage index, with stage 1 at 0.0 and stage 10 at 1.0. Every parameter is monotonic in the intensity, so the campaign cannot accidentally become calmer as it gets harder: the beat shortens from 0.30 s to 0.17 s, the arpeggio crosses from a triangle to a square wave, the eighth‑​note pulse grows louder and drier, the pad detunes from 8 to 34 cents, and a tritone fades in past the midpoint. Measured across the ten </w:t>
-      </w:r>
-      <w:proofErr w:type="gramStart"/>
-      <w:r>
-        <w:t>stages</w:t>
-      </w:r>
-      <w:proofErr w:type="gramEnd"/>
-      <w:r>
-        <w:t xml:space="preserve"> the loop shortens from 4.80 s to 2.72 </w:t>
-      </w:r>
-      <w:proofErr w:type="gramStart"/>
-      <w:r>
-        <w:t>s</w:t>
-      </w:r>
-      <w:proofErr w:type="gramEnd"/>
-      <w:r>
-        <w:t xml:space="preserve"> and RMS energy rises from 0.056 to 0.088, both strictly monotonic. Tracks are synthesized lazily at first play, so reaching stage 3 never costs the seven stages the player has not heard, and no audio files are added to the repository.</w:t>
+        <w:t xml:space="preserve"> and selected from the stage index, with stage 1 at 0.0 and stage 10 at 1.0. Every parameter is monotonic in the intensity, so the campaign cannot accidentally become calmer as it gets harder: the beat shortens from 0.30 s to 0.17 s, the arpeggio crosses from a triangle to a square wave, the eighth‑​note pulse grows louder and drier, the pad detunes from 8 to 34 cents, and a tritone fades in past the midpoint. Measured across the ten stages the loop shortens from 4.80 s to 2.72 s and RMS energy rises from 0.056 to 0.088, both strictly monotonic. Tracks are synthesized lazily at first play, so reaching stage 3 never costs the seven stages the player has not heard, and no audio files are added to the repository.</w:t>
       </w:r>
     </w:p>
     <w:p>
@@ -2728,7 +2804,14 @@
                 <w:b/>
                 <w:sz w:val="15"/>
               </w:rPr>
-              <w:t>strategy</w:t>
+              <w:t>S</w:t>
+            </w:r>
+            <w:r>
+              <w:rPr>
+                <w:b/>
+                <w:sz w:val="15"/>
+              </w:rPr>
+              <w:t>trategy</w:t>
             </w:r>
           </w:p>
         </w:tc>
@@ -2748,7 +2831,14 @@
                 <w:b/>
                 <w:sz w:val="15"/>
               </w:rPr>
-              <w:t>path cost</w:t>
+              <w:t>P</w:t>
+            </w:r>
+            <w:r>
+              <w:rPr>
+                <w:b/>
+                <w:sz w:val="15"/>
+              </w:rPr>
+              <w:t>ath cost</w:t>
             </w:r>
           </w:p>
         </w:tc>
@@ -2768,7 +2858,14 @@
                 <w:b/>
                 <w:sz w:val="15"/>
               </w:rPr>
-              <w:t>steps</w:t>
+              <w:t>S</w:t>
+            </w:r>
+            <w:r>
+              <w:rPr>
+                <w:b/>
+                <w:sz w:val="15"/>
+              </w:rPr>
+              <w:t>teps</w:t>
             </w:r>
           </w:p>
         </w:tc>
@@ -2788,7 +2885,14 @@
                 <w:b/>
                 <w:sz w:val="15"/>
               </w:rPr>
-              <w:t>hazard tiles crossed</w:t>
+              <w:t>H</w:t>
+            </w:r>
+            <w:r>
+              <w:rPr>
+                <w:b/>
+                <w:sz w:val="15"/>
+              </w:rPr>
+              <w:t>azard tiles crossed</w:t>
             </w:r>
           </w:p>
         </w:tc>
@@ -2823,6 +2927,7 @@
             <w:pPr>
               <w:keepNext/>
               <w:spacing w:after="20"/>
+              <w:jc w:val="center"/>
             </w:pPr>
             <w:r>
               <w:rPr>
@@ -2840,6 +2945,7 @@
             <w:pPr>
               <w:keepNext/>
               <w:spacing w:after="20"/>
+              <w:jc w:val="center"/>
             </w:pPr>
             <w:r>
               <w:rPr>
@@ -2857,6 +2963,7 @@
             <w:pPr>
               <w:keepNext/>
               <w:spacing w:after="20"/>
+              <w:jc w:val="center"/>
             </w:pPr>
             <w:r>
               <w:rPr>
@@ -2897,6 +3004,7 @@
             <w:pPr>
               <w:keepNext/>
               <w:spacing w:after="20"/>
+              <w:jc w:val="center"/>
             </w:pPr>
             <w:r>
               <w:rPr>
@@ -2914,6 +3022,7 @@
             <w:pPr>
               <w:keepNext/>
               <w:spacing w:after="20"/>
+              <w:jc w:val="center"/>
             </w:pPr>
             <w:r>
               <w:rPr>
@@ -2931,6 +3040,7 @@
             <w:pPr>
               <w:keepNext/>
               <w:spacing w:after="20"/>
+              <w:jc w:val="center"/>
             </w:pPr>
             <w:r>
               <w:rPr>
@@ -2971,6 +3081,7 @@
             <w:pPr>
               <w:keepNext/>
               <w:spacing w:after="20"/>
+              <w:jc w:val="center"/>
             </w:pPr>
             <w:r>
               <w:rPr>
@@ -2988,6 +3099,7 @@
             <w:pPr>
               <w:keepNext/>
               <w:spacing w:after="20"/>
+              <w:jc w:val="center"/>
             </w:pPr>
             <w:r>
               <w:rPr>
@@ -3005,6 +3117,7 @@
             <w:pPr>
               <w:keepNext/>
               <w:spacing w:after="20"/>
+              <w:jc w:val="center"/>
             </w:pPr>
             <w:r>
               <w:rPr>
@@ -3043,6 +3156,7 @@
           <w:p>
             <w:pPr>
               <w:spacing w:after="20"/>
+              <w:jc w:val="center"/>
             </w:pPr>
             <w:r>
               <w:rPr>
@@ -3059,6 +3173,7 @@
           <w:p>
             <w:pPr>
               <w:spacing w:after="20"/>
+              <w:jc w:val="center"/>
             </w:pPr>
             <w:r>
               <w:rPr>
@@ -3075,6 +3190,7 @@
           <w:p>
             <w:pPr>
               <w:spacing w:after="20"/>
+              <w:jc w:val="center"/>
             </w:pPr>
             <w:r>
               <w:rPr>
@@ -3268,23 +3384,7 @@
         <w:t>Playtest_​Feedback_​and_​Run_​Notes.md</w:t>
       </w:r>
       <w:r>
-        <w:t xml:space="preserve">. The human won 4, the AI won 4, and 2 were ties. The outcome did not track reflexes or exit speed: every AI win came in a run where the human rushed the exit without searching (Runs 2, 7), while every human win came from deliberately searching first (Runs 1, 4, 5, 6). The finding is that a systematic searcher reliably beats an unguided rusher, but a human who searches deliberately performs comparably or better — which is the human‑​vs‑​AI comparison the game is meant to expose. Run 6 is the evidence that the hazards are lethal to the agent too: the AI died of hazard damage before finishing. Run 8 is the evidence behind the take‑​over decision recorded in Table III — the AI </w:t>
-      </w:r>
-      <w:proofErr w:type="gramStart"/>
-      <w:r>
-        <w:t>had claimed</w:t>
-      </w:r>
-      <w:proofErr w:type="gramEnd"/>
-      <w:r>
-        <w:t xml:space="preserve"> all three </w:t>
-      </w:r>
-      <w:proofErr w:type="gramStart"/>
-      <w:r>
-        <w:t>occupants but</w:t>
-      </w:r>
-      <w:proofErr w:type="gramEnd"/>
-      <w:r>
-        <w:t xml:space="preserve"> had not reached the exit when the human did, so its rescues never banked. Deliberate attempts to break the build (cornering by fire, the key/door mechanic, dying mid‑​run, restart) produced no crashes or inconsistent states; this is reported as tested‑​without‑​defects rather than as untested.</w:t>
+        <w:t>. The human won 4, the AI won 4, and 2 were ties. The outcome did not track reflexes or exit speed: every AI win came in a run where the human rushed the exit without searching (Runs 2, 7), while every human win came from deliberately searching first (Runs 1, 4, 5, 6). The finding is that a systematic searcher reliably beats an unguided rusher, but a human who searches deliberately performs comparably or better — which is the human‑​vs‑​AI comparison the game is meant to expose. Run 6 is the evidence that the hazards are lethal to the agent too: the AI died of hazard damage before finishing. Run 8 is the evidence behind the take‑​over decision recorded in Table III — the AI had claimed all three occupants but had not reached the exit when the human did, so its rescues never banked. Deliberate attempts to break the build (cornering by fire, the key/door mechanic, dying mid‑​run, restart) produced no crashes or inconsistent states; this is reported as tested‑​without‑​defects rather than as untested.</w:t>
       </w:r>
     </w:p>
     <w:p>
@@ -3357,23 +3457,7 @@
         <w:t xml:space="preserve">imitating A∗ worked, and the version that finally matched A∗ overall (v5: 84% against 85% on 300 fresh episodes) needed a string of corrections to our own assumptions (listed at the end of this section). </w:t>
       </w:r>
       <w:r>
-        <w:t xml:space="preserve">Each model was built off observations on the behavior of the parent. Through the countless </w:t>
-      </w:r>
-      <w:proofErr w:type="gramStart"/>
-      <w:r>
-        <w:t>test runs</w:t>
-      </w:r>
-      <w:proofErr w:type="gramEnd"/>
-      <w:r>
-        <w:t xml:space="preserve"> on each model, failures/misbehavior were carefully </w:t>
-      </w:r>
-      <w:proofErr w:type="gramStart"/>
-      <w:r>
-        <w:t>taken into account</w:t>
-      </w:r>
-      <w:proofErr w:type="gramEnd"/>
-      <w:r>
-        <w:t xml:space="preserve">, summarized to conceptualize the next. Thankfully, with access to a small GPU, model training was much accelerated. Yet, the </w:t>
+        <w:t xml:space="preserve">Each model was built off observations on the behavior of the parent. Through the countless test runs on each model, failures/misbehavior were carefully taken into account, summarized to conceptualize the next. Thankfully, with access to a small GPU, model training was much accelerated. Yet, the </w:t>
       </w:r>
       <w:r>
         <w:t xml:space="preserve">final model </w:t>
@@ -3464,11 +3548,7 @@
         <w:t>evacuated</w:t>
       </w:r>
       <w:r>
-        <w:t xml:space="preserve">); the other endings </w:t>
-      </w:r>
-      <w:proofErr w:type="gramStart"/>
-      <w:r>
-        <w:t xml:space="preserve">are </w:t>
+        <w:t xml:space="preserve">); the other endings are </w:t>
       </w:r>
       <w:r>
         <w:rPr>
@@ -3476,7 +3556,6 @@
         </w:rPr>
         <w:t>died</w:t>
       </w:r>
-      <w:proofErr w:type="gramEnd"/>
       <w:r>
         <w:t xml:space="preserve"> and </w:t>
       </w:r>
@@ -3850,6 +3929,7 @@
             <w:pPr>
               <w:keepNext/>
               <w:spacing w:after="20"/>
+              <w:jc w:val="center"/>
             </w:pPr>
             <w:r>
               <w:rPr>
@@ -3872,7 +3952,13 @@
               <w:rPr>
                 <w:sz w:val="15"/>
               </w:rPr>
-              <w:t>one flat vector: 1,102 numbers (v1), 1,126 (v2), 1,143 (v3), 1,264 (v4, v5)</w:t>
+              <w:t>O</w:t>
+            </w:r>
+            <w:r>
+              <w:rPr>
+                <w:sz w:val="15"/>
+              </w:rPr>
+              <w:t>ne flat vector: 1,102 numbers (v1), 1,126 (v2), 1,143 (v3), 1,264 (v4, v5)</w:t>
             </w:r>
           </w:p>
         </w:tc>
@@ -3890,6 +3976,7 @@
             <w:pPr>
               <w:keepNext/>
               <w:spacing w:after="20"/>
+              <w:jc w:val="center"/>
             </w:pPr>
             <w:r>
               <w:rPr>
@@ -3930,6 +4017,7 @@
             <w:pPr>
               <w:keepNext/>
               <w:spacing w:after="20"/>
+              <w:jc w:val="center"/>
             </w:pPr>
             <w:r>
               <w:rPr>
@@ -3952,7 +4040,13 @@
               <w:rPr>
                 <w:sz w:val="15"/>
               </w:rPr>
-              <w:t>illegal moves masked to probability zero; the game plays the most likely move</w:t>
+              <w:t>I</w:t>
+            </w:r>
+            <w:r>
+              <w:rPr>
+                <w:sz w:val="15"/>
+              </w:rPr>
+              <w:t>llegal moves masked to probability zero; the game plays the most likely move</w:t>
             </w:r>
           </w:p>
         </w:tc>
@@ -3970,6 +4064,7 @@
             <w:pPr>
               <w:keepNext/>
               <w:spacing w:after="20"/>
+              <w:jc w:val="center"/>
             </w:pPr>
             <w:r>
               <w:rPr>
@@ -4010,6 +4105,7 @@
             <w:pPr>
               <w:keepNext/>
               <w:spacing w:after="20"/>
+              <w:jc w:val="center"/>
             </w:pPr>
             <w:r>
               <w:rPr>
@@ -4032,7 +4128,13 @@
               <w:rPr>
                 <w:sz w:val="15"/>
               </w:rPr>
-              <w:t>cross-entropy on the masked logits, Adam (1e-3, cosine schedule), batch 512, 30 epochs; then 4 DAgger rounds of 12 epochs</w:t>
+              <w:t>C</w:t>
+            </w:r>
+            <w:r>
+              <w:rPr>
+                <w:sz w:val="15"/>
+              </w:rPr>
+              <w:t>ross-entropy on the masked logits, Adam (1e-3, cosine schedule), batch 512, 30 epochs; then 4 DAgger rounds of 12 epochs</w:t>
             </w:r>
           </w:p>
         </w:tc>
@@ -4049,6 +4151,7 @@
           <w:p>
             <w:pPr>
               <w:spacing w:after="20"/>
+              <w:jc w:val="center"/>
             </w:pPr>
             <w:r>
               <w:rPr>
@@ -4370,6 +4473,7 @@
         <w:tc>
           <w:tcPr>
             <w:tcW w:w="2551" w:type="dxa"/>
+            <w:vAlign w:val="center"/>
           </w:tcPr>
           <w:p>
             <w:pPr>
@@ -4386,6 +4490,7 @@
         <w:tc>
           <w:tcPr>
             <w:tcW w:w="3775" w:type="dxa"/>
+            <w:vAlign w:val="center"/>
           </w:tcPr>
           <w:p>
             <w:pPr>
@@ -4424,6 +4529,7 @@
         <w:tc>
           <w:tcPr>
             <w:tcW w:w="2551" w:type="dxa"/>
+            <w:vAlign w:val="center"/>
           </w:tcPr>
           <w:p>
             <w:pPr>
@@ -4440,6 +4546,7 @@
         <w:tc>
           <w:tcPr>
             <w:tcW w:w="3775" w:type="dxa"/>
+            <w:vAlign w:val="center"/>
           </w:tcPr>
           <w:p>
             <w:pPr>
@@ -4478,6 +4585,7 @@
         <w:tc>
           <w:tcPr>
             <w:tcW w:w="2551" w:type="dxa"/>
+            <w:vAlign w:val="center"/>
           </w:tcPr>
           <w:p>
             <w:pPr>
@@ -4494,6 +4602,7 @@
         <w:tc>
           <w:tcPr>
             <w:tcW w:w="3775" w:type="dxa"/>
+            <w:vAlign w:val="center"/>
           </w:tcPr>
           <w:p>
             <w:pPr>
@@ -4532,6 +4641,7 @@
         <w:tc>
           <w:tcPr>
             <w:tcW w:w="2551" w:type="dxa"/>
+            <w:vAlign w:val="center"/>
           </w:tcPr>
           <w:p>
             <w:pPr>
@@ -4548,6 +4658,7 @@
         <w:tc>
           <w:tcPr>
             <w:tcW w:w="3775" w:type="dxa"/>
+            <w:vAlign w:val="center"/>
           </w:tcPr>
           <w:p>
             <w:pPr>
@@ -4586,6 +4697,7 @@
         <w:tc>
           <w:tcPr>
             <w:tcW w:w="2551" w:type="dxa"/>
+            <w:vAlign w:val="center"/>
           </w:tcPr>
           <w:p>
             <w:pPr>
@@ -4602,6 +4714,7 @@
         <w:tc>
           <w:tcPr>
             <w:tcW w:w="3775" w:type="dxa"/>
+            <w:vAlign w:val="center"/>
           </w:tcPr>
           <w:p>
             <w:pPr>
@@ -4640,6 +4753,7 @@
         <w:tc>
           <w:tcPr>
             <w:tcW w:w="2551" w:type="dxa"/>
+            <w:vAlign w:val="center"/>
           </w:tcPr>
           <w:p>
             <w:pPr>
@@ -4656,6 +4770,7 @@
         <w:tc>
           <w:tcPr>
             <w:tcW w:w="3775" w:type="dxa"/>
+            <w:vAlign w:val="center"/>
           </w:tcPr>
           <w:p>
             <w:pPr>
@@ -4694,6 +4809,7 @@
         <w:tc>
           <w:tcPr>
             <w:tcW w:w="2551" w:type="dxa"/>
+            <w:vAlign w:val="center"/>
           </w:tcPr>
           <w:p>
             <w:pPr>
@@ -4710,6 +4826,7 @@
         <w:tc>
           <w:tcPr>
             <w:tcW w:w="3775" w:type="dxa"/>
+            <w:vAlign w:val="center"/>
           </w:tcPr>
           <w:p>
             <w:pPr>
@@ -4951,6 +5068,7 @@
           <w:p>
             <w:pPr>
               <w:spacing w:after="20"/>
+              <w:jc w:val="center"/>
             </w:pPr>
             <w:r>
               <w:rPr>
@@ -4963,6 +5081,7 @@
         <w:tc>
           <w:tcPr>
             <w:tcW w:w="2595" w:type="dxa"/>
+            <w:vAlign w:val="center"/>
           </w:tcPr>
           <w:p>
             <w:pPr>
@@ -4979,6 +5098,7 @@
         <w:tc>
           <w:tcPr>
             <w:tcW w:w="2155" w:type="dxa"/>
+            <w:vAlign w:val="center"/>
           </w:tcPr>
           <w:p>
             <w:pPr>
@@ -4995,6 +5115,7 @@
         <w:tc>
           <w:tcPr>
             <w:tcW w:w="1583" w:type="dxa"/>
+            <w:vAlign w:val="center"/>
           </w:tcPr>
           <w:p>
             <w:pPr>
@@ -5011,6 +5132,7 @@
         <w:tc>
           <w:tcPr>
             <w:tcW w:w="3211" w:type="dxa"/>
+            <w:vAlign w:val="center"/>
           </w:tcPr>
           <w:p>
             <w:pPr>
@@ -5037,6 +5159,7 @@
           <w:p>
             <w:pPr>
               <w:spacing w:after="20"/>
+              <w:jc w:val="center"/>
             </w:pPr>
             <w:r>
               <w:rPr>
@@ -5049,6 +5172,7 @@
         <w:tc>
           <w:tcPr>
             <w:tcW w:w="2595" w:type="dxa"/>
+            <w:vAlign w:val="center"/>
           </w:tcPr>
           <w:p>
             <w:pPr>
@@ -5065,6 +5189,7 @@
         <w:tc>
           <w:tcPr>
             <w:tcW w:w="2155" w:type="dxa"/>
+            <w:vAlign w:val="center"/>
           </w:tcPr>
           <w:p>
             <w:pPr>
@@ -5081,6 +5206,7 @@
         <w:tc>
           <w:tcPr>
             <w:tcW w:w="1583" w:type="dxa"/>
+            <w:vAlign w:val="center"/>
           </w:tcPr>
           <w:p>
             <w:pPr>
@@ -5097,6 +5223,7 @@
         <w:tc>
           <w:tcPr>
             <w:tcW w:w="3211" w:type="dxa"/>
+            <w:vAlign w:val="center"/>
           </w:tcPr>
           <w:p>
             <w:pPr>
@@ -5123,6 +5250,7 @@
           <w:p>
             <w:pPr>
               <w:spacing w:after="20"/>
+              <w:jc w:val="center"/>
             </w:pPr>
             <w:r>
               <w:rPr>
@@ -5135,6 +5263,7 @@
         <w:tc>
           <w:tcPr>
             <w:tcW w:w="2595" w:type="dxa"/>
+            <w:vAlign w:val="center"/>
           </w:tcPr>
           <w:p>
             <w:pPr>
@@ -5151,6 +5280,7 @@
         <w:tc>
           <w:tcPr>
             <w:tcW w:w="2155" w:type="dxa"/>
+            <w:vAlign w:val="center"/>
           </w:tcPr>
           <w:p>
             <w:pPr>
@@ -5167,6 +5297,7 @@
         <w:tc>
           <w:tcPr>
             <w:tcW w:w="1583" w:type="dxa"/>
+            <w:vAlign w:val="center"/>
           </w:tcPr>
           <w:p>
             <w:pPr>
@@ -5183,6 +5314,7 @@
         <w:tc>
           <w:tcPr>
             <w:tcW w:w="3211" w:type="dxa"/>
+            <w:vAlign w:val="center"/>
           </w:tcPr>
           <w:p>
             <w:pPr>
@@ -5209,6 +5341,7 @@
           <w:p>
             <w:pPr>
               <w:spacing w:after="20"/>
+              <w:jc w:val="center"/>
             </w:pPr>
             <w:r>
               <w:rPr>
@@ -5221,6 +5354,7 @@
         <w:tc>
           <w:tcPr>
             <w:tcW w:w="2595" w:type="dxa"/>
+            <w:vAlign w:val="center"/>
           </w:tcPr>
           <w:p>
             <w:pPr>
@@ -5237,6 +5371,7 @@
         <w:tc>
           <w:tcPr>
             <w:tcW w:w="2155" w:type="dxa"/>
+            <w:vAlign w:val="center"/>
           </w:tcPr>
           <w:p>
             <w:pPr>
@@ -5253,6 +5388,7 @@
         <w:tc>
           <w:tcPr>
             <w:tcW w:w="1583" w:type="dxa"/>
+            <w:vAlign w:val="center"/>
           </w:tcPr>
           <w:p>
             <w:pPr>
@@ -5269,6 +5405,7 @@
         <w:tc>
           <w:tcPr>
             <w:tcW w:w="3211" w:type="dxa"/>
+            <w:vAlign w:val="center"/>
           </w:tcPr>
           <w:p>
             <w:pPr>
@@ -5295,6 +5432,7 @@
           <w:p>
             <w:pPr>
               <w:spacing w:after="20"/>
+              <w:jc w:val="center"/>
             </w:pPr>
             <w:r>
               <w:rPr>
@@ -5307,6 +5445,7 @@
         <w:tc>
           <w:tcPr>
             <w:tcW w:w="2595" w:type="dxa"/>
+            <w:vAlign w:val="center"/>
           </w:tcPr>
           <w:p>
             <w:pPr>
@@ -5323,6 +5462,7 @@
         <w:tc>
           <w:tcPr>
             <w:tcW w:w="2155" w:type="dxa"/>
+            <w:vAlign w:val="center"/>
           </w:tcPr>
           <w:p>
             <w:pPr>
@@ -5339,6 +5479,7 @@
         <w:tc>
           <w:tcPr>
             <w:tcW w:w="1583" w:type="dxa"/>
+            <w:vAlign w:val="center"/>
           </w:tcPr>
           <w:p>
             <w:pPr>
@@ -5355,6 +5496,7 @@
         <w:tc>
           <w:tcPr>
             <w:tcW w:w="3211" w:type="dxa"/>
+            <w:vAlign w:val="center"/>
           </w:tcPr>
           <w:p>
             <w:pPr>
@@ -5381,6 +5523,7 @@
           <w:p>
             <w:pPr>
               <w:spacing w:after="20"/>
+              <w:jc w:val="center"/>
             </w:pPr>
             <w:r>
               <w:rPr>
@@ -5393,6 +5536,7 @@
         <w:tc>
           <w:tcPr>
             <w:tcW w:w="2595" w:type="dxa"/>
+            <w:vAlign w:val="center"/>
           </w:tcPr>
           <w:p>
             <w:pPr>
@@ -5415,6 +5559,7 @@
         <w:tc>
           <w:tcPr>
             <w:tcW w:w="2155" w:type="dxa"/>
+            <w:vAlign w:val="center"/>
           </w:tcPr>
           <w:p>
             <w:pPr>
@@ -5431,6 +5576,7 @@
         <w:tc>
           <w:tcPr>
             <w:tcW w:w="1583" w:type="dxa"/>
+            <w:vAlign w:val="center"/>
           </w:tcPr>
           <w:p>
             <w:pPr>
@@ -5447,6 +5593,7 @@
         <w:tc>
           <w:tcPr>
             <w:tcW w:w="3211" w:type="dxa"/>
+            <w:vAlign w:val="center"/>
           </w:tcPr>
           <w:p>
             <w:pPr>
@@ -6226,6 +6373,7 @@
           <w:tcPr>
             <w:tcW w:w="2656" w:type="dxa"/>
             <w:shd w:val="clear" w:color="auto" w:fill="D9D9D9"/>
+            <w:vAlign w:val="center"/>
           </w:tcPr>
           <w:p>
             <w:pPr>
@@ -6246,6 +6394,7 @@
           <w:tcPr>
             <w:tcW w:w="530" w:type="dxa"/>
             <w:shd w:val="clear" w:color="auto" w:fill="D9D9D9"/>
+            <w:vAlign w:val="center"/>
           </w:tcPr>
           <w:p>
             <w:pPr>
@@ -6266,6 +6415,7 @@
           <w:tcPr>
             <w:tcW w:w="522" w:type="dxa"/>
             <w:shd w:val="clear" w:color="auto" w:fill="D9D9D9"/>
+            <w:vAlign w:val="center"/>
           </w:tcPr>
           <w:p>
             <w:pPr>
@@ -6286,6 +6436,7 @@
           <w:tcPr>
             <w:tcW w:w="530" w:type="dxa"/>
             <w:shd w:val="clear" w:color="auto" w:fill="D9D9D9"/>
+            <w:vAlign w:val="center"/>
           </w:tcPr>
           <w:p>
             <w:pPr>
@@ -6306,6 +6457,7 @@
           <w:tcPr>
             <w:tcW w:w="452" w:type="dxa"/>
             <w:shd w:val="clear" w:color="auto" w:fill="D9D9D9"/>
+            <w:vAlign w:val="center"/>
           </w:tcPr>
           <w:p>
             <w:pPr>
@@ -6353,6 +6505,7 @@
             <w:pPr>
               <w:keepNext/>
               <w:spacing w:after="20"/>
+              <w:jc w:val="center"/>
             </w:pPr>
             <w:r>
               <w:rPr>
@@ -6370,6 +6523,7 @@
             <w:pPr>
               <w:keepNext/>
               <w:spacing w:after="20"/>
+              <w:jc w:val="center"/>
             </w:pPr>
             <w:r>
               <w:rPr>
@@ -6387,6 +6541,7 @@
             <w:pPr>
               <w:keepNext/>
               <w:spacing w:after="20"/>
+              <w:jc w:val="center"/>
             </w:pPr>
             <w:r>
               <w:rPr>
@@ -6404,6 +6559,7 @@
             <w:pPr>
               <w:keepNext/>
               <w:spacing w:after="20"/>
+              <w:jc w:val="center"/>
             </w:pPr>
             <w:r>
               <w:rPr>
@@ -6444,6 +6600,7 @@
             <w:pPr>
               <w:keepNext/>
               <w:spacing w:after="20"/>
+              <w:jc w:val="center"/>
             </w:pPr>
             <w:r>
               <w:rPr>
@@ -6461,6 +6618,7 @@
             <w:pPr>
               <w:keepNext/>
               <w:spacing w:after="20"/>
+              <w:jc w:val="center"/>
             </w:pPr>
             <w:r>
               <w:rPr>
@@ -6478,6 +6636,7 @@
             <w:pPr>
               <w:keepNext/>
               <w:spacing w:after="20"/>
+              <w:jc w:val="center"/>
             </w:pPr>
             <w:r>
               <w:rPr>
@@ -6495,6 +6654,7 @@
             <w:pPr>
               <w:keepNext/>
               <w:spacing w:after="20"/>
+              <w:jc w:val="center"/>
             </w:pPr>
             <w:r>
               <w:rPr>
@@ -6536,6 +6696,7 @@
             <w:pPr>
               <w:keepNext/>
               <w:spacing w:after="20"/>
+              <w:jc w:val="center"/>
             </w:pPr>
             <w:r>
               <w:rPr>
@@ -6554,6 +6715,7 @@
             <w:pPr>
               <w:keepNext/>
               <w:spacing w:after="20"/>
+              <w:jc w:val="center"/>
             </w:pPr>
             <w:r>
               <w:rPr>
@@ -6571,6 +6733,7 @@
             <w:pPr>
               <w:keepNext/>
               <w:spacing w:after="20"/>
+              <w:jc w:val="center"/>
             </w:pPr>
             <w:r>
               <w:rPr>
@@ -6589,6 +6752,7 @@
             <w:pPr>
               <w:keepNext/>
               <w:spacing w:after="20"/>
+              <w:jc w:val="center"/>
             </w:pPr>
             <w:r>
               <w:rPr>
@@ -6629,6 +6793,7 @@
             <w:pPr>
               <w:keepNext/>
               <w:spacing w:after="20"/>
+              <w:jc w:val="center"/>
             </w:pPr>
             <w:r>
               <w:rPr>
@@ -6646,6 +6811,7 @@
             <w:pPr>
               <w:keepNext/>
               <w:spacing w:after="20"/>
+              <w:jc w:val="center"/>
             </w:pPr>
             <w:r>
               <w:rPr>
@@ -6663,6 +6829,7 @@
             <w:pPr>
               <w:keepNext/>
               <w:spacing w:after="20"/>
+              <w:jc w:val="center"/>
             </w:pPr>
             <w:r>
               <w:rPr>
@@ -6680,6 +6847,7 @@
             <w:pPr>
               <w:keepNext/>
               <w:spacing w:after="20"/>
+              <w:jc w:val="center"/>
             </w:pPr>
             <w:r>
               <w:rPr>
@@ -6718,6 +6886,7 @@
           <w:p>
             <w:pPr>
               <w:spacing w:after="20"/>
+              <w:jc w:val="center"/>
             </w:pPr>
             <w:r>
               <w:rPr>
@@ -6734,6 +6903,7 @@
           <w:p>
             <w:pPr>
               <w:spacing w:after="20"/>
+              <w:jc w:val="center"/>
             </w:pPr>
             <w:r>
               <w:rPr>
@@ -6750,6 +6920,7 @@
           <w:p>
             <w:pPr>
               <w:spacing w:after="20"/>
+              <w:jc w:val="center"/>
             </w:pPr>
             <w:r>
               <w:rPr>
@@ -6766,6 +6937,7 @@
           <w:p>
             <w:pPr>
               <w:spacing w:after="20"/>
+              <w:jc w:val="center"/>
             </w:pPr>
             <w:r>
               <w:rPr>
@@ -7054,6 +7226,7 @@
           <w:p>
             <w:pPr>
               <w:spacing w:after="20"/>
+              <w:jc w:val="center"/>
             </w:pPr>
             <w:r>
               <w:rPr>
@@ -7070,12 +7243,19 @@
           <w:p>
             <w:pPr>
               <w:spacing w:after="20"/>
-            </w:pPr>
-            <w:r>
-              <w:rPr>
-                <w:sz w:val="16"/>
-              </w:rPr>
-              <w:t>not applicable</w:t>
+              <w:jc w:val="center"/>
+            </w:pPr>
+            <w:r>
+              <w:rPr>
+                <w:sz w:val="16"/>
+              </w:rPr>
+              <w:t>N</w:t>
+            </w:r>
+            <w:r>
+              <w:rPr>
+                <w:sz w:val="16"/>
+              </w:rPr>
+              <w:t>ot applicable</w:t>
             </w:r>
           </w:p>
         </w:tc>
@@ -7086,6 +7266,7 @@
           <w:p>
             <w:pPr>
               <w:spacing w:after="20"/>
+              <w:jc w:val="center"/>
             </w:pPr>
             <w:r>
               <w:rPr>
@@ -7102,12 +7283,19 @@
           <w:p>
             <w:pPr>
               <w:spacing w:after="20"/>
-            </w:pPr>
-            <w:r>
-              <w:rPr>
-                <w:sz w:val="16"/>
-              </w:rPr>
-              <w:t>not run</w:t>
+              <w:jc w:val="center"/>
+            </w:pPr>
+            <w:r>
+              <w:rPr>
+                <w:sz w:val="16"/>
+              </w:rPr>
+              <w:t>N</w:t>
+            </w:r>
+            <w:r>
+              <w:rPr>
+                <w:sz w:val="16"/>
+              </w:rPr>
+              <w:t>ot run</w:t>
             </w:r>
           </w:p>
         </w:tc>
@@ -7118,12 +7306,19 @@
           <w:p>
             <w:pPr>
               <w:spacing w:after="20"/>
-            </w:pPr>
-            <w:r>
-              <w:rPr>
-                <w:sz w:val="16"/>
-              </w:rPr>
-              <w:t>not run</w:t>
+              <w:jc w:val="center"/>
+            </w:pPr>
+            <w:r>
+              <w:rPr>
+                <w:sz w:val="16"/>
+              </w:rPr>
+              <w:t>N</w:t>
+            </w:r>
+            <w:r>
+              <w:rPr>
+                <w:sz w:val="16"/>
+              </w:rPr>
+              <w:t>ot run</w:t>
             </w:r>
           </w:p>
         </w:tc>
@@ -7134,12 +7329,19 @@
           <w:p>
             <w:pPr>
               <w:spacing w:after="20"/>
-            </w:pPr>
-            <w:r>
-              <w:rPr>
-                <w:sz w:val="16"/>
-              </w:rPr>
-              <w:t>not run</w:t>
+              <w:jc w:val="center"/>
+            </w:pPr>
+            <w:r>
+              <w:rPr>
+                <w:sz w:val="16"/>
+              </w:rPr>
+              <w:t>N</w:t>
+            </w:r>
+            <w:r>
+              <w:rPr>
+                <w:sz w:val="16"/>
+              </w:rPr>
+              <w:t>ot run</w:t>
             </w:r>
           </w:p>
         </w:tc>
@@ -7156,6 +7358,7 @@
           <w:p>
             <w:pPr>
               <w:spacing w:after="20"/>
+              <w:jc w:val="center"/>
             </w:pPr>
             <w:r>
               <w:rPr>
@@ -7172,6 +7375,7 @@
           <w:p>
             <w:pPr>
               <w:spacing w:after="20"/>
+              <w:jc w:val="center"/>
             </w:pPr>
             <w:r>
               <w:rPr>
@@ -7188,6 +7392,7 @@
           <w:p>
             <w:pPr>
               <w:spacing w:after="20"/>
+              <w:jc w:val="center"/>
             </w:pPr>
             <w:r>
               <w:rPr>
@@ -7204,12 +7409,19 @@
           <w:p>
             <w:pPr>
               <w:spacing w:after="20"/>
-            </w:pPr>
-            <w:r>
-              <w:rPr>
-                <w:sz w:val="16"/>
-              </w:rPr>
-              <w:t>not run</w:t>
+              <w:jc w:val="center"/>
+            </w:pPr>
+            <w:r>
+              <w:rPr>
+                <w:sz w:val="16"/>
+              </w:rPr>
+              <w:t>N</w:t>
+            </w:r>
+            <w:r>
+              <w:rPr>
+                <w:sz w:val="16"/>
+              </w:rPr>
+              <w:t>ot run</w:t>
             </w:r>
           </w:p>
         </w:tc>
@@ -7220,12 +7432,19 @@
           <w:p>
             <w:pPr>
               <w:spacing w:after="20"/>
-            </w:pPr>
-            <w:r>
-              <w:rPr>
-                <w:sz w:val="16"/>
-              </w:rPr>
-              <w:t>not run</w:t>
+              <w:jc w:val="center"/>
+            </w:pPr>
+            <w:r>
+              <w:rPr>
+                <w:sz w:val="16"/>
+              </w:rPr>
+              <w:t>N</w:t>
+            </w:r>
+            <w:r>
+              <w:rPr>
+                <w:sz w:val="16"/>
+              </w:rPr>
+              <w:t>ot run</w:t>
             </w:r>
           </w:p>
         </w:tc>
@@ -7236,12 +7455,19 @@
           <w:p>
             <w:pPr>
               <w:spacing w:after="20"/>
-            </w:pPr>
-            <w:r>
-              <w:rPr>
-                <w:sz w:val="16"/>
-              </w:rPr>
-              <w:t>not run</w:t>
+              <w:jc w:val="center"/>
+            </w:pPr>
+            <w:r>
+              <w:rPr>
+                <w:sz w:val="16"/>
+              </w:rPr>
+              <w:t>N</w:t>
+            </w:r>
+            <w:r>
+              <w:rPr>
+                <w:sz w:val="16"/>
+              </w:rPr>
+              <w:t>ot run</w:t>
             </w:r>
           </w:p>
         </w:tc>
@@ -7258,6 +7484,7 @@
           <w:p>
             <w:pPr>
               <w:spacing w:after="20"/>
+              <w:jc w:val="center"/>
             </w:pPr>
             <w:r>
               <w:rPr>
@@ -7274,6 +7501,7 @@
           <w:p>
             <w:pPr>
               <w:spacing w:after="20"/>
+              <w:jc w:val="center"/>
             </w:pPr>
             <w:r>
               <w:rPr>
@@ -7290,6 +7518,7 @@
           <w:p>
             <w:pPr>
               <w:spacing w:after="20"/>
+              <w:jc w:val="center"/>
             </w:pPr>
             <w:r>
               <w:rPr>
@@ -7306,6 +7535,7 @@
           <w:p>
             <w:pPr>
               <w:spacing w:after="20"/>
+              <w:jc w:val="center"/>
             </w:pPr>
             <w:r>
               <w:rPr>
@@ -7322,6 +7552,7 @@
           <w:p>
             <w:pPr>
               <w:spacing w:after="20"/>
+              <w:jc w:val="center"/>
             </w:pPr>
             <w:r>
               <w:rPr>
@@ -7338,12 +7569,19 @@
           <w:p>
             <w:pPr>
               <w:spacing w:after="20"/>
-            </w:pPr>
-            <w:r>
-              <w:rPr>
-                <w:sz w:val="16"/>
-              </w:rPr>
-              <w:t>not run</w:t>
+              <w:jc w:val="center"/>
+            </w:pPr>
+            <w:r>
+              <w:rPr>
+                <w:sz w:val="16"/>
+              </w:rPr>
+              <w:t>N</w:t>
+            </w:r>
+            <w:r>
+              <w:rPr>
+                <w:sz w:val="16"/>
+              </w:rPr>
+              <w:t>ot run</w:t>
             </w:r>
           </w:p>
         </w:tc>
@@ -7360,6 +7598,7 @@
           <w:p>
             <w:pPr>
               <w:spacing w:after="20"/>
+              <w:jc w:val="center"/>
             </w:pPr>
             <w:r>
               <w:rPr>
@@ -7376,6 +7615,7 @@
           <w:p>
             <w:pPr>
               <w:spacing w:after="20"/>
+              <w:jc w:val="center"/>
             </w:pPr>
             <w:r>
               <w:rPr>
@@ -7392,6 +7632,7 @@
           <w:p>
             <w:pPr>
               <w:spacing w:after="20"/>
+              <w:jc w:val="center"/>
             </w:pPr>
             <w:r>
               <w:rPr>
@@ -7408,12 +7649,19 @@
           <w:p>
             <w:pPr>
               <w:spacing w:after="20"/>
-            </w:pPr>
-            <w:r>
-              <w:rPr>
-                <w:sz w:val="16"/>
-              </w:rPr>
-              <w:t>not run</w:t>
+              <w:jc w:val="center"/>
+            </w:pPr>
+            <w:r>
+              <w:rPr>
+                <w:sz w:val="16"/>
+              </w:rPr>
+              <w:t>N</w:t>
+            </w:r>
+            <w:r>
+              <w:rPr>
+                <w:sz w:val="16"/>
+              </w:rPr>
+              <w:t>ot run</w:t>
             </w:r>
           </w:p>
         </w:tc>
@@ -7424,12 +7672,19 @@
           <w:p>
             <w:pPr>
               <w:spacing w:after="20"/>
-            </w:pPr>
-            <w:r>
-              <w:rPr>
-                <w:sz w:val="16"/>
-              </w:rPr>
-              <w:t>not run</w:t>
+              <w:jc w:val="center"/>
+            </w:pPr>
+            <w:r>
+              <w:rPr>
+                <w:sz w:val="16"/>
+              </w:rPr>
+              <w:t>N</w:t>
+            </w:r>
+            <w:r>
+              <w:rPr>
+                <w:sz w:val="16"/>
+              </w:rPr>
+              <w:t>ot run</w:t>
             </w:r>
           </w:p>
         </w:tc>
@@ -7440,12 +7695,19 @@
           <w:p>
             <w:pPr>
               <w:spacing w:after="20"/>
-            </w:pPr>
-            <w:r>
-              <w:rPr>
-                <w:sz w:val="16"/>
-              </w:rPr>
-              <w:t>not run</w:t>
+              <w:jc w:val="center"/>
+            </w:pPr>
+            <w:r>
+              <w:rPr>
+                <w:sz w:val="16"/>
+              </w:rPr>
+              <w:t>N</w:t>
+            </w:r>
+            <w:r>
+              <w:rPr>
+                <w:sz w:val="16"/>
+              </w:rPr>
+              <w:t>ot run</w:t>
             </w:r>
           </w:p>
         </w:tc>
@@ -7462,6 +7724,7 @@
           <w:p>
             <w:pPr>
               <w:spacing w:after="20"/>
+              <w:jc w:val="center"/>
             </w:pPr>
             <w:r>
               <w:rPr>
@@ -7478,6 +7741,7 @@
           <w:p>
             <w:pPr>
               <w:spacing w:after="20"/>
+              <w:jc w:val="center"/>
             </w:pPr>
             <w:r>
               <w:rPr>
@@ -7494,6 +7758,7 @@
           <w:p>
             <w:pPr>
               <w:spacing w:after="20"/>
+              <w:jc w:val="center"/>
             </w:pPr>
             <w:r>
               <w:rPr>
@@ -7510,6 +7775,7 @@
           <w:p>
             <w:pPr>
               <w:spacing w:after="20"/>
+              <w:jc w:val="center"/>
             </w:pPr>
             <w:r>
               <w:rPr>
@@ -7526,6 +7792,7 @@
           <w:p>
             <w:pPr>
               <w:spacing w:after="20"/>
+              <w:jc w:val="center"/>
             </w:pPr>
             <w:r>
               <w:rPr>
@@ -7542,6 +7809,7 @@
           <w:p>
             <w:pPr>
               <w:spacing w:after="20"/>
+              <w:jc w:val="center"/>
             </w:pPr>
             <w:r>
               <w:rPr>
@@ -7564,6 +7832,7 @@
           <w:p>
             <w:pPr>
               <w:spacing w:after="20"/>
+              <w:jc w:val="center"/>
             </w:pPr>
             <w:r>
               <w:rPr>
@@ -7580,6 +7849,7 @@
           <w:p>
             <w:pPr>
               <w:spacing w:after="20"/>
+              <w:jc w:val="center"/>
             </w:pPr>
             <w:r>
               <w:rPr>
@@ -7596,12 +7866,19 @@
           <w:p>
             <w:pPr>
               <w:spacing w:after="20"/>
-            </w:pPr>
-            <w:r>
-              <w:rPr>
-                <w:sz w:val="16"/>
-              </w:rPr>
-              <w:t>not run</w:t>
+              <w:jc w:val="center"/>
+            </w:pPr>
+            <w:r>
+              <w:rPr>
+                <w:sz w:val="16"/>
+              </w:rPr>
+              <w:t>N</w:t>
+            </w:r>
+            <w:r>
+              <w:rPr>
+                <w:sz w:val="16"/>
+              </w:rPr>
+              <w:t>ot run</w:t>
             </w:r>
           </w:p>
         </w:tc>
@@ -7612,12 +7889,19 @@
           <w:p>
             <w:pPr>
               <w:spacing w:after="20"/>
-            </w:pPr>
-            <w:r>
-              <w:rPr>
-                <w:sz w:val="16"/>
-              </w:rPr>
-              <w:t>not run</w:t>
+              <w:jc w:val="center"/>
+            </w:pPr>
+            <w:r>
+              <w:rPr>
+                <w:sz w:val="16"/>
+              </w:rPr>
+              <w:t>N</w:t>
+            </w:r>
+            <w:r>
+              <w:rPr>
+                <w:sz w:val="16"/>
+              </w:rPr>
+              <w:t>ot run</w:t>
             </w:r>
           </w:p>
         </w:tc>
@@ -7628,12 +7912,19 @@
           <w:p>
             <w:pPr>
               <w:spacing w:after="20"/>
-            </w:pPr>
-            <w:r>
-              <w:rPr>
-                <w:sz w:val="16"/>
-              </w:rPr>
-              <w:t>not run</w:t>
+              <w:jc w:val="center"/>
+            </w:pPr>
+            <w:r>
+              <w:rPr>
+                <w:sz w:val="16"/>
+              </w:rPr>
+              <w:t>N</w:t>
+            </w:r>
+            <w:r>
+              <w:rPr>
+                <w:sz w:val="16"/>
+              </w:rPr>
+              <w:t>ot run</w:t>
             </w:r>
           </w:p>
         </w:tc>
@@ -7644,6 +7935,7 @@
           <w:p>
             <w:pPr>
               <w:spacing w:after="20"/>
+              <w:jc w:val="center"/>
             </w:pPr>
             <w:r>
               <w:rPr>
@@ -7666,6 +7958,7 @@
           <w:p>
             <w:pPr>
               <w:spacing w:after="20"/>
+              <w:jc w:val="center"/>
             </w:pPr>
             <w:r>
               <w:rPr>
@@ -7683,12 +7976,19 @@
           <w:p>
             <w:pPr>
               <w:spacing w:after="20"/>
-            </w:pPr>
-            <w:r>
-              <w:rPr>
-                <w:sz w:val="16"/>
-              </w:rPr>
-              <w:t>not applicable</w:t>
+              <w:jc w:val="center"/>
+            </w:pPr>
+            <w:r>
+              <w:rPr>
+                <w:sz w:val="16"/>
+              </w:rPr>
+              <w:t>N</w:t>
+            </w:r>
+            <w:r>
+              <w:rPr>
+                <w:sz w:val="16"/>
+              </w:rPr>
+              <w:t>ot applicable</w:t>
             </w:r>
           </w:p>
         </w:tc>
@@ -7699,6 +7999,7 @@
           <w:p>
             <w:pPr>
               <w:spacing w:after="20"/>
+              <w:jc w:val="center"/>
             </w:pPr>
             <w:r>
               <w:rPr>
@@ -7715,6 +8016,7 @@
           <w:p>
             <w:pPr>
               <w:spacing w:after="20"/>
+              <w:jc w:val="center"/>
             </w:pPr>
             <w:r>
               <w:rPr>
@@ -7731,6 +8033,7 @@
           <w:p>
             <w:pPr>
               <w:spacing w:after="20"/>
+              <w:jc w:val="center"/>
             </w:pPr>
             <w:r>
               <w:rPr>
@@ -7747,6 +8050,7 @@
           <w:p>
             <w:pPr>
               <w:spacing w:after="20"/>
+              <w:jc w:val="center"/>
             </w:pPr>
             <w:r>
               <w:rPr>
@@ -8114,6 +8418,7 @@
             <w:pPr>
               <w:keepNext/>
               <w:spacing w:after="20"/>
+              <w:jc w:val="center"/>
             </w:pPr>
             <w:r>
               <w:rPr>
@@ -8131,6 +8436,7 @@
             <w:pPr>
               <w:keepNext/>
               <w:spacing w:after="20"/>
+              <w:jc w:val="center"/>
             </w:pPr>
             <w:r>
               <w:rPr>
@@ -8148,6 +8454,7 @@
             <w:pPr>
               <w:keepNext/>
               <w:spacing w:after="20"/>
+              <w:jc w:val="center"/>
             </w:pPr>
             <w:r>
               <w:rPr>
@@ -8165,6 +8472,7 @@
             <w:pPr>
               <w:keepNext/>
               <w:spacing w:after="20"/>
+              <w:jc w:val="center"/>
             </w:pPr>
             <w:r>
               <w:rPr>
@@ -8182,6 +8490,7 @@
             <w:pPr>
               <w:keepNext/>
               <w:spacing w:after="20"/>
+              <w:jc w:val="center"/>
             </w:pPr>
             <w:r>
               <w:rPr>
@@ -8205,6 +8514,7 @@
             <w:pPr>
               <w:keepNext/>
               <w:spacing w:after="20"/>
+              <w:jc w:val="center"/>
             </w:pPr>
             <w:r>
               <w:rPr>
@@ -8222,6 +8532,7 @@
             <w:pPr>
               <w:keepNext/>
               <w:spacing w:after="20"/>
+              <w:jc w:val="center"/>
             </w:pPr>
             <w:r>
               <w:rPr>
@@ -8239,6 +8550,7 @@
             <w:pPr>
               <w:keepNext/>
               <w:spacing w:after="20"/>
+              <w:jc w:val="center"/>
             </w:pPr>
             <w:r>
               <w:rPr>
@@ -8256,6 +8568,7 @@
             <w:pPr>
               <w:keepNext/>
               <w:spacing w:after="20"/>
+              <w:jc w:val="center"/>
             </w:pPr>
             <w:r>
               <w:rPr>
@@ -8273,6 +8586,7 @@
             <w:pPr>
               <w:keepNext/>
               <w:spacing w:after="20"/>
+              <w:jc w:val="center"/>
             </w:pPr>
             <w:r>
               <w:rPr>
@@ -8295,6 +8609,7 @@
           <w:p>
             <w:pPr>
               <w:spacing w:after="20"/>
+              <w:jc w:val="center"/>
             </w:pPr>
             <w:r>
               <w:rPr>
@@ -8311,6 +8626,7 @@
           <w:p>
             <w:pPr>
               <w:spacing w:after="20"/>
+              <w:jc w:val="center"/>
             </w:pPr>
             <w:r>
               <w:rPr>
@@ -8327,6 +8643,7 @@
           <w:p>
             <w:pPr>
               <w:spacing w:after="20"/>
+              <w:jc w:val="center"/>
             </w:pPr>
             <w:r>
               <w:rPr>
@@ -8343,6 +8660,7 @@
           <w:p>
             <w:pPr>
               <w:spacing w:after="20"/>
+              <w:jc w:val="center"/>
             </w:pPr>
             <w:r>
               <w:rPr>
@@ -8359,6 +8677,7 @@
           <w:p>
             <w:pPr>
               <w:spacing w:after="20"/>
+              <w:jc w:val="center"/>
             </w:pPr>
             <w:r>
               <w:rPr>
@@ -8701,6 +9020,7 @@
           <w:p>
             <w:pPr>
               <w:spacing w:after="20"/>
+              <w:jc w:val="center"/>
             </w:pPr>
             <w:r>
               <w:rPr>
@@ -8717,6 +9037,7 @@
           <w:p>
             <w:pPr>
               <w:spacing w:after="20"/>
+              <w:jc w:val="center"/>
             </w:pPr>
             <w:r>
               <w:rPr>
@@ -8733,6 +9054,7 @@
           <w:p>
             <w:pPr>
               <w:spacing w:after="20"/>
+              <w:jc w:val="center"/>
             </w:pPr>
             <w:r>
               <w:rPr>
@@ -8749,6 +9071,7 @@
           <w:p>
             <w:pPr>
               <w:spacing w:after="20"/>
+              <w:jc w:val="center"/>
             </w:pPr>
             <w:r>
               <w:rPr>
@@ -8765,6 +9088,7 @@
           <w:p>
             <w:pPr>
               <w:spacing w:after="20"/>
+              <w:jc w:val="center"/>
             </w:pPr>
             <w:r>
               <w:rPr>
@@ -8781,6 +9105,7 @@
           <w:p>
             <w:pPr>
               <w:spacing w:after="20"/>
+              <w:jc w:val="center"/>
             </w:pPr>
             <w:r>
               <w:rPr>
@@ -8797,6 +9122,7 @@
           <w:p>
             <w:pPr>
               <w:spacing w:after="20"/>
+              <w:jc w:val="center"/>
             </w:pPr>
             <w:r>
               <w:rPr>
@@ -8813,6 +9139,7 @@
           <w:p>
             <w:pPr>
               <w:spacing w:after="20"/>
+              <w:jc w:val="center"/>
             </w:pPr>
             <w:r>
               <w:rPr>
@@ -8829,6 +9156,7 @@
           <w:p>
             <w:pPr>
               <w:spacing w:after="20"/>
+              <w:jc w:val="center"/>
             </w:pPr>
             <w:r>
               <w:rPr>
@@ -8845,6 +9173,7 @@
           <w:p>
             <w:pPr>
               <w:spacing w:after="20"/>
+              <w:jc w:val="center"/>
             </w:pPr>
             <w:r>
               <w:rPr>
@@ -8867,6 +9196,7 @@
           <w:p>
             <w:pPr>
               <w:spacing w:after="20"/>
+              <w:jc w:val="center"/>
             </w:pPr>
             <w:r>
               <w:rPr>
@@ -8883,6 +9213,7 @@
           <w:p>
             <w:pPr>
               <w:spacing w:after="20"/>
+              <w:jc w:val="center"/>
             </w:pPr>
             <w:r>
               <w:rPr>
@@ -8899,6 +9230,7 @@
           <w:p>
             <w:pPr>
               <w:spacing w:after="20"/>
+              <w:jc w:val="center"/>
             </w:pPr>
             <w:r>
               <w:rPr>
@@ -8915,6 +9247,7 @@
           <w:p>
             <w:pPr>
               <w:spacing w:after="20"/>
+              <w:jc w:val="center"/>
             </w:pPr>
             <w:r>
               <w:rPr>
@@ -8931,6 +9264,7 @@
           <w:p>
             <w:pPr>
               <w:spacing w:after="20"/>
+              <w:jc w:val="center"/>
             </w:pPr>
             <w:r>
               <w:rPr>
@@ -8947,6 +9281,7 @@
           <w:p>
             <w:pPr>
               <w:spacing w:after="20"/>
+              <w:jc w:val="center"/>
             </w:pPr>
             <w:r>
               <w:rPr>
@@ -8963,6 +9298,7 @@
           <w:p>
             <w:pPr>
               <w:spacing w:after="20"/>
+              <w:jc w:val="center"/>
             </w:pPr>
             <w:r>
               <w:rPr>
@@ -8979,6 +9315,7 @@
           <w:p>
             <w:pPr>
               <w:spacing w:after="20"/>
+              <w:jc w:val="center"/>
             </w:pPr>
             <w:r>
               <w:rPr>
@@ -8995,6 +9332,7 @@
           <w:p>
             <w:pPr>
               <w:spacing w:after="20"/>
+              <w:jc w:val="center"/>
             </w:pPr>
             <w:r>
               <w:rPr>
@@ -9011,6 +9349,7 @@
           <w:p>
             <w:pPr>
               <w:spacing w:after="20"/>
+              <w:jc w:val="center"/>
             </w:pPr>
             <w:r>
               <w:rPr>
@@ -9033,6 +9372,7 @@
           <w:p>
             <w:pPr>
               <w:spacing w:after="20"/>
+              <w:jc w:val="center"/>
             </w:pPr>
             <w:r>
               <w:rPr>
@@ -9049,6 +9389,7 @@
           <w:p>
             <w:pPr>
               <w:spacing w:after="20"/>
+              <w:jc w:val="center"/>
             </w:pPr>
             <w:r>
               <w:rPr>
@@ -9065,6 +9406,7 @@
           <w:p>
             <w:pPr>
               <w:spacing w:after="20"/>
+              <w:jc w:val="center"/>
             </w:pPr>
             <w:r>
               <w:rPr>
@@ -9081,6 +9423,7 @@
           <w:p>
             <w:pPr>
               <w:spacing w:after="20"/>
+              <w:jc w:val="center"/>
             </w:pPr>
             <w:r>
               <w:rPr>
@@ -9097,6 +9440,7 @@
           <w:p>
             <w:pPr>
               <w:spacing w:after="20"/>
+              <w:jc w:val="center"/>
             </w:pPr>
             <w:r>
               <w:rPr>
@@ -9113,6 +9457,7 @@
           <w:p>
             <w:pPr>
               <w:spacing w:after="20"/>
+              <w:jc w:val="center"/>
             </w:pPr>
             <w:r>
               <w:rPr>
@@ -9129,6 +9474,7 @@
           <w:p>
             <w:pPr>
               <w:spacing w:after="20"/>
+              <w:jc w:val="center"/>
             </w:pPr>
             <w:r>
               <w:rPr>
@@ -9145,6 +9491,7 @@
           <w:p>
             <w:pPr>
               <w:spacing w:after="20"/>
+              <w:jc w:val="center"/>
             </w:pPr>
             <w:r>
               <w:rPr>
@@ -9161,6 +9508,7 @@
           <w:p>
             <w:pPr>
               <w:spacing w:after="20"/>
+              <w:jc w:val="center"/>
             </w:pPr>
             <w:r>
               <w:rPr>
@@ -9177,6 +9525,7 @@
           <w:p>
             <w:pPr>
               <w:spacing w:after="20"/>
+              <w:jc w:val="center"/>
             </w:pPr>
             <w:r>
               <w:rPr>
@@ -9199,6 +9548,7 @@
           <w:p>
             <w:pPr>
               <w:spacing w:after="20"/>
+              <w:jc w:val="center"/>
             </w:pPr>
             <w:r>
               <w:rPr>
@@ -9215,6 +9565,7 @@
           <w:p>
             <w:pPr>
               <w:spacing w:after="20"/>
+              <w:jc w:val="center"/>
             </w:pPr>
             <w:r>
               <w:rPr>
@@ -9231,6 +9582,7 @@
           <w:p>
             <w:pPr>
               <w:spacing w:after="20"/>
+              <w:jc w:val="center"/>
             </w:pPr>
             <w:r>
               <w:rPr>
@@ -9247,6 +9599,7 @@
           <w:p>
             <w:pPr>
               <w:spacing w:after="20"/>
+              <w:jc w:val="center"/>
             </w:pPr>
             <w:r>
               <w:rPr>
@@ -9263,6 +9616,7 @@
           <w:p>
             <w:pPr>
               <w:spacing w:after="20"/>
+              <w:jc w:val="center"/>
             </w:pPr>
             <w:r>
               <w:rPr>
@@ -9279,6 +9633,7 @@
           <w:p>
             <w:pPr>
               <w:spacing w:after="20"/>
+              <w:jc w:val="center"/>
             </w:pPr>
             <w:r>
               <w:rPr>
@@ -9295,6 +9650,7 @@
           <w:p>
             <w:pPr>
               <w:spacing w:after="20"/>
+              <w:jc w:val="center"/>
             </w:pPr>
             <w:r>
               <w:rPr>
@@ -9311,6 +9667,7 @@
           <w:p>
             <w:pPr>
               <w:spacing w:after="20"/>
+              <w:jc w:val="center"/>
             </w:pPr>
             <w:r>
               <w:rPr>
@@ -9327,6 +9684,7 @@
           <w:p>
             <w:pPr>
               <w:spacing w:after="20"/>
+              <w:jc w:val="center"/>
             </w:pPr>
             <w:r>
               <w:rPr>
@@ -9343,6 +9701,7 @@
           <w:p>
             <w:pPr>
               <w:spacing w:after="20"/>
+              <w:jc w:val="center"/>
             </w:pPr>
             <w:r>
               <w:rPr>
@@ -9365,6 +9724,7 @@
           <w:p>
             <w:pPr>
               <w:spacing w:after="20"/>
+              <w:jc w:val="center"/>
             </w:pPr>
             <w:r>
               <w:rPr>
@@ -9381,6 +9741,7 @@
           <w:p>
             <w:pPr>
               <w:spacing w:after="20"/>
+              <w:jc w:val="center"/>
             </w:pPr>
             <w:r>
               <w:rPr>
@@ -9397,6 +9758,7 @@
           <w:p>
             <w:pPr>
               <w:spacing w:after="20"/>
+              <w:jc w:val="center"/>
             </w:pPr>
             <w:r>
               <w:rPr>
@@ -9413,6 +9775,7 @@
           <w:p>
             <w:pPr>
               <w:spacing w:after="20"/>
+              <w:jc w:val="center"/>
             </w:pPr>
             <w:r>
               <w:rPr>
@@ -9429,6 +9792,7 @@
           <w:p>
             <w:pPr>
               <w:spacing w:after="20"/>
+              <w:jc w:val="center"/>
             </w:pPr>
             <w:r>
               <w:rPr>
@@ -9445,6 +9809,7 @@
           <w:p>
             <w:pPr>
               <w:spacing w:after="20"/>
+              <w:jc w:val="center"/>
             </w:pPr>
             <w:r>
               <w:rPr>
@@ -9461,6 +9826,7 @@
           <w:p>
             <w:pPr>
               <w:spacing w:after="20"/>
+              <w:jc w:val="center"/>
             </w:pPr>
             <w:r>
               <w:rPr>
@@ -9477,6 +9843,7 @@
           <w:p>
             <w:pPr>
               <w:spacing w:after="20"/>
+              <w:jc w:val="center"/>
             </w:pPr>
             <w:r>
               <w:rPr>
@@ -9493,6 +9860,7 @@
           <w:p>
             <w:pPr>
               <w:spacing w:after="20"/>
+              <w:jc w:val="center"/>
             </w:pPr>
             <w:r>
               <w:rPr>
@@ -9509,6 +9877,7 @@
           <w:p>
             <w:pPr>
               <w:spacing w:after="20"/>
+              <w:jc w:val="center"/>
             </w:pPr>
             <w:r>
               <w:rPr>
@@ -9531,6 +9900,7 @@
           <w:p>
             <w:pPr>
               <w:spacing w:after="20"/>
+              <w:jc w:val="center"/>
             </w:pPr>
             <w:r>
               <w:rPr>
@@ -9547,6 +9917,7 @@
           <w:p>
             <w:pPr>
               <w:spacing w:after="20"/>
+              <w:jc w:val="center"/>
             </w:pPr>
             <w:r>
               <w:rPr>
@@ -9563,6 +9934,7 @@
           <w:p>
             <w:pPr>
               <w:spacing w:after="20"/>
+              <w:jc w:val="center"/>
             </w:pPr>
             <w:r>
               <w:rPr>
@@ -9579,6 +9951,7 @@
           <w:p>
             <w:pPr>
               <w:spacing w:after="20"/>
+              <w:jc w:val="center"/>
             </w:pPr>
             <w:r>
               <w:rPr>
@@ -9595,6 +9968,7 @@
           <w:p>
             <w:pPr>
               <w:spacing w:after="20"/>
+              <w:jc w:val="center"/>
             </w:pPr>
             <w:r>
               <w:rPr>
@@ -9611,6 +9985,7 @@
           <w:p>
             <w:pPr>
               <w:spacing w:after="20"/>
+              <w:jc w:val="center"/>
             </w:pPr>
             <w:r>
               <w:rPr>
@@ -9627,6 +10002,7 @@
           <w:p>
             <w:pPr>
               <w:spacing w:after="20"/>
+              <w:jc w:val="center"/>
             </w:pPr>
             <w:r>
               <w:rPr>
@@ -9643,6 +10019,7 @@
           <w:p>
             <w:pPr>
               <w:spacing w:after="20"/>
+              <w:jc w:val="center"/>
             </w:pPr>
             <w:r>
               <w:rPr>
@@ -9659,6 +10036,7 @@
           <w:p>
             <w:pPr>
               <w:spacing w:after="20"/>
+              <w:jc w:val="center"/>
             </w:pPr>
             <w:r>
               <w:rPr>
@@ -9675,6 +10053,7 @@
           <w:p>
             <w:pPr>
               <w:spacing w:after="20"/>
+              <w:jc w:val="center"/>
             </w:pPr>
             <w:r>
               <w:rPr>
@@ -9697,6 +10076,7 @@
           <w:p>
             <w:pPr>
               <w:spacing w:after="20"/>
+              <w:jc w:val="center"/>
             </w:pPr>
             <w:r>
               <w:rPr>
@@ -9713,6 +10093,7 @@
           <w:p>
             <w:pPr>
               <w:spacing w:after="20"/>
+              <w:jc w:val="center"/>
             </w:pPr>
             <w:r>
               <w:rPr>
@@ -9729,6 +10110,7 @@
           <w:p>
             <w:pPr>
               <w:spacing w:after="20"/>
+              <w:jc w:val="center"/>
             </w:pPr>
             <w:r>
               <w:rPr>
@@ -9745,6 +10127,7 @@
           <w:p>
             <w:pPr>
               <w:spacing w:after="20"/>
+              <w:jc w:val="center"/>
             </w:pPr>
             <w:r>
               <w:rPr>
@@ -9761,6 +10144,7 @@
           <w:p>
             <w:pPr>
               <w:spacing w:after="20"/>
+              <w:jc w:val="center"/>
             </w:pPr>
             <w:r>
               <w:rPr>
@@ -9777,6 +10161,7 @@
           <w:p>
             <w:pPr>
               <w:spacing w:after="20"/>
+              <w:jc w:val="center"/>
             </w:pPr>
             <w:r>
               <w:rPr>
@@ -9793,6 +10178,7 @@
           <w:p>
             <w:pPr>
               <w:spacing w:after="20"/>
+              <w:jc w:val="center"/>
             </w:pPr>
             <w:r>
               <w:rPr>
@@ -9809,6 +10195,7 @@
           <w:p>
             <w:pPr>
               <w:spacing w:after="20"/>
+              <w:jc w:val="center"/>
             </w:pPr>
             <w:r>
               <w:rPr>
@@ -9825,6 +10212,7 @@
           <w:p>
             <w:pPr>
               <w:spacing w:after="20"/>
+              <w:jc w:val="center"/>
             </w:pPr>
             <w:r>
               <w:rPr>
@@ -9841,6 +10229,7 @@
           <w:p>
             <w:pPr>
               <w:spacing w:after="20"/>
+              <w:jc w:val="center"/>
             </w:pPr>
             <w:r>
               <w:rPr>
@@ -9863,6 +10252,7 @@
           <w:p>
             <w:pPr>
               <w:spacing w:after="20"/>
+              <w:jc w:val="center"/>
             </w:pPr>
             <w:r>
               <w:rPr>
@@ -9879,6 +10269,7 @@
           <w:p>
             <w:pPr>
               <w:spacing w:after="20"/>
+              <w:jc w:val="center"/>
             </w:pPr>
             <w:r>
               <w:rPr>
@@ -9895,6 +10286,7 @@
           <w:p>
             <w:pPr>
               <w:spacing w:after="20"/>
+              <w:jc w:val="center"/>
             </w:pPr>
             <w:r>
               <w:rPr>
@@ -9911,6 +10303,7 @@
           <w:p>
             <w:pPr>
               <w:spacing w:after="20"/>
+              <w:jc w:val="center"/>
             </w:pPr>
             <w:r>
               <w:rPr>
@@ -9927,6 +10320,7 @@
           <w:p>
             <w:pPr>
               <w:spacing w:after="20"/>
+              <w:jc w:val="center"/>
             </w:pPr>
             <w:r>
               <w:rPr>
@@ -9943,6 +10337,7 @@
           <w:p>
             <w:pPr>
               <w:spacing w:after="20"/>
+              <w:jc w:val="center"/>
             </w:pPr>
             <w:r>
               <w:rPr>
@@ -9959,6 +10354,7 @@
           <w:p>
             <w:pPr>
               <w:spacing w:after="20"/>
+              <w:jc w:val="center"/>
             </w:pPr>
             <w:r>
               <w:rPr>
@@ -9975,6 +10371,7 @@
           <w:p>
             <w:pPr>
               <w:spacing w:after="20"/>
+              <w:jc w:val="center"/>
             </w:pPr>
             <w:r>
               <w:rPr>
@@ -9991,6 +10388,7 @@
           <w:p>
             <w:pPr>
               <w:spacing w:after="20"/>
+              <w:jc w:val="center"/>
             </w:pPr>
             <w:r>
               <w:rPr>
@@ -10007,6 +10405,7 @@
           <w:p>
             <w:pPr>
               <w:spacing w:after="20"/>
+              <w:jc w:val="center"/>
             </w:pPr>
             <w:r>
               <w:rPr>
@@ -10029,6 +10428,7 @@
           <w:p>
             <w:pPr>
               <w:spacing w:after="20"/>
+              <w:jc w:val="center"/>
             </w:pPr>
             <w:r>
               <w:rPr>
@@ -10045,6 +10445,7 @@
           <w:p>
             <w:pPr>
               <w:spacing w:after="20"/>
+              <w:jc w:val="center"/>
             </w:pPr>
             <w:r>
               <w:rPr>
@@ -10061,6 +10462,7 @@
           <w:p>
             <w:pPr>
               <w:spacing w:after="20"/>
+              <w:jc w:val="center"/>
             </w:pPr>
             <w:r>
               <w:rPr>
@@ -10077,6 +10479,7 @@
           <w:p>
             <w:pPr>
               <w:spacing w:after="20"/>
+              <w:jc w:val="center"/>
             </w:pPr>
             <w:r>
               <w:rPr>
@@ -10093,6 +10496,7 @@
           <w:p>
             <w:pPr>
               <w:spacing w:after="20"/>
+              <w:jc w:val="center"/>
             </w:pPr>
             <w:r>
               <w:rPr>
@@ -10109,6 +10513,7 @@
           <w:p>
             <w:pPr>
               <w:spacing w:after="20"/>
+              <w:jc w:val="center"/>
             </w:pPr>
             <w:r>
               <w:rPr>
@@ -10125,6 +10530,7 @@
           <w:p>
             <w:pPr>
               <w:spacing w:after="20"/>
+              <w:jc w:val="center"/>
             </w:pPr>
             <w:r>
               <w:rPr>
@@ -10141,6 +10547,7 @@
           <w:p>
             <w:pPr>
               <w:spacing w:after="20"/>
+              <w:jc w:val="center"/>
             </w:pPr>
             <w:r>
               <w:rPr>
@@ -10157,6 +10564,7 @@
           <w:p>
             <w:pPr>
               <w:spacing w:after="20"/>
+              <w:jc w:val="center"/>
             </w:pPr>
             <w:r>
               <w:rPr>
@@ -10173,6 +10581,7 @@
           <w:p>
             <w:pPr>
               <w:spacing w:after="20"/>
+              <w:jc w:val="center"/>
             </w:pPr>
             <w:r>
               <w:rPr>
@@ -10195,6 +10604,7 @@
           <w:p>
             <w:pPr>
               <w:spacing w:after="20"/>
+              <w:jc w:val="center"/>
             </w:pPr>
             <w:r>
               <w:rPr>
@@ -10211,6 +10621,7 @@
           <w:p>
             <w:pPr>
               <w:spacing w:after="20"/>
+              <w:jc w:val="center"/>
             </w:pPr>
             <w:r>
               <w:rPr>
@@ -10227,6 +10638,7 @@
           <w:p>
             <w:pPr>
               <w:spacing w:after="20"/>
+              <w:jc w:val="center"/>
             </w:pPr>
             <w:r>
               <w:rPr>
@@ -10243,6 +10655,7 @@
           <w:p>
             <w:pPr>
               <w:spacing w:after="20"/>
+              <w:jc w:val="center"/>
             </w:pPr>
             <w:r>
               <w:rPr>
@@ -10259,6 +10672,7 @@
           <w:p>
             <w:pPr>
               <w:spacing w:after="20"/>
+              <w:jc w:val="center"/>
             </w:pPr>
             <w:r>
               <w:rPr>
@@ -10275,6 +10689,7 @@
           <w:p>
             <w:pPr>
               <w:spacing w:after="20"/>
+              <w:jc w:val="center"/>
             </w:pPr>
             <w:r>
               <w:rPr>
@@ -10291,6 +10706,7 @@
           <w:p>
             <w:pPr>
               <w:spacing w:after="20"/>
+              <w:jc w:val="center"/>
             </w:pPr>
             <w:r>
               <w:rPr>
@@ -10307,6 +10723,7 @@
           <w:p>
             <w:pPr>
               <w:spacing w:after="20"/>
+              <w:jc w:val="center"/>
             </w:pPr>
             <w:r>
               <w:rPr>
@@ -10323,6 +10740,7 @@
           <w:p>
             <w:pPr>
               <w:spacing w:after="20"/>
+              <w:jc w:val="center"/>
             </w:pPr>
             <w:r>
               <w:rPr>
@@ -10339,6 +10757,7 @@
           <w:p>
             <w:pPr>
               <w:spacing w:after="20"/>
+              <w:jc w:val="center"/>
             </w:pPr>
             <w:r>
               <w:rPr>
@@ -10361,6 +10780,7 @@
           <w:p>
             <w:pPr>
               <w:spacing w:after="20"/>
+              <w:jc w:val="center"/>
             </w:pPr>
             <w:r>
               <w:rPr>
@@ -10377,6 +10797,7 @@
           <w:p>
             <w:pPr>
               <w:spacing w:after="20"/>
+              <w:jc w:val="center"/>
             </w:pPr>
             <w:r>
               <w:rPr>
@@ -10393,6 +10814,7 @@
           <w:p>
             <w:pPr>
               <w:spacing w:after="20"/>
+              <w:jc w:val="center"/>
             </w:pPr>
             <w:r>
               <w:rPr>
@@ -10409,6 +10831,7 @@
           <w:p>
             <w:pPr>
               <w:spacing w:after="20"/>
+              <w:jc w:val="center"/>
             </w:pPr>
             <w:r>
               <w:rPr>
@@ -10425,6 +10848,7 @@
           <w:p>
             <w:pPr>
               <w:spacing w:after="20"/>
+              <w:jc w:val="center"/>
             </w:pPr>
             <w:r>
               <w:rPr>
@@ -10441,6 +10865,7 @@
           <w:p>
             <w:pPr>
               <w:spacing w:after="20"/>
+              <w:jc w:val="center"/>
             </w:pPr>
             <w:r>
               <w:rPr>
@@ -10457,6 +10882,7 @@
           <w:p>
             <w:pPr>
               <w:spacing w:after="20"/>
+              <w:jc w:val="center"/>
             </w:pPr>
             <w:r>
               <w:rPr>
@@ -10473,6 +10899,7 @@
           <w:p>
             <w:pPr>
               <w:spacing w:after="20"/>
+              <w:jc w:val="center"/>
             </w:pPr>
             <w:r>
               <w:rPr>
@@ -10489,6 +10916,7 @@
           <w:p>
             <w:pPr>
               <w:spacing w:after="20"/>
+              <w:jc w:val="center"/>
             </w:pPr>
             <w:r>
               <w:rPr>
@@ -10505,6 +10933,7 @@
           <w:p>
             <w:pPr>
               <w:spacing w:after="20"/>
+              <w:jc w:val="center"/>
             </w:pPr>
             <w:r>
               <w:rPr>
@@ -10783,6 +11212,7 @@
             <w:pPr>
               <w:keepNext/>
               <w:spacing w:after="20"/>
+              <w:jc w:val="center"/>
             </w:pPr>
             <w:r>
               <w:rPr>
@@ -10800,6 +11230,7 @@
             <w:pPr>
               <w:keepNext/>
               <w:spacing w:after="20"/>
+              <w:jc w:val="center"/>
             </w:pPr>
             <w:r>
               <w:rPr>
@@ -10817,6 +11248,7 @@
             <w:pPr>
               <w:keepNext/>
               <w:spacing w:after="20"/>
+              <w:jc w:val="center"/>
             </w:pPr>
             <w:r>
               <w:rPr>
@@ -10834,6 +11266,7 @@
             <w:pPr>
               <w:keepNext/>
               <w:spacing w:after="20"/>
+              <w:jc w:val="center"/>
             </w:pPr>
             <w:r>
               <w:rPr>
@@ -10851,6 +11284,7 @@
             <w:pPr>
               <w:keepNext/>
               <w:spacing w:after="20"/>
+              <w:jc w:val="center"/>
             </w:pPr>
             <w:r>
               <w:rPr>
@@ -10874,6 +11308,7 @@
             <w:pPr>
               <w:keepNext/>
               <w:spacing w:after="20"/>
+              <w:jc w:val="center"/>
             </w:pPr>
             <w:r>
               <w:rPr>
@@ -10891,6 +11326,7 @@
             <w:pPr>
               <w:keepNext/>
               <w:spacing w:after="20"/>
+              <w:jc w:val="center"/>
             </w:pPr>
             <w:r>
               <w:rPr>
@@ -10908,6 +11344,7 @@
             <w:pPr>
               <w:keepNext/>
               <w:spacing w:after="20"/>
+              <w:jc w:val="center"/>
             </w:pPr>
             <w:r>
               <w:rPr>
@@ -10925,6 +11362,7 @@
             <w:pPr>
               <w:keepNext/>
               <w:spacing w:after="20"/>
+              <w:jc w:val="center"/>
             </w:pPr>
             <w:r>
               <w:rPr>
@@ -10942,6 +11380,7 @@
             <w:pPr>
               <w:keepNext/>
               <w:spacing w:after="20"/>
+              <w:jc w:val="center"/>
             </w:pPr>
             <w:r>
               <w:rPr>
@@ -10964,6 +11403,7 @@
           <w:p>
             <w:pPr>
               <w:spacing w:after="20"/>
+              <w:jc w:val="center"/>
             </w:pPr>
             <w:r>
               <w:rPr>
@@ -10980,6 +11420,7 @@
           <w:p>
             <w:pPr>
               <w:spacing w:after="20"/>
+              <w:jc w:val="center"/>
             </w:pPr>
             <w:r>
               <w:rPr>
@@ -10996,6 +11437,7 @@
           <w:p>
             <w:pPr>
               <w:spacing w:after="20"/>
+              <w:jc w:val="center"/>
             </w:pPr>
             <w:r>
               <w:rPr>
@@ -11012,6 +11454,7 @@
           <w:p>
             <w:pPr>
               <w:spacing w:after="20"/>
+              <w:jc w:val="center"/>
             </w:pPr>
             <w:r>
               <w:rPr>
@@ -11028,6 +11471,7 @@
           <w:p>
             <w:pPr>
               <w:spacing w:after="20"/>
+              <w:jc w:val="center"/>
             </w:pPr>
             <w:r>
               <w:rPr>
@@ -11629,6 +12073,7 @@
         <w:tc>
           <w:tcPr>
             <w:tcW w:w="2329" w:type="dxa"/>
+            <w:vAlign w:val="center"/>
           </w:tcPr>
           <w:p>
             <w:pPr>
@@ -11702,6 +12147,7 @@
         <w:tc>
           <w:tcPr>
             <w:tcW w:w="2329" w:type="dxa"/>
+            <w:vAlign w:val="center"/>
           </w:tcPr>
           <w:p>
             <w:pPr>
@@ -11749,6 +12195,7 @@
         <w:tc>
           <w:tcPr>
             <w:tcW w:w="2329" w:type="dxa"/>
+            <w:vAlign w:val="center"/>
           </w:tcPr>
           <w:p>
             <w:pPr>
@@ -11796,6 +12243,7 @@
         <w:tc>
           <w:tcPr>
             <w:tcW w:w="2329" w:type="dxa"/>
+            <w:vAlign w:val="center"/>
           </w:tcPr>
           <w:p>
             <w:pPr>
@@ -11843,6 +12291,7 @@
         <w:tc>
           <w:tcPr>
             <w:tcW w:w="2329" w:type="dxa"/>
+            <w:vAlign w:val="center"/>
           </w:tcPr>
           <w:p>
             <w:pPr>
@@ -11905,57 +12354,7 @@
         <w:rPr>
           <w:i/>
         </w:rPr>
-        <w:t xml:space="preserve"> From the moment the project was selected, it was meant to be an opportunity to explore as many artificial intelligence models as possible. As physical artificial intelligence entities (</w:t>
-      </w:r>
-      <w:proofErr w:type="spellStart"/>
-      <w:r>
-        <w:rPr>
-          <w:i/>
-        </w:rPr>
-        <w:t>a.k.</w:t>
-      </w:r>
-      <w:proofErr w:type="gramStart"/>
-      <w:r>
-        <w:rPr>
-          <w:i/>
-        </w:rPr>
-        <w:t>a</w:t>
-      </w:r>
-      <w:proofErr w:type="spellEnd"/>
-      <w:proofErr w:type="gramEnd"/>
-      <w:r>
-        <w:rPr>
-          <w:i/>
-        </w:rPr>
-        <w:t xml:space="preserve"> embodied AI) are already roaming the streets in countries such as China and America; from companies such as Boston Dynamics, Tesla, </w:t>
-      </w:r>
-      <w:proofErr w:type="spellStart"/>
-      <w:r>
-        <w:rPr>
-          <w:i/>
-        </w:rPr>
-        <w:t>Skild</w:t>
-      </w:r>
-      <w:proofErr w:type="spellEnd"/>
-      <w:r>
-        <w:rPr>
-          <w:i/>
-        </w:rPr>
-        <w:t xml:space="preserve"> AI, Unitree, </w:t>
-      </w:r>
-      <w:proofErr w:type="spellStart"/>
-      <w:r>
-        <w:rPr>
-          <w:i/>
-        </w:rPr>
-        <w:t>AgiBot</w:t>
-      </w:r>
-      <w:proofErr w:type="spellEnd"/>
-      <w:r>
-        <w:rPr>
-          <w:i/>
-        </w:rPr>
-        <w:t xml:space="preserve">, UBTECH, we believe this is a necessary step that we require on the path to </w:t>
+        <w:t xml:space="preserve"> From the moment the project was selected, it was meant to be an opportunity to explore as many artificial intelligence models as possible. As physical artificial intelligence entities (a.k.a embodied AI) are already roaming the streets in countries such as China and America; from companies such as Boston Dynamics, Tesla, Skild AI, Unitree, AgiBot, UBTECH, we believe this is a necessary step that we require on the path to </w:t>
       </w:r>
       <w:r>
         <w:rPr>
@@ -12075,15 +12474,8 @@
       <w:r>
         <w:t>-</w:t>
       </w:r>
-      <w:proofErr w:type="spellStart"/>
-      <w:proofErr w:type="gramStart"/>
-      <w:r>
-        <w:t>fro</w:t>
-      </w:r>
-      <w:proofErr w:type="spellEnd"/>
-      <w:proofErr w:type="gramEnd"/>
-      <w:r>
-        <w:t xml:space="preserve"> endlessly), the machine relies on screen captures in specific timeframes (e.g. 2secs, 4secs…) and CNN to decipher possible areas for improvement. As accurate as Machine judgement can be, it relies on fixed scripts, so (perhaps) when an earlier problem of the character pacing within 2 tiles evolved to pacing between </w:t>
+      <w:r>
+        <w:t xml:space="preserve">fro endlessly), the machine relies on screen captures in specific timeframes (e.g. 2secs, 4secs…) and CNN to decipher possible areas for improvement. As accurate as Machine judgement can be, it relies on fixed scripts, so (perhaps) when an earlier problem of the character pacing within 2 tiles evolved to pacing between </w:t>
       </w:r>
       <w:r>
         <w:t xml:space="preserve">&gt;2 tiles, or around a corner, the machine’s review process is invalidated. Therefore, while the AI was invaluable in building the code architecture, expecting a single prompt to produce a </w:t>
@@ -12323,15 +12715,7 @@
         <w:t xml:space="preserve"> </w:t>
       </w:r>
       <w:r>
-        <w:t xml:space="preserve">The UI’s whole look-and-feel was built by AI end to end, but </w:t>
-      </w:r>
-      <w:proofErr w:type="gramStart"/>
-      <w:r>
-        <w:t>only ever</w:t>
-      </w:r>
-      <w:proofErr w:type="gramEnd"/>
-      <w:r>
-        <w:t xml:space="preserve"> moved forward after we’d seen proof it worked and said yes — the weights, </w:t>
+        <w:t xml:space="preserve">The UI’s whole look-and-feel was built by AI end to end, but only ever moved forward after we’d seen proof it worked and said yes — the weights, </w:t>
       </w:r>
       <w:r>
         <w:t xml:space="preserve">game </w:t>
@@ -12368,10 +12752,16 @@
         <w:t>narrow</w:t>
       </w:r>
       <w:r>
-        <w:t xml:space="preserve"> (one model, one axis) and could be routed around rather than abandoning AI art entirely. Deciding the scope reduction (occupant NPCs don't need 4 walk directions). Choosing to keep BFS where it's genuinely correct. </w:t>
-      </w:r>
-      <w:r>
-        <w:t>Catching the wrong claim about who wrote the pause screen. Judging if the UI looked “fancy” or sufficiently “professional” is a subjective call AI can’t make for us. Deciding what gets committed, to which branch, and refusing to let AI merge or open pull requests on its own, even though it was technically capable of it.</w:t>
+        <w:t xml:space="preserve"> (one model, one axis) and could be routed around rather than abandoning AI art entirely. Deciding the scope reduction (occupant NPCs don't need 4 walk directions).</w:t>
+      </w:r>
+      <w:r>
+        <w:t xml:space="preserve"> </w:t>
+      </w:r>
+      <w:r>
+        <w:t xml:space="preserve">Choosing to keep BFS where it's genuinely correct. </w:t>
+      </w:r>
+      <w:r>
+        <w:t>Judging if the UI looked “fancy” or sufficiently “professional” is a subjective call AI can’t make for us. Deciding what gets committed, to which branch, and refusing to let AI merge or open pull requests on its own, even though it was technically capable of it.</w:t>
       </w:r>
       <w:r>
         <w:t xml:space="preserve"> The development of the v5 model required extensive human review to identify behavioral errors, a task at which AI cannot do efficiently.</w:t>
@@ -13008,6 +13398,7 @@
             <w:pPr>
               <w:keepNext/>
               <w:spacing w:after="20"/>
+              <w:jc w:val="center"/>
             </w:pPr>
             <w:r>
               <w:rPr>
@@ -13020,6 +13411,7 @@
         <w:tc>
           <w:tcPr>
             <w:tcW w:w="3182" w:type="dxa"/>
+            <w:vAlign w:val="center"/>
           </w:tcPr>
           <w:p>
             <w:pPr>
@@ -13049,6 +13441,7 @@
             <w:pPr>
               <w:keepNext/>
               <w:spacing w:after="20"/>
+              <w:jc w:val="center"/>
             </w:pPr>
             <w:r>
               <w:rPr>
@@ -13061,6 +13454,7 @@
         <w:tc>
           <w:tcPr>
             <w:tcW w:w="3182" w:type="dxa"/>
+            <w:vAlign w:val="center"/>
           </w:tcPr>
           <w:p>
             <w:pPr>
@@ -13090,6 +13484,7 @@
             <w:pPr>
               <w:keepNext/>
               <w:spacing w:after="20"/>
+              <w:jc w:val="center"/>
             </w:pPr>
             <w:r>
               <w:rPr>
@@ -13102,6 +13497,7 @@
         <w:tc>
           <w:tcPr>
             <w:tcW w:w="3182" w:type="dxa"/>
+            <w:vAlign w:val="center"/>
           </w:tcPr>
           <w:p>
             <w:pPr>
@@ -13183,6 +13579,7 @@
             <w:pPr>
               <w:keepNext/>
               <w:spacing w:after="20"/>
+              <w:jc w:val="center"/>
             </w:pPr>
             <w:r>
               <w:rPr>
@@ -13195,6 +13592,7 @@
         <w:tc>
           <w:tcPr>
             <w:tcW w:w="3182" w:type="dxa"/>
+            <w:vAlign w:val="center"/>
           </w:tcPr>
           <w:p>
             <w:pPr>
@@ -13237,6 +13635,7 @@
             <w:pPr>
               <w:keepNext/>
               <w:spacing w:after="20"/>
+              <w:jc w:val="center"/>
             </w:pPr>
             <w:r>
               <w:rPr>
@@ -13249,6 +13648,7 @@
         <w:tc>
           <w:tcPr>
             <w:tcW w:w="3182" w:type="dxa"/>
+            <w:vAlign w:val="center"/>
           </w:tcPr>
           <w:p>
             <w:pPr>
@@ -13291,6 +13691,7 @@
             <w:pPr>
               <w:keepNext/>
               <w:spacing w:after="20"/>
+              <w:jc w:val="center"/>
             </w:pPr>
             <w:r>
               <w:rPr>
@@ -13303,6 +13704,7 @@
         <w:tc>
           <w:tcPr>
             <w:tcW w:w="3182" w:type="dxa"/>
+            <w:vAlign w:val="center"/>
           </w:tcPr>
           <w:p>
             <w:pPr>
@@ -13332,6 +13734,7 @@
             <w:pPr>
               <w:keepNext/>
               <w:spacing w:after="20"/>
+              <w:jc w:val="center"/>
             </w:pPr>
             <w:r>
               <w:rPr>
@@ -13344,6 +13747,7 @@
         <w:tc>
           <w:tcPr>
             <w:tcW w:w="3182" w:type="dxa"/>
+            <w:vAlign w:val="center"/>
           </w:tcPr>
           <w:p>
             <w:pPr>
@@ -13373,6 +13777,7 @@
             <w:pPr>
               <w:keepNext/>
               <w:spacing w:after="20"/>
+              <w:jc w:val="center"/>
             </w:pPr>
             <w:r>
               <w:rPr>
@@ -13385,6 +13790,7 @@
         <w:tc>
           <w:tcPr>
             <w:tcW w:w="3182" w:type="dxa"/>
+            <w:vAlign w:val="center"/>
           </w:tcPr>
           <w:p>
             <w:pPr>
@@ -13414,6 +13820,7 @@
             <w:pPr>
               <w:keepNext/>
               <w:spacing w:after="20"/>
+              <w:jc w:val="center"/>
             </w:pPr>
             <w:r>
               <w:rPr>
@@ -13426,6 +13833,7 @@
         <w:tc>
           <w:tcPr>
             <w:tcW w:w="3182" w:type="dxa"/>
+            <w:vAlign w:val="center"/>
           </w:tcPr>
           <w:p>
             <w:pPr>
@@ -13468,6 +13876,7 @@
             <w:pPr>
               <w:keepNext/>
               <w:spacing w:after="20"/>
+              <w:jc w:val="center"/>
             </w:pPr>
             <w:r>
               <w:rPr>
@@ -13480,6 +13889,7 @@
         <w:tc>
           <w:tcPr>
             <w:tcW w:w="3182" w:type="dxa"/>
+            <w:vAlign w:val="center"/>
           </w:tcPr>
           <w:p>
             <w:pPr>
@@ -13508,6 +13918,7 @@
           <w:p>
             <w:pPr>
               <w:spacing w:after="20"/>
+              <w:jc w:val="center"/>
             </w:pPr>
             <w:r>
               <w:rPr>
@@ -13520,6 +13931,7 @@
         <w:tc>
           <w:tcPr>
             <w:tcW w:w="3182" w:type="dxa"/>
+            <w:vAlign w:val="center"/>
           </w:tcPr>
           <w:p>
             <w:pPr>
@@ -14220,38 +14632,20 @@
         </w:rPr>
         <w:t>[28] </w:t>
       </w:r>
-      <w:proofErr w:type="spellStart"/>
       <w:r>
         <w:rPr>
           <w:sz w:val="16"/>
         </w:rPr>
-        <w:t>SethBling</w:t>
-      </w:r>
-      <w:proofErr w:type="spellEnd"/>
-      <w:r>
-        <w:rPr>
-          <w:sz w:val="16"/>
-        </w:rPr>
-        <w:t xml:space="preserve">: </w:t>
+        <w:t xml:space="preserve">SethBling: </w:t>
       </w:r>
       <w:hyperlink r:id="rId16" w:history="1">
-        <w:proofErr w:type="spellStart"/>
         <w:r>
           <w:rPr>
             <w:rStyle w:val="Hyperlink"/>
             <w:sz w:val="16"/>
             <w:lang w:val="en-SG"/>
           </w:rPr>
-          <w:t>MarI</w:t>
-        </w:r>
-        <w:proofErr w:type="spellEnd"/>
-        <w:r>
-          <w:rPr>
-            <w:rStyle w:val="Hyperlink"/>
-            <w:sz w:val="16"/>
-            <w:lang w:val="en-SG"/>
-          </w:rPr>
-          <w:t>/O - Machine Learning for Video Games</w:t>
+          <w:t>MarI/O - Machine Learning for Video Games</w:t>
         </w:r>
       </w:hyperlink>
       <w:r>
@@ -14278,21 +14672,12 @@
         </w:rPr>
         <w:t>” (</w:t>
       </w:r>
-      <w:proofErr w:type="spellStart"/>
       <w:r>
         <w:rPr>
           <w:sz w:val="16"/>
           <w:lang w:val="en-SG"/>
         </w:rPr>
-        <w:t>NeuroEvolution</w:t>
-      </w:r>
-      <w:proofErr w:type="spellEnd"/>
-      <w:r>
-        <w:rPr>
-          <w:sz w:val="16"/>
-          <w:lang w:val="en-SG"/>
-        </w:rPr>
-        <w:t xml:space="preserve"> of Augmenting Topologies</w:t>
+        <w:t>NeuroEvolution of Augmenting Topologies</w:t>
       </w:r>
       <w:r>
         <w:rPr>

</xml_diff>

<commit_message>
Report: fix 2 more Section references missed because they're in table cells
The first cross-reference pass only scanned body paragraphs. Table II
("identify ethical risks" row: "See Section 8") and Table XIII
("Applies only to the optional learned brain (Section 7)") both had
the same Arabic/Roman numbering mismatch as the two fixed earlier, and
for the same reason weren't yet real cross-references. Converted both
to REF fields against the existing sec_VIII/sec_VII bookmarks.

Verified: both fields resolve correctly through real Word (no
"Error!"), and diffing the whole document shows only these two cells
changed (8->VIII, 7->VII) -- same paragraph count, same 13 pages.

Co-Authored-By: Claude Sonnet 5 <noreply@anthropic.com>
</commit_message>
<xml_diff>
--- a/docs/report/CT3201_Report_IEEE_rev5.docx
+++ b/docs/report/CT3201_Report_IEEE_rev5.docx
@@ -96,35 +96,7 @@
           <w:b/>
           <w:sz w:val="18"/>
         </w:rPr>
-        <w:t xml:space="preserve">Emergency evacuation of a burning building is a decision problem: a rescuer with only local visibility must repeatedly choose which trapped occupant to reach next, and by what route, while fire, smoke and structural collapse close paths over time. This paper describes Pyro Pete: Emergency Evacuation, a playable Pygame simulation built for the CT3201 “Learn with AI” mini project, in which an autonomous rescue agent solves that problem alongside a human player under identical rules. We formulated the rescuer </w:t>
-      </w:r>
-      <w:r>
-        <w:rPr>
-          <w:b/>
-          <w:sz w:val="18"/>
-        </w:rPr>
-        <w:t xml:space="preserve">as a goal-based agent performing graph search over a grid whose tiles carry hazard-weighted costs, and used a generative AI assistant (Claude) to challenge that formulation rather than to design it. AI-prompted critique moved the design from unweighted breadth-first search with fire treated as a wall to a hazard-weighted A* agent that plans under partial observability and re-plans as the environment changes, and surfaced robustness gaps we then closed. We tested one concrete AI recommendation — that Greedy </w:t>
-      </w:r>
-      <w:r>
-        <w:rPr>
-          <w:b/>
-          <w:sz w:val="18"/>
-        </w:rPr>
-        <w:t>Best-First search would be preferable because it expands fewer nodes — with a purpose-built comparison harness, found it inappropriate for a safety objective, and rejected it with quantitative evidence. We report the accept / modify / reject decisions, their verification, and a responsible-AI assessment of deploying such a system. In this revision we also report a second, optional brain for the same agent: a neural network. Reinforcement learning from the game score alone never rescued anyone (0% of episode</w:t>
-      </w:r>
-      <w:r>
-        <w:rPr>
-          <w:b/>
-          <w:sz w:val="18"/>
-        </w:rPr>
-        <w:t>s fully evacuated; the network learned to stand still), so we changed the question to imitation of A* with behaviour cloning and DAgger. Correcting our own information-parity assumption, adding a memory of the agent's own path and changing the search order it imitates took the network from 20% (first version) to 84% (final version, on 300 fresh episodes) of stages fully evacuated, against 85% for A* itself: a difference we cannot tell from noise, although the network still trails A* on stages it never train</w:t>
-      </w:r>
-      <w:r>
-        <w:rPr>
-          <w:b/>
-          <w:sz w:val="18"/>
-        </w:rPr>
-        <w:t>ed on (73% against 87%).</w:t>
+        <w:t>Emergency evacuation of a burning building is a decision problem: a rescuer with only local visibility must repeatedly choose which trapped occupant to reach next, and by what route, while fire, smoke and structural collapse close paths over time. This paper describes Pyro Pete: Emergency Evacuation, a playable Pygame simulation built for the CT3201 “Learn with AI” mini project, in which an autonomous rescue agent solves that problem alongside a human player under identical rules. We formulated the rescuer as a goal-based agent performing graph search over a grid whose tiles carry hazard-weighted costs, and used a generative AI assistant (Claude) to challenge that formulation rather than to design it. AI-prompted critique moved the design from unweighted breadth-first search with fire treated as a wall to a hazard-weighted A* agent that plans under partial observability and re-plans as the environment changes, and surfaced robustness gaps we then closed. We tested one concrete AI recommendation — that Greedy Best-First search would be preferable because it expands fewer nodes — with a purpose-built comparison harness, found it inappropriate for a safety objective, and rejected it with quantitative evidence. We report the accept / modify / reject decisions, their verification, and a responsible-AI assessment of deploying such a system. In this revision we also report a second, optional brain for the same agent: a neural network. Reinforcement learning from the game score alone never rescued anyone (0% of episodes fully evacuated; the network learned to stand still), so we changed the question to imitation of A* with behaviour cloning and DAgger. Correcting our own information-parity assumption, adding a memory of the agent's own path and changing the search order it imitates took the network from 20% (first version) to 84% (final version, on 300 fresh episodes) of stages fully evacuated, against 85% for A* itself: a difference we cannot tell from noise, although the network still trails A* on stages it never trained on (73% against 87%).</w:t>
       </w:r>
     </w:p>
     <w:p>
@@ -1357,7 +1329,39 @@
               <w:rPr>
                 <w:sz w:val="16"/>
               </w:rPr>
-              <w:t>See Section 8</w:t>
+              <w:t xml:space="preserve">See Section </w:t>
+            </w:r>
+            <w:r>
+              <w:rPr>
+                <w:sz w:val="16"/>
+              </w:rPr>
+              <w:fldChar w:fldCharType="begin"/>
+            </w:r>
+            <w:r>
+              <w:rPr>
+                <w:sz w:val="16"/>
+              </w:rPr>
+              <w:instrText xml:space="preserve"> REF sec_VIII \h </w:instrText>
+            </w:r>
+            <w:r>
+              <w:rPr>
+                <w:sz w:val="16"/>
+              </w:rPr>
+            </w:r>
+            <w:r>
+              <w:rPr>
+                <w:sz w:val="16"/>
+              </w:rPr>
+              <w:fldChar w:fldCharType="separate"/>
+            </w:r>
+            <w:r>
+              <w:t>VIII</w:t>
+            </w:r>
+            <w:r>
+              <w:rPr>
+                <w:sz w:val="16"/>
+              </w:rPr>
+              <w:fldChar w:fldCharType="end"/>
             </w:r>
           </w:p>
         </w:tc>
@@ -3471,10 +3475,7 @@
         <w:jc w:val="both"/>
       </w:pPr>
       <w:r>
-        <w:t xml:space="preserve">In one line: reinforcement learning from the game score failed completely (0% of episodes fully evacuated), </w:t>
-      </w:r>
-      <w:r>
-        <w:t xml:space="preserve">imitating A∗ worked, and the version that finally matched A∗ overall (v5: 84% against 85% on 300 fresh episodes) needed a string of corrections to our own assumptions (listed at the end of this section). </w:t>
+        <w:t xml:space="preserve">In one line: reinforcement learning from the game score failed completely (0% of episodes fully evacuated), imitating A∗ worked, and the version that finally matched A∗ overall (v5: 84% against 85% on 300 fresh episodes) needed a string of corrections to our own assumptions (listed at the end of this section). </w:t>
       </w:r>
       <w:r>
         <w:t xml:space="preserve">Each model was built off observations on the behavior of the parent. Through the countless test runs on each model, failures/misbehavior were carefully taken into account, summarized to conceptualize the next. Thankfully, with access to a small GPU, model training was much accelerated. Yet, the </w:t>
@@ -4364,10 +4365,7 @@
         <w:jc w:val="both"/>
       </w:pPr>
       <w:r>
-        <w:t>Each ingredient has a strong record elsewhere. PPO trained agents for the game Dota 2 at large scale [11], controlled a robot hand solving a Rubik's Cube [12] and fine-tuned language models from human feedback [13]. Learning a policy from expert examples goes back to ALVINN steering a vehicle from human driving [14] (surveyed in [15]). DAgger repairs the compounding errors of plain cloning by letting the learner drive while the expert relabels the states it reaches [16]. Expert data followed by reinforcemen</w:t>
-      </w:r>
-      <w:r>
-        <w:t>t learning is how AlphaGo's policy network was first trained [17], and demonstrations combined with value-based reinforcement learning sped up learning on Atari games [18].</w:t>
+        <w:t>Each ingredient has a strong record elsewhere. PPO trained agents for the game Dota 2 at large scale [11], controlled a robot hand solving a Rubik's Cube [12] and fine-tuned language models from human feedback [13]. Learning a policy from expert examples goes back to ALVINN steering a vehicle from human driving [14] (surveyed in [15]). DAgger repairs the compounding errors of plain cloning by letting the learner drive while the expert relabels the states it reaches [16]. Expert data followed by reinforcement learning is how AlphaGo's policy network was first trained [17], and demonstrations combined with value-based reinforcement learning sped up learning on Atari games [18].</w:t>
       </w:r>
     </w:p>
     <w:p>
@@ -6006,10 +6004,7 @@
         <w:t>action-match accuracy</w:t>
       </w:r>
       <w:r>
-        <w:t>, a real accuracy in the usual sense, logged every epoch. It removes the incentive problem entirely: there is no reward to prefer standing still to, and A∗ stands still in only 1.1% of its decisions. Plain cloning suffers when the learner drifts into states the expert never visited, so we added DAgger [16]: in four rounds the network drives with probability 1 − β (β = 0.5, 0.3, 0.1, 0) while A∗ labels every state, and the new examples are added to the training set. We trained on stages 1–7 and kept stages 8</w:t>
-      </w:r>
-      <w:r>
-        <w:t>–10 completely unseen.</w:t>
+        <w:t>, a real accuracy in the usual sense, logged every epoch. It removes the incentive problem entirely: there is no reward to prefer standing still to, and A∗ stands still in only 1.1% of its decisions. Plain cloning suffers when the learner drifts into states the expert never visited, so we added DAgger [16]: in four rounds the network drives with probability 1 − β (β = 0.5, 0.3, 0.1, 0) while A∗ labels every state, and the new examples are added to the training set. We trained on stages 1–7 and kept stages 8–10 completely unseen.</w:t>
       </w:r>
     </w:p>
     <w:p>
@@ -6261,10 +6256,7 @@
         <w:t>Problem found: our own headline.</w:t>
       </w:r>
       <w:r>
-        <w:t xml:space="preserve"> We wrote a prediction for the confirmation before running 200 episodes nobody had used: v4 would stay inside the interval it already had. It did not: v4 scored 76% (70–82), v2 75%, while A∗ moved from 91% to 85%. Test sets swing by about 6 points, and part of our first "memory gain" of 7 points was the first test set being reused. Two of our three predictions about memory were falsified. What replicated was the drop in pacing (39 to 15 episodes of 200) and in deaths. Pooling both sets (300 episodes) memory</w:t>
-      </w:r>
-      <w:r>
-        <w:t xml:space="preserve"> adds 3 points (77% to 80%; v4 won 15 episodes that v2 lost and lost 5; sign test p ≈ 0.04).</w:t>
+        <w:t xml:space="preserve"> We wrote a prediction for the confirmation before running 200 episodes nobody had used: v4 would stay inside the interval it already had. It did not: v4 scored 76% (70–82), v2 75%, while A∗ moved from 91% to 85%. Test sets swing by about 6 points, and part of our first "memory gain" of 7 points was the first test set being reused. Two of our three predictions about memory were falsified. What replicated was the drop in pacing (39 to 15 episodes of 200) and in deaths. Pooling both sets (300 episodes) memory adds 3 points (77% to 80%; v4 won 15 episodes that v2 lost and lost 5; sign test p ≈ 0.04).</w:t>
       </w:r>
     </w:p>
     <w:p>
@@ -6317,10 +6309,7 @@
         <w:t>Stalling.</w:t>
       </w:r>
       <w:r>
-        <w:t xml:space="preserve"> A stall is at most three different tiles among the last 16 entered. A∗ never stalls (0 of 300); v2 stalls in 17% of episodes and v4 in 8%. Stalling is concentrated on the unseen stages (v4: 23% against 1% on trained stages), and while stalled the network's consecutive moves change goal 77% of the time (7% otherwise): it is undecided between goals rather than lost. As an upper bound, letting A∗ break each stall lifts v2 from 77% to 84% but v4 only from 80% to 83%: stalling is a large problem for the memoryl</w:t>
-      </w:r>
-      <w:r>
-        <w:t>ess network and a modest one for v4.</w:t>
+        <w:t xml:space="preserve"> A stall is at most three different tiles among the last 16 entered. A∗ never stalls (0 of 300); v2 stalls in 17% of episodes and v4 in 8%. Stalling is concentrated on the unseen stages (v4: 23% against 1% on trained stages), and while stalled the network's consecutive moves change goal 77% of the time (7% otherwise): it is undecided between goals rather than lost. As an upper bound, letting A∗ break each stall lifts v2 from 77% to 84% but v4 only from 80% to 83%: stalling is a large problem for the memoryless network and a modest one for v4.</w:t>
       </w:r>
     </w:p>
     <w:p>
@@ -7171,10 +7160,7 @@
         <w:t>same seeded episodes</w:t>
       </w:r>
       <w:r>
-        <w:t xml:space="preserve"> for all agents (same map, occupants and hazards), a 240 s cap, and the deterministic policy, which is what the game uses. Proportions carry Wilson 95% intervals [26]; paired comparisons use an exact sign test on the episodes that only one agent won. We used three independent test sets: set 1 (100 episodes), set 2 (200 fresh episodes) and set 3 (300 fresh episodes, used only for the final A∗, v4 and v5 comparison and never for training, model choice or teacher choice). Stages 1–7 were trained on and 8–10 ne</w:t>
-      </w:r>
-      <w:r>
-        <w:t>ver.</w:t>
+        <w:t xml:space="preserve"> for all agents (same map, occupants and hazards), a 240 s cap, and the deterministic policy, which is what the game uses. Proportions carry Wilson 95% intervals [26]; paired comparisons use an exact sign test on the episodes that only one agent won. We used three independent test sets: set 1 (100 episodes), set 2 (200 fresh episodes) and set 3 (300 fresh episodes, used only for the final A∗, v4 and v5 comparison and never for training, model choice or teacher choice). Stages 1–7 were trained on and 8–10 never.</w:t>
       </w:r>
     </w:p>
     <w:p>
@@ -11972,10 +11958,7 @@
         <w:t>AI</w:t>
       </w:r>
       <w:r>
-        <w:t xml:space="preserve"> has health and takes hazard damage exactly like the human, and both see only a small radius. A </w:t>
-      </w:r>
-      <w:r>
-        <w:t>real deployment fairness question: does the "nearest occupant" rule systematically reach some people last (e.g. those furthest from the rescuer's entry point)?</w:t>
+        <w:t xml:space="preserve"> has health and takes hazard damage exactly like the human, and both see only a small radius. A real deployment fairness question: does the "nearest occupant" rule systematically reach some people last (e.g. those furthest from the rescuer's entry point)?</w:t>
       </w:r>
     </w:p>
     <w:p>
@@ -12476,7 +12459,51 @@
                 <w:b/>
                 <w:sz w:val="15"/>
               </w:rPr>
-              <w:t>Applies only to the optional learned brain (Section 7), not to the A∗ agent.</w:t>
+              <w:t xml:space="preserve">Applies only to the optional learned brain (Section </w:t>
+            </w:r>
+            <w:r>
+              <w:rPr>
+                <w:b/>
+                <w:sz w:val="15"/>
+              </w:rPr>
+              <w:fldChar w:fldCharType="begin"/>
+            </w:r>
+            <w:r>
+              <w:rPr>
+                <w:b/>
+                <w:sz w:val="15"/>
+              </w:rPr>
+              <w:instrText xml:space="preserve"> REF sec_VII \h </w:instrText>
+            </w:r>
+            <w:r>
+              <w:rPr>
+                <w:b/>
+                <w:sz w:val="15"/>
+              </w:rPr>
+            </w:r>
+            <w:r>
+              <w:rPr>
+                <w:b/>
+                <w:sz w:val="15"/>
+              </w:rPr>
+              <w:fldChar w:fldCharType="separate"/>
+            </w:r>
+            <w:r>
+              <w:t>VII</w:t>
+            </w:r>
+            <w:r>
+              <w:rPr>
+                <w:b/>
+                <w:sz w:val="15"/>
+              </w:rPr>
+              <w:fldChar w:fldCharType="end"/>
+            </w:r>
+            <w:r>
+              <w:rPr>
+                <w:b/>
+                <w:sz w:val="15"/>
+              </w:rPr>
+              <w:t>), not to the A∗ agent.</w:t>
             </w:r>
             <w:r>
               <w:rPr>
@@ -13079,10 +13106,7 @@
         <w:jc w:val="both"/>
       </w:pPr>
       <w:r>
-        <w:t>We designed an evacuation‑​routing agent human‑​first, then used AI to challenge and broaden the design. AI moved us from an unweighted BFS plan to a hazard‑​weighted A∗ agent that plans under partial information and re‑​plans as the building changes, and it prompted several robustness features. Testing an AI recommendation (Greedy Best‑​First) against a purpose‑​built comparison showed it was inappropriate for our objective, and we rejected it with evidence. The AI's clearest failure — generating direction</w:t>
-      </w:r>
-      <w:r>
-        <w:t xml:space="preserve">al NPC animation — was recognised, verified against the engine's requirements, and routed around. Throughout, AI accelerated the work and widened the option space, but the objective, the verification, and every final decision were </w:t>
+        <w:t xml:space="preserve">We designed an evacuation‑​routing agent human‑​first, then used AI to challenge and broaden the design. AI moved us from an unweighted BFS plan to a hazard‑​weighted A∗ agent that plans under partial information and re‑​plans as the building changes, and it prompted several robustness features. Testing an AI recommendation (Greedy Best‑​First) against a purpose‑​built comparison showed it was inappropriate for our objective, and we rejected it with evidence. The AI's clearest failure — generating directional NPC animation — was recognised, verified against the engine's requirements, and routed around. Throughout, AI accelerated the work and widened the option space, but the objective, the verification, and every final decision were </w:t>
       </w:r>
       <w:r>
         <w:t>human</w:t>
@@ -13117,10 +13141,7 @@
         <w:t>if</w:t>
       </w:r>
       <w:r>
-        <w:t xml:space="preserve"> a neural network could learn the same job. Reinforcement learning from the game score alone could not (0% of episodes evacuated; the network learned to stand still), so we switched to imitating A∗ and recorded every assumption that turned out to be wrong: the information the learner was given, the test time cap, the size of the memory gain, and a flaw in our own search-order rule. The final model (v5) evacuates 84% of 300 fresh episodes against A∗'s 85%, a difference we cannot distinguish from noise, but i</w:t>
-      </w:r>
-      <w:r>
-        <w:t>t remains behind A∗ on stages it has never seen (73% against 87%). A∗ stays the default and the benchmark.</w:t>
+        <w:t xml:space="preserve"> a neural network could learn the same job. Reinforcement learning from the game score alone could not (0% of episodes evacuated; the network learned to stand still), so we switched to imitating A∗ and recorded every assumption that turned out to be wrong: the information the learner was given, the test time cap, the size of the memory gain, and a flaw in our own search-order rule. The final model (v5) evacuates 84% of 300 fresh episodes against A∗'s 85%, a difference we cannot distinguish from noise, but it remains behind A∗ on stages it has never seen (73% against 87%). A∗ stays the default and the benchmark.</w:t>
       </w:r>
     </w:p>
     <w:p>

</xml_diff>